<commit_message>
adicionado consultar atividades, excluir atividade
</commit_message>
<xml_diff>
--- a/relatório-yourself.docx
+++ b/relatório-yourself.docx
@@ -1,6 +1,6 @@
 
 <file path=word/document.xml><?xml version="1.0" encoding="utf-8"?>
-<w:document xmlns:wpc="http://schemas.microsoft.com/office/word/2010/wordprocessingCanvas" xmlns:cx="http://schemas.microsoft.com/office/drawing/2014/chartex" xmlns:cx1="http://schemas.microsoft.com/office/drawing/2015/9/8/chartex" xmlns:cx2="http://schemas.microsoft.com/office/drawing/2015/10/21/chartex" xmlns:cx3="http://schemas.microsoft.com/office/drawing/2016/5/9/chartex" xmlns:cx4="http://schemas.microsoft.com/office/drawing/2016/5/10/chartex" xmlns:cx5="http://schemas.microsoft.com/office/drawing/2016/5/11/chartex" xmlns:cx6="http://schemas.microsoft.com/office/drawing/2016/5/12/chartex" xmlns:cx7="http://schemas.microsoft.com/office/drawing/2016/5/13/chartex" xmlns:cx8="http://schemas.microsoft.com/office/drawing/2016/5/14/chartex" xmlns:mc="http://schemas.openxmlformats.org/markup-compatibility/2006" xmlns:aink="http://schemas.microsoft.com/office/drawing/2016/ink" xmlns:am3d="http://schemas.microsoft.com/office/drawing/2017/model3d" xmlns:o="urn:schemas-microsoft-com:office:office" xmlns:oel="http://schemas.microsoft.com/office/2019/extlst" xmlns:r="http://schemas.openxmlformats.org/officeDocument/2006/relationships" xmlns:m="http://schemas.openxmlformats.org/officeDocument/2006/math" xmlns:v="urn:schemas-microsoft-com:vml" xmlns:wp14="http://schemas.microsoft.com/office/word/2010/wordprocessingDrawing" xmlns:wp="http://schemas.openxmlformats.org/drawingml/2006/wordprocessingDrawing" xmlns:w10="urn:schemas-microsoft-com:office:word" xmlns:w="http://schemas.openxmlformats.org/wordprocessingml/2006/main" xmlns:w14="http://schemas.microsoft.com/office/word/2010/wordml" xmlns:w15="http://schemas.microsoft.com/office/word/2012/wordml" xmlns:w16cex="http://schemas.microsoft.com/office/word/2018/wordml/cex" xmlns:w16cid="http://schemas.microsoft.com/office/word/2016/wordml/cid" xmlns:w16="http://schemas.microsoft.com/office/word/2018/wordml" xmlns:w16du="http://schemas.microsoft.com/office/word/2023/wordml/word16du" xmlns:w16sdtdh="http://schemas.microsoft.com/office/word/2020/wordml/sdtdatahash" xmlns:w16se="http://schemas.microsoft.com/office/word/2015/wordml/symex" xmlns:wpg="http://schemas.microsoft.com/office/word/2010/wordprocessingGroup" xmlns:wpi="http://schemas.microsoft.com/office/word/2010/wordprocessingInk" xmlns:wne="http://schemas.microsoft.com/office/word/2006/wordml" xmlns:wps="http://schemas.microsoft.com/office/word/2010/wordprocessingShape" mc:Ignorable="w14 w15 w16se w16cid w16 w16cex w16sdtdh w16du wp14">
+<w:document xmlns:wpc="http://schemas.microsoft.com/office/word/2010/wordprocessingCanvas" xmlns:cx="http://schemas.microsoft.com/office/drawing/2014/chartex" xmlns:cx1="http://schemas.microsoft.com/office/drawing/2015/9/8/chartex" xmlns:cx2="http://schemas.microsoft.com/office/drawing/2015/10/21/chartex" xmlns:cx3="http://schemas.microsoft.com/office/drawing/2016/5/9/chartex" xmlns:cx4="http://schemas.microsoft.com/office/drawing/2016/5/10/chartex" xmlns:cx5="http://schemas.microsoft.com/office/drawing/2016/5/11/chartex" xmlns:cx6="http://schemas.microsoft.com/office/drawing/2016/5/12/chartex" xmlns:cx7="http://schemas.microsoft.com/office/drawing/2016/5/13/chartex" xmlns:cx8="http://schemas.microsoft.com/office/drawing/2016/5/14/chartex" xmlns:mc="http://schemas.openxmlformats.org/markup-compatibility/2006" xmlns:aink="http://schemas.microsoft.com/office/drawing/2016/ink" xmlns:am3d="http://schemas.microsoft.com/office/drawing/2017/model3d" xmlns:o="urn:schemas-microsoft-com:office:office" xmlns:r="http://schemas.openxmlformats.org/officeDocument/2006/relationships" xmlns:m="http://schemas.openxmlformats.org/officeDocument/2006/math" xmlns:v="urn:schemas-microsoft-com:vml" xmlns:wp14="http://schemas.microsoft.com/office/word/2010/wordprocessingDrawing" xmlns:wp="http://schemas.openxmlformats.org/drawingml/2006/wordprocessingDrawing" xmlns:w10="urn:schemas-microsoft-com:office:word" xmlns:w="http://schemas.openxmlformats.org/wordprocessingml/2006/main" xmlns:w14="http://schemas.microsoft.com/office/word/2010/wordml" xmlns:w15="http://schemas.microsoft.com/office/word/2012/wordml" xmlns:w16cid="http://schemas.microsoft.com/office/word/2016/wordml/cid" xmlns:w16se="http://schemas.microsoft.com/office/word/2015/wordml/symex" xmlns:wpg="http://schemas.microsoft.com/office/word/2010/wordprocessingGroup" xmlns:wpi="http://schemas.microsoft.com/office/word/2010/wordprocessingInk" xmlns:wne="http://schemas.microsoft.com/office/word/2006/wordml" xmlns:wps="http://schemas.microsoft.com/office/word/2010/wordprocessingShape" mc:Ignorable="w14 w15 w16se w16cid wp14">
   <w:body>
     <w:p>
       <w:pPr>
@@ -1836,6 +1836,7 @@
           <w:docPartUnique/>
         </w:docPartObj>
       </w:sdtPr>
+      <w:sdtEndPr/>
       <w:sdtContent>
         <w:p>
           <w:pPr>
@@ -7717,7 +7718,7 @@
       <w:pPr>
         <w:numPr>
           <w:ilvl w:val="0"/>
-          <w:numId w:val="36"/>
+          <w:numId w:val="35"/>
         </w:numPr>
         <w:spacing w:after="160" w:line="259" w:lineRule="auto"/>
         <w:rPr>
@@ -7751,7 +7752,7 @@
       <w:pPr>
         <w:numPr>
           <w:ilvl w:val="1"/>
-          <w:numId w:val="36"/>
+          <w:numId w:val="35"/>
         </w:numPr>
         <w:spacing w:after="160" w:line="259" w:lineRule="auto"/>
         <w:rPr>
@@ -7794,7 +7795,7 @@
       <w:pPr>
         <w:numPr>
           <w:ilvl w:val="2"/>
-          <w:numId w:val="36"/>
+          <w:numId w:val="35"/>
         </w:numPr>
         <w:spacing w:after="160" w:line="259" w:lineRule="auto"/>
         <w:rPr>
@@ -7818,7 +7819,7 @@
       <w:pPr>
         <w:numPr>
           <w:ilvl w:val="2"/>
-          <w:numId w:val="36"/>
+          <w:numId w:val="35"/>
         </w:numPr>
         <w:spacing w:after="160" w:line="259" w:lineRule="auto"/>
         <w:rPr>
@@ -7842,7 +7843,7 @@
       <w:pPr>
         <w:numPr>
           <w:ilvl w:val="2"/>
-          <w:numId w:val="36"/>
+          <w:numId w:val="35"/>
         </w:numPr>
         <w:spacing w:after="160" w:line="259" w:lineRule="auto"/>
         <w:rPr>
@@ -7866,7 +7867,7 @@
       <w:pPr>
         <w:numPr>
           <w:ilvl w:val="2"/>
-          <w:numId w:val="36"/>
+          <w:numId w:val="35"/>
         </w:numPr>
         <w:spacing w:after="160" w:line="259" w:lineRule="auto"/>
         <w:rPr>
@@ -7891,7 +7892,7 @@
       <w:pPr>
         <w:numPr>
           <w:ilvl w:val="2"/>
-          <w:numId w:val="36"/>
+          <w:numId w:val="35"/>
         </w:numPr>
         <w:spacing w:after="160" w:line="259" w:lineRule="auto"/>
         <w:rPr>
@@ -7915,7 +7916,7 @@
       <w:pPr>
         <w:numPr>
           <w:ilvl w:val="2"/>
-          <w:numId w:val="36"/>
+          <w:numId w:val="35"/>
         </w:numPr>
         <w:spacing w:after="160" w:line="259" w:lineRule="auto"/>
         <w:rPr>
@@ -7939,7 +7940,7 @@
       <w:pPr>
         <w:numPr>
           <w:ilvl w:val="0"/>
-          <w:numId w:val="36"/>
+          <w:numId w:val="35"/>
         </w:numPr>
         <w:spacing w:after="160" w:line="259" w:lineRule="auto"/>
         <w:rPr>
@@ -7973,7 +7974,7 @@
       <w:pPr>
         <w:numPr>
           <w:ilvl w:val="1"/>
-          <w:numId w:val="36"/>
+          <w:numId w:val="35"/>
         </w:numPr>
         <w:spacing w:after="160" w:line="259" w:lineRule="auto"/>
         <w:rPr>
@@ -8012,7 +8013,7 @@
       <w:pPr>
         <w:numPr>
           <w:ilvl w:val="0"/>
-          <w:numId w:val="36"/>
+          <w:numId w:val="35"/>
         </w:numPr>
         <w:spacing w:after="160" w:line="259" w:lineRule="auto"/>
         <w:rPr>
@@ -8046,7 +8047,7 @@
       <w:pPr>
         <w:numPr>
           <w:ilvl w:val="1"/>
-          <w:numId w:val="36"/>
+          <w:numId w:val="35"/>
         </w:numPr>
         <w:spacing w:after="160" w:line="259" w:lineRule="auto"/>
         <w:rPr>
@@ -8102,7 +8103,7 @@
       <w:pPr>
         <w:numPr>
           <w:ilvl w:val="0"/>
-          <w:numId w:val="36"/>
+          <w:numId w:val="35"/>
         </w:numPr>
         <w:spacing w:after="160" w:line="259" w:lineRule="auto"/>
         <w:rPr>
@@ -8136,7 +8137,7 @@
       <w:pPr>
         <w:numPr>
           <w:ilvl w:val="1"/>
-          <w:numId w:val="36"/>
+          <w:numId w:val="35"/>
         </w:numPr>
         <w:spacing w:after="160" w:line="259" w:lineRule="auto"/>
         <w:rPr>
@@ -8175,7 +8176,7 @@
       <w:pPr>
         <w:numPr>
           <w:ilvl w:val="1"/>
-          <w:numId w:val="36"/>
+          <w:numId w:val="35"/>
         </w:numPr>
         <w:spacing w:after="160" w:line="259" w:lineRule="auto"/>
         <w:rPr>
@@ -8214,7 +8215,7 @@
       <w:pPr>
         <w:numPr>
           <w:ilvl w:val="1"/>
-          <w:numId w:val="36"/>
+          <w:numId w:val="35"/>
         </w:numPr>
         <w:spacing w:after="160" w:line="259" w:lineRule="auto"/>
         <w:rPr>
@@ -11347,7 +11348,7 @@
               <w:pStyle w:val="PargrafodaLista"/>
               <w:numPr>
                 <w:ilvl w:val="0"/>
-                <w:numId w:val="41"/>
+                <w:numId w:val="40"/>
               </w:numPr>
               <w:rPr>
                 <w:rFonts w:ascii="Arial" w:hAnsi="Arial" w:cs="Arial"/>
@@ -11371,7 +11372,25 @@
                 <w:sz w:val="24"/>
                 <w:szCs w:val="24"/>
               </w:rPr>
-              <w:t xml:space="preserve"> O caso de uso inicia quando o usuário abre o aplicativo de Pomodoro.</w:t>
+              <w:t xml:space="preserve"> O caso de uso inicia quando o usuário abre o aplicativo de </w:t>
+            </w:r>
+            <w:proofErr w:type="spellStart"/>
+            <w:r>
+              <w:rPr>
+                <w:rFonts w:ascii="Arial" w:hAnsi="Arial" w:cs="Arial"/>
+                <w:sz w:val="24"/>
+                <w:szCs w:val="24"/>
+              </w:rPr>
+              <w:t>Pomodoro</w:t>
+            </w:r>
+            <w:proofErr w:type="spellEnd"/>
+            <w:r>
+              <w:rPr>
+                <w:rFonts w:ascii="Arial" w:hAnsi="Arial" w:cs="Arial"/>
+                <w:sz w:val="24"/>
+                <w:szCs w:val="24"/>
+              </w:rPr>
+              <w:t>.</w:t>
             </w:r>
           </w:p>
           <w:p>
@@ -11389,7 +11408,7 @@
               <w:pStyle w:val="PargrafodaLista"/>
               <w:numPr>
                 <w:ilvl w:val="0"/>
-                <w:numId w:val="41"/>
+                <w:numId w:val="40"/>
               </w:numPr>
               <w:rPr>
                 <w:rFonts w:ascii="Arial" w:hAnsi="Arial" w:cs="Arial"/>
@@ -11495,7 +11514,7 @@
               <w:pStyle w:val="PargrafodaLista"/>
               <w:numPr>
                 <w:ilvl w:val="0"/>
-                <w:numId w:val="41"/>
+                <w:numId w:val="40"/>
               </w:numPr>
               <w:rPr>
                 <w:rFonts w:ascii="Arial" w:hAnsi="Arial" w:cs="Arial"/>
@@ -11537,7 +11556,7 @@
               <w:pStyle w:val="PargrafodaLista"/>
               <w:numPr>
                 <w:ilvl w:val="0"/>
-                <w:numId w:val="41"/>
+                <w:numId w:val="40"/>
               </w:numPr>
               <w:rPr>
                 <w:rFonts w:ascii="Arial" w:hAnsi="Arial" w:cs="Arial"/>
@@ -11589,7 +11608,7 @@
               <w:pStyle w:val="PargrafodaLista"/>
               <w:numPr>
                 <w:ilvl w:val="0"/>
-                <w:numId w:val="41"/>
+                <w:numId w:val="40"/>
               </w:numPr>
               <w:rPr>
                 <w:rFonts w:ascii="Arial" w:hAnsi="Arial" w:cs="Arial"/>
@@ -11631,7 +11650,7 @@
               <w:pStyle w:val="PargrafodaLista"/>
               <w:numPr>
                 <w:ilvl w:val="0"/>
-                <w:numId w:val="41"/>
+                <w:numId w:val="40"/>
               </w:numPr>
               <w:rPr>
                 <w:rFonts w:ascii="Arial" w:hAnsi="Arial" w:cs="Arial"/>
@@ -11655,7 +11674,25 @@
                 <w:sz w:val="24"/>
                 <w:szCs w:val="24"/>
               </w:rPr>
-              <w:t xml:space="preserve"> Com as credenciais validadas, o sistema autoriza o login e carrega o ambiente personalizado do usuário, que inclui suas configurações de Pomodoro e o histórico de sessões anteriores.</w:t>
+              <w:t xml:space="preserve"> Com as credenciais validadas, o sistema autoriza o login e carrega o ambiente personalizado do usuário, que inclui suas configurações de </w:t>
+            </w:r>
+            <w:proofErr w:type="spellStart"/>
+            <w:r>
+              <w:rPr>
+                <w:rFonts w:ascii="Arial" w:hAnsi="Arial" w:cs="Arial"/>
+                <w:sz w:val="24"/>
+                <w:szCs w:val="24"/>
+              </w:rPr>
+              <w:t>Pomodoro</w:t>
+            </w:r>
+            <w:proofErr w:type="spellEnd"/>
+            <w:r>
+              <w:rPr>
+                <w:rFonts w:ascii="Arial" w:hAnsi="Arial" w:cs="Arial"/>
+                <w:sz w:val="24"/>
+                <w:szCs w:val="24"/>
+              </w:rPr>
+              <w:t xml:space="preserve"> e o histórico de sessões anteriores.</w:t>
             </w:r>
           </w:p>
           <w:p>
@@ -11683,7 +11720,7 @@
               <w:pStyle w:val="PargrafodaLista"/>
               <w:numPr>
                 <w:ilvl w:val="0"/>
-                <w:numId w:val="41"/>
+                <w:numId w:val="40"/>
               </w:numPr>
               <w:rPr>
                 <w:rFonts w:ascii="Arial" w:hAnsi="Arial" w:cs="Arial"/>
@@ -11707,7 +11744,25 @@
                 <w:sz w:val="24"/>
                 <w:szCs w:val="24"/>
               </w:rPr>
-              <w:t xml:space="preserve"> O usuário é redirecionado para a tela principal do aplicativo, onde ele pode iniciar ou configurar uma sessão de Pomodoro.</w:t>
+              <w:t xml:space="preserve"> O usuário é redirecionado para a tela principal do aplicativo, onde ele pode iniciar ou configurar uma sessão de </w:t>
+            </w:r>
+            <w:proofErr w:type="spellStart"/>
+            <w:r>
+              <w:rPr>
+                <w:rFonts w:ascii="Arial" w:hAnsi="Arial" w:cs="Arial"/>
+                <w:sz w:val="24"/>
+                <w:szCs w:val="24"/>
+              </w:rPr>
+              <w:t>Pomodoro</w:t>
+            </w:r>
+            <w:proofErr w:type="spellEnd"/>
+            <w:r>
+              <w:rPr>
+                <w:rFonts w:ascii="Arial" w:hAnsi="Arial" w:cs="Arial"/>
+                <w:sz w:val="24"/>
+                <w:szCs w:val="24"/>
+              </w:rPr>
+              <w:t>.</w:t>
             </w:r>
           </w:p>
           <w:p>
@@ -11785,7 +11840,7 @@
               <w:pStyle w:val="PargrafodaLista"/>
               <w:numPr>
                 <w:ilvl w:val="0"/>
-                <w:numId w:val="42"/>
+                <w:numId w:val="41"/>
               </w:numPr>
               <w:rPr>
                 <w:rFonts w:ascii="Arial" w:hAnsi="Arial" w:cs="Arial"/>
@@ -11807,7 +11862,7 @@
               <w:pStyle w:val="PargrafodaLista"/>
               <w:numPr>
                 <w:ilvl w:val="0"/>
-                <w:numId w:val="42"/>
+                <w:numId w:val="41"/>
               </w:numPr>
               <w:rPr>
                 <w:rFonts w:ascii="Arial" w:hAnsi="Arial" w:cs="Arial"/>
@@ -11829,7 +11884,7 @@
               <w:pStyle w:val="PargrafodaLista"/>
               <w:numPr>
                 <w:ilvl w:val="0"/>
-                <w:numId w:val="42"/>
+                <w:numId w:val="41"/>
               </w:numPr>
               <w:rPr>
                 <w:rFonts w:ascii="Arial" w:hAnsi="Arial" w:cs="Arial"/>
@@ -11851,7 +11906,7 @@
               <w:pStyle w:val="PargrafodaLista"/>
               <w:numPr>
                 <w:ilvl w:val="0"/>
-                <w:numId w:val="42"/>
+                <w:numId w:val="41"/>
               </w:numPr>
               <w:rPr>
                 <w:rFonts w:ascii="Arial" w:hAnsi="Arial" w:cs="Arial"/>
@@ -11906,6 +11961,328 @@
                 <w:szCs w:val="24"/>
               </w:rPr>
               <w:t>CENÁRIO EXCESSÃO</w:t>
+            </w:r>
+          </w:p>
+        </w:tc>
+      </w:tr>
+      <w:tr>
+        <w:trPr>
+          <w:trHeight w:val="543"/>
+        </w:trPr>
+        <w:tc>
+          <w:tcPr>
+            <w:tcW w:w="9992" w:type="dxa"/>
+          </w:tcPr>
+          <w:p>
+            <w:pPr>
+              <w:pStyle w:val="PargrafodaLista"/>
+              <w:numPr>
+                <w:ilvl w:val="0"/>
+                <w:numId w:val="42"/>
+              </w:numPr>
+              <w:spacing w:line="256" w:lineRule="auto"/>
+              <w:rPr>
+                <w:rFonts w:ascii="Arial" w:hAnsi="Arial" w:cs="Arial"/>
+              </w:rPr>
+            </w:pPr>
+            <w:r>
+              <w:rPr>
+                <w:rFonts w:ascii="Arial" w:hAnsi="Arial" w:cs="Arial"/>
+              </w:rPr>
+              <w:t xml:space="preserve">  </w:t>
+            </w:r>
+            <w:r>
+              <w:rPr>
+                <w:rFonts w:ascii="Arial" w:hAnsi="Arial" w:cs="Arial"/>
+                <w:b/>
+                <w:bCs/>
+              </w:rPr>
+              <w:t>Inserção de Credenciais:</w:t>
+            </w:r>
+            <w:r>
+              <w:rPr>
+                <w:rFonts w:ascii="Arial" w:hAnsi="Arial" w:cs="Arial"/>
+              </w:rPr>
+              <w:t xml:space="preserve"> O usuário insere um e-mail e/ou senha que não correspondem aos dados cadastrados.</w:t>
+            </w:r>
+          </w:p>
+          <w:p>
+            <w:pPr>
+              <w:pStyle w:val="PargrafodaLista"/>
+              <w:numPr>
+                <w:ilvl w:val="0"/>
+                <w:numId w:val="42"/>
+              </w:numPr>
+              <w:spacing w:line="256" w:lineRule="auto"/>
+              <w:rPr>
+                <w:rFonts w:ascii="Arial" w:hAnsi="Arial" w:cs="Arial"/>
+              </w:rPr>
+            </w:pPr>
+            <w:r>
+              <w:rPr>
+                <w:rFonts w:ascii="Arial" w:hAnsi="Arial" w:cs="Arial"/>
+              </w:rPr>
+              <w:t xml:space="preserve">  </w:t>
+            </w:r>
+            <w:r>
+              <w:rPr>
+                <w:rFonts w:ascii="Arial" w:hAnsi="Arial" w:cs="Arial"/>
+                <w:b/>
+                <w:bCs/>
+              </w:rPr>
+              <w:t>Tentativa de Autenticação:</w:t>
+            </w:r>
+            <w:r>
+              <w:rPr>
+                <w:rFonts w:ascii="Arial" w:hAnsi="Arial" w:cs="Arial"/>
+              </w:rPr>
+              <w:t xml:space="preserve"> O usuário clica no botão de login, e o sistema tenta validar as credenciais.</w:t>
+            </w:r>
+          </w:p>
+          <w:p>
+            <w:pPr>
+              <w:pStyle w:val="PargrafodaLista"/>
+              <w:numPr>
+                <w:ilvl w:val="0"/>
+                <w:numId w:val="42"/>
+              </w:numPr>
+              <w:spacing w:line="256" w:lineRule="auto"/>
+              <w:rPr>
+                <w:rFonts w:ascii="Arial" w:hAnsi="Arial" w:cs="Arial"/>
+              </w:rPr>
+            </w:pPr>
+            <w:r>
+              <w:rPr>
+                <w:rFonts w:ascii="Arial" w:hAnsi="Arial" w:cs="Arial"/>
+              </w:rPr>
+              <w:t xml:space="preserve">  </w:t>
+            </w:r>
+            <w:r>
+              <w:rPr>
+                <w:rFonts w:ascii="Arial" w:hAnsi="Arial" w:cs="Arial"/>
+                <w:b/>
+                <w:bCs/>
+              </w:rPr>
+              <w:t>Erro de Autenticação:</w:t>
+            </w:r>
+            <w:r>
+              <w:rPr>
+                <w:rFonts w:ascii="Arial" w:hAnsi="Arial" w:cs="Arial"/>
+              </w:rPr>
+              <w:t xml:space="preserve"> O sistema detecta que o e-mail ou senha não são válidos.</w:t>
+            </w:r>
+          </w:p>
+          <w:p>
+            <w:pPr>
+              <w:pStyle w:val="PargrafodaLista"/>
+              <w:numPr>
+                <w:ilvl w:val="0"/>
+                <w:numId w:val="42"/>
+              </w:numPr>
+              <w:spacing w:line="256" w:lineRule="auto"/>
+              <w:rPr>
+                <w:rFonts w:ascii="Arial" w:hAnsi="Arial" w:cs="Arial"/>
+              </w:rPr>
+            </w:pPr>
+            <w:r>
+              <w:rPr>
+                <w:rFonts w:ascii="Arial" w:hAnsi="Arial" w:cs="Arial"/>
+              </w:rPr>
+              <w:t>O sistema exibe uma mensagem de erro: "E-mail ou senha incorretos. Tente novamente."</w:t>
+            </w:r>
+          </w:p>
+          <w:p>
+            <w:pPr>
+              <w:pStyle w:val="PargrafodaLista"/>
+              <w:numPr>
+                <w:ilvl w:val="0"/>
+                <w:numId w:val="42"/>
+              </w:numPr>
+              <w:spacing w:line="256" w:lineRule="auto"/>
+              <w:rPr>
+                <w:rFonts w:ascii="Arial" w:hAnsi="Arial" w:cs="Arial"/>
+              </w:rPr>
+            </w:pPr>
+            <w:r>
+              <w:rPr>
+                <w:rFonts w:ascii="Arial" w:hAnsi="Arial" w:cs="Arial"/>
+              </w:rPr>
+              <w:t xml:space="preserve">  </w:t>
+            </w:r>
+            <w:r>
+              <w:rPr>
+                <w:rFonts w:ascii="Arial" w:hAnsi="Arial" w:cs="Arial"/>
+                <w:b/>
+                <w:bCs/>
+              </w:rPr>
+              <w:t>Novo Login:</w:t>
+            </w:r>
+            <w:r>
+              <w:rPr>
+                <w:rFonts w:ascii="Arial" w:hAnsi="Arial" w:cs="Arial"/>
+              </w:rPr>
+              <w:t xml:space="preserve"> O usuário retorna à tela de login, podendo tentar novamente com credenciais corretas.</w:t>
+            </w:r>
+          </w:p>
+          <w:p>
+            <w:pPr>
+              <w:spacing w:line="256" w:lineRule="auto"/>
+              <w:ind w:left="360"/>
+              <w:rPr>
+                <w:rFonts w:ascii="Arial" w:hAnsi="Arial" w:cs="Arial"/>
+                <w:sz w:val="24"/>
+                <w:szCs w:val="24"/>
+              </w:rPr>
+            </w:pPr>
+          </w:p>
+        </w:tc>
+      </w:tr>
+      <w:tr>
+        <w:trPr>
+          <w:trHeight w:val="543"/>
+        </w:trPr>
+        <w:tc>
+          <w:tcPr>
+            <w:tcW w:w="9992" w:type="dxa"/>
+          </w:tcPr>
+          <w:p>
+            <w:pPr>
+              <w:pStyle w:val="PargrafodaLista"/>
+              <w:ind w:left="765"/>
+              <w:jc w:val="center"/>
+              <w:rPr>
+                <w:rFonts w:ascii="Arial" w:hAnsi="Arial" w:cs="Arial"/>
+                <w:b/>
+                <w:sz w:val="24"/>
+                <w:szCs w:val="24"/>
+              </w:rPr>
+            </w:pPr>
+            <w:r>
+              <w:rPr>
+                <w:rFonts w:ascii="Arial" w:hAnsi="Arial" w:cs="Arial"/>
+                <w:b/>
+                <w:sz w:val="24"/>
+                <w:szCs w:val="24"/>
+              </w:rPr>
+              <w:lastRenderedPageBreak/>
+              <w:t>PRÉ-CONDIÇÕES</w:t>
+            </w:r>
+          </w:p>
+          <w:p>
+            <w:pPr>
+              <w:pStyle w:val="PargrafodaLista"/>
+              <w:ind w:left="1485"/>
+              <w:rPr>
+                <w:rFonts w:ascii="Arial" w:hAnsi="Arial" w:cs="Arial"/>
+                <w:b/>
+                <w:sz w:val="24"/>
+                <w:szCs w:val="24"/>
+              </w:rPr>
+            </w:pPr>
+          </w:p>
+        </w:tc>
+      </w:tr>
+      <w:tr>
+        <w:trPr>
+          <w:trHeight w:val="543"/>
+        </w:trPr>
+        <w:tc>
+          <w:tcPr>
+            <w:tcW w:w="9992" w:type="dxa"/>
+          </w:tcPr>
+          <w:p>
+            <w:pPr>
+              <w:pStyle w:val="PargrafodaLista"/>
+              <w:numPr>
+                <w:ilvl w:val="0"/>
+                <w:numId w:val="39"/>
+              </w:numPr>
+              <w:rPr>
+                <w:rFonts w:ascii="Arial" w:hAnsi="Arial" w:cs="Arial"/>
+                <w:sz w:val="24"/>
+                <w:szCs w:val="24"/>
+              </w:rPr>
+            </w:pPr>
+            <w:r>
+              <w:rPr>
+                <w:rFonts w:ascii="Arial" w:hAnsi="Arial" w:cs="Arial"/>
+                <w:sz w:val="24"/>
+                <w:szCs w:val="24"/>
+              </w:rPr>
+              <w:t xml:space="preserve">O usuário já criou uma conta no aplicativo de </w:t>
+            </w:r>
+            <w:proofErr w:type="spellStart"/>
+            <w:r>
+              <w:rPr>
+                <w:rFonts w:ascii="Arial" w:hAnsi="Arial" w:cs="Arial"/>
+                <w:sz w:val="24"/>
+                <w:szCs w:val="24"/>
+              </w:rPr>
+              <w:t>Pomodoro</w:t>
+            </w:r>
+            <w:proofErr w:type="spellEnd"/>
+            <w:r>
+              <w:rPr>
+                <w:rFonts w:ascii="Arial" w:hAnsi="Arial" w:cs="Arial"/>
+                <w:sz w:val="24"/>
+                <w:szCs w:val="24"/>
+              </w:rPr>
+              <w:t>.</w:t>
+            </w:r>
+          </w:p>
+          <w:p>
+            <w:pPr>
+              <w:pStyle w:val="PargrafodaLista"/>
+              <w:numPr>
+                <w:ilvl w:val="0"/>
+                <w:numId w:val="39"/>
+              </w:numPr>
+              <w:rPr>
+                <w:rFonts w:ascii="Arial" w:hAnsi="Arial" w:cs="Arial"/>
+                <w:b/>
+                <w:sz w:val="24"/>
+                <w:szCs w:val="24"/>
+              </w:rPr>
+            </w:pPr>
+            <w:r>
+              <w:rPr>
+                <w:rFonts w:ascii="Arial" w:hAnsi="Arial" w:cs="Arial"/>
+                <w:sz w:val="24"/>
+                <w:szCs w:val="24"/>
+              </w:rPr>
+              <w:t>O usuário possui conexão à internet.</w:t>
+            </w:r>
+          </w:p>
+        </w:tc>
+      </w:tr>
+      <w:tr>
+        <w:trPr>
+          <w:trHeight w:val="543"/>
+        </w:trPr>
+        <w:tc>
+          <w:tcPr>
+            <w:tcW w:w="9992" w:type="dxa"/>
+          </w:tcPr>
+          <w:p>
+            <w:pPr>
+              <w:pStyle w:val="PargrafodaLista"/>
+              <w:ind w:left="765"/>
+              <w:jc w:val="center"/>
+              <w:rPr>
+                <w:rFonts w:ascii="Arial" w:hAnsi="Arial" w:cs="Arial"/>
+                <w:b/>
+                <w:sz w:val="24"/>
+                <w:szCs w:val="24"/>
+              </w:rPr>
+            </w:pPr>
+            <w:r>
+              <w:rPr>
+                <w:rFonts w:ascii="Arial" w:hAnsi="Arial" w:cs="Arial"/>
+                <w:b/>
+                <w:sz w:val="24"/>
+                <w:szCs w:val="24"/>
+              </w:rPr>
+              <w:t>PÓS-CONDIÇÕES</w:t>
             </w:r>
           </w:p>
         </w:tc>
@@ -11925,30 +12302,283 @@
                 <w:ilvl w:val="0"/>
                 <w:numId w:val="43"/>
               </w:numPr>
-              <w:spacing w:line="256" w:lineRule="auto"/>
-              <w:rPr>
-                <w:rFonts w:ascii="Arial" w:hAnsi="Arial" w:cs="Arial"/>
+              <w:rPr>
+                <w:rFonts w:ascii="Arial" w:hAnsi="Arial" w:cs="Arial"/>
+                <w:sz w:val="24"/>
+                <w:szCs w:val="24"/>
               </w:rPr>
             </w:pPr>
             <w:r>
               <w:rPr>
                 <w:rFonts w:ascii="Arial" w:hAnsi="Arial" w:cs="Arial"/>
-              </w:rPr>
-              <w:t xml:space="preserve">  </w:t>
-            </w:r>
-            <w:r>
+                <w:sz w:val="24"/>
+                <w:szCs w:val="24"/>
+              </w:rPr>
+              <w:t xml:space="preserve">O usuário está autenticado no sistema e pode utilizar o aplicativo para gerenciar suas sessões de </w:t>
+            </w:r>
+            <w:proofErr w:type="spellStart"/>
+            <w:r>
+              <w:rPr>
+                <w:rFonts w:ascii="Arial" w:hAnsi="Arial" w:cs="Arial"/>
+                <w:sz w:val="24"/>
+                <w:szCs w:val="24"/>
+              </w:rPr>
+              <w:t>Pomodoro</w:t>
+            </w:r>
+            <w:proofErr w:type="spellEnd"/>
+            <w:r>
+              <w:rPr>
+                <w:rFonts w:ascii="Arial" w:hAnsi="Arial" w:cs="Arial"/>
+                <w:sz w:val="24"/>
+                <w:szCs w:val="24"/>
+              </w:rPr>
+              <w:t>.</w:t>
+            </w:r>
+          </w:p>
+        </w:tc>
+      </w:tr>
+    </w:tbl>
+    <w:p>
+      <w:pPr>
+        <w:rPr>
+          <w:rFonts w:ascii="Arial" w:hAnsi="Arial" w:cs="Arial"/>
+        </w:rPr>
+      </w:pPr>
+    </w:p>
+    <w:tbl>
+      <w:tblPr>
+        <w:tblStyle w:val="Tabelacomgrade"/>
+        <w:tblpPr w:leftFromText="141" w:rightFromText="141" w:vertAnchor="page" w:horzAnchor="margin" w:tblpXSpec="center" w:tblpY="5416"/>
+        <w:tblW w:w="9992" w:type="dxa"/>
+        <w:tblInd w:w="0" w:type="dxa"/>
+        <w:tblLook w:val="04A0" w:firstRow="1" w:lastRow="0" w:firstColumn="1" w:lastColumn="0" w:noHBand="0" w:noVBand="1"/>
+      </w:tblPr>
+      <w:tblGrid>
+        <w:gridCol w:w="9992"/>
+      </w:tblGrid>
+      <w:tr>
+        <w:trPr>
+          <w:trHeight w:val="143"/>
+        </w:trPr>
+        <w:tc>
+          <w:tcPr>
+            <w:tcW w:w="9992" w:type="dxa"/>
+          </w:tcPr>
+          <w:p>
+            <w:pPr>
+              <w:jc w:val="center"/>
+              <w:rPr>
+                <w:rFonts w:ascii="Arial" w:hAnsi="Arial" w:cs="Arial"/>
+              </w:rPr>
+            </w:pPr>
+            <w:bookmarkStart w:id="19" w:name="_GoBack"/>
+            <w:bookmarkEnd w:id="19"/>
+            <w:r>
+              <w:rPr>
+                <w:rFonts w:ascii="Arial" w:hAnsi="Arial" w:cs="Arial"/>
+                <w:b/>
+                <w:sz w:val="28"/>
+                <w:szCs w:val="28"/>
+              </w:rPr>
+              <w:t>NARRATIVA DE CASO DE USO</w:t>
+            </w:r>
+          </w:p>
+        </w:tc>
+      </w:tr>
+      <w:tr>
+        <w:trPr>
+          <w:trHeight w:val="1300"/>
+        </w:trPr>
+        <w:tc>
+          <w:tcPr>
+            <w:tcW w:w="9992" w:type="dxa"/>
+          </w:tcPr>
+          <w:p>
+            <w:pPr>
               <w:rPr>
                 <w:rFonts w:ascii="Arial" w:hAnsi="Arial" w:cs="Arial"/>
                 <w:b/>
                 <w:bCs/>
-              </w:rPr>
-              <w:t>Inserção de Credenciais:</w:t>
-            </w:r>
-            <w:r>
-              <w:rPr>
-                <w:rFonts w:ascii="Arial" w:hAnsi="Arial" w:cs="Arial"/>
-              </w:rPr>
-              <w:t xml:space="preserve"> O usuário insere um e-mail e/ou senha que não correspondem aos dados cadastrados.</w:t>
+                <w:sz w:val="24"/>
+                <w:szCs w:val="24"/>
+              </w:rPr>
+            </w:pPr>
+            <w:r>
+              <w:rPr>
+                <w:rFonts w:ascii="Arial" w:hAnsi="Arial" w:cs="Arial"/>
+                <w:b/>
+                <w:bCs/>
+                <w:sz w:val="24"/>
+                <w:szCs w:val="24"/>
+              </w:rPr>
+              <w:t xml:space="preserve">Sigla/Nome: </w:t>
+            </w:r>
+            <w:r>
+              <w:t xml:space="preserve"> </w:t>
+            </w:r>
+            <w:r>
+              <w:rPr>
+                <w:rFonts w:ascii="Arial" w:hAnsi="Arial" w:cs="Arial"/>
+                <w:sz w:val="24"/>
+                <w:szCs w:val="24"/>
+              </w:rPr>
+              <w:t xml:space="preserve">CSUO5, </w:t>
+            </w:r>
+            <w:proofErr w:type="gramStart"/>
+            <w:r>
+              <w:rPr>
+                <w:rFonts w:ascii="Arial" w:hAnsi="Arial" w:cs="Arial"/>
+                <w:sz w:val="24"/>
+                <w:szCs w:val="24"/>
+              </w:rPr>
+              <w:t>Consultar</w:t>
+            </w:r>
+            <w:proofErr w:type="gramEnd"/>
+            <w:r>
+              <w:rPr>
+                <w:rFonts w:ascii="Arial" w:hAnsi="Arial" w:cs="Arial"/>
+                <w:sz w:val="24"/>
+                <w:szCs w:val="24"/>
+              </w:rPr>
+              <w:t xml:space="preserve"> atividades.</w:t>
+            </w:r>
+          </w:p>
+          <w:p>
+            <w:pPr>
+              <w:rPr>
+                <w:rFonts w:ascii="Arial" w:hAnsi="Arial" w:cs="Arial"/>
+                <w:sz w:val="24"/>
+                <w:szCs w:val="24"/>
+              </w:rPr>
+            </w:pPr>
+            <w:r>
+              <w:rPr>
+                <w:rFonts w:ascii="Arial" w:hAnsi="Arial" w:cs="Arial"/>
+                <w:b/>
+                <w:bCs/>
+                <w:sz w:val="24"/>
+                <w:szCs w:val="24"/>
+              </w:rPr>
+              <w:t xml:space="preserve">Objetivo: </w:t>
+            </w:r>
+            <w:r>
+              <w:rPr>
+                <w:rFonts w:ascii="Arial" w:hAnsi="Arial" w:cs="Arial"/>
+                <w:sz w:val="24"/>
+                <w:szCs w:val="24"/>
+              </w:rPr>
+              <w:t>Permitir que um usuário consulte suas atividades.</w:t>
+            </w:r>
+          </w:p>
+          <w:p>
+            <w:pPr>
+              <w:rPr>
+                <w:rFonts w:ascii="Arial" w:hAnsi="Arial" w:cs="Arial"/>
+                <w:sz w:val="24"/>
+                <w:szCs w:val="24"/>
+              </w:rPr>
+            </w:pPr>
+            <w:r>
+              <w:rPr>
+                <w:rFonts w:ascii="Arial" w:hAnsi="Arial" w:cs="Arial"/>
+                <w:b/>
+                <w:bCs/>
+                <w:sz w:val="24"/>
+                <w:szCs w:val="24"/>
+              </w:rPr>
+              <w:t xml:space="preserve">Frequência estimada: </w:t>
+            </w:r>
+            <w:r>
+              <w:rPr>
+                <w:rFonts w:ascii="Arial" w:hAnsi="Arial" w:cs="Arial"/>
+                <w:sz w:val="24"/>
+                <w:szCs w:val="24"/>
+              </w:rPr>
+              <w:t>Sempre que um usuário finalizar uma atividade.</w:t>
+            </w:r>
+          </w:p>
+          <w:p>
+            <w:pPr>
+              <w:rPr>
+                <w:rFonts w:ascii="Arial" w:hAnsi="Arial" w:cs="Arial"/>
+                <w:sz w:val="24"/>
+                <w:szCs w:val="24"/>
+              </w:rPr>
+            </w:pPr>
+            <w:r>
+              <w:rPr>
+                <w:rFonts w:ascii="Arial" w:hAnsi="Arial" w:cs="Arial"/>
+                <w:b/>
+                <w:sz w:val="24"/>
+                <w:szCs w:val="24"/>
+              </w:rPr>
+              <w:t xml:space="preserve">Ator Principal: </w:t>
+            </w:r>
+            <w:r>
+              <w:rPr>
+                <w:rFonts w:ascii="Arial" w:hAnsi="Arial" w:cs="Arial"/>
+                <w:sz w:val="24"/>
+                <w:szCs w:val="24"/>
+              </w:rPr>
+              <w:t>Usuário.</w:t>
+            </w:r>
+          </w:p>
+        </w:tc>
+      </w:tr>
+      <w:tr>
+        <w:trPr>
+          <w:trHeight w:val="480"/>
+        </w:trPr>
+        <w:tc>
+          <w:tcPr>
+            <w:tcW w:w="9992" w:type="dxa"/>
+          </w:tcPr>
+          <w:p>
+            <w:pPr>
+              <w:jc w:val="center"/>
+              <w:rPr>
+                <w:rFonts w:ascii="Arial" w:hAnsi="Arial" w:cs="Arial"/>
+                <w:b/>
+                <w:sz w:val="28"/>
+                <w:szCs w:val="28"/>
+              </w:rPr>
+            </w:pPr>
+            <w:r>
+              <w:rPr>
+                <w:rFonts w:ascii="Arial" w:hAnsi="Arial" w:cs="Arial"/>
+                <w:b/>
+                <w:sz w:val="28"/>
+                <w:szCs w:val="28"/>
+              </w:rPr>
+              <w:t>CENARIO PRINCIPAL</w:t>
+            </w:r>
+          </w:p>
+        </w:tc>
+      </w:tr>
+      <w:tr>
+        <w:trPr>
+          <w:trHeight w:val="543"/>
+        </w:trPr>
+        <w:tc>
+          <w:tcPr>
+            <w:tcW w:w="9992" w:type="dxa"/>
+          </w:tcPr>
+          <w:p>
+            <w:pPr>
+              <w:pStyle w:val="PargrafodaLista"/>
+              <w:numPr>
+                <w:ilvl w:val="0"/>
+                <w:numId w:val="54"/>
+              </w:numPr>
+              <w:rPr>
+                <w:rFonts w:ascii="Arial" w:hAnsi="Arial" w:cs="Arial"/>
+              </w:rPr>
+            </w:pPr>
+            <w:r>
+              <w:rPr>
+                <w:rFonts w:ascii="Arial" w:hAnsi="Arial" w:cs="Arial"/>
+              </w:rPr>
+              <w:t>O caso de uso começa quando o usuário acessa o histórico de atividades.</w:t>
             </w:r>
           </w:p>
           <w:p>
@@ -11956,9 +12586,8 @@
               <w:pStyle w:val="PargrafodaLista"/>
               <w:numPr>
                 <w:ilvl w:val="0"/>
-                <w:numId w:val="43"/>
+                <w:numId w:val="54"/>
               </w:numPr>
-              <w:spacing w:line="256" w:lineRule="auto"/>
               <w:rPr>
                 <w:rFonts w:ascii="Arial" w:hAnsi="Arial" w:cs="Arial"/>
               </w:rPr>
@@ -11967,21 +12596,7 @@
               <w:rPr>
                 <w:rFonts w:ascii="Arial" w:hAnsi="Arial" w:cs="Arial"/>
               </w:rPr>
-              <w:t xml:space="preserve">  </w:t>
-            </w:r>
-            <w:r>
-              <w:rPr>
-                <w:rFonts w:ascii="Arial" w:hAnsi="Arial" w:cs="Arial"/>
-                <w:b/>
-                <w:bCs/>
-              </w:rPr>
-              <w:t>Tentativa de Autenticação:</w:t>
-            </w:r>
-            <w:r>
-              <w:rPr>
-                <w:rFonts w:ascii="Arial" w:hAnsi="Arial" w:cs="Arial"/>
-              </w:rPr>
-              <w:t xml:space="preserve"> O usuário clica no botão de login, e o sistema tenta validar as credenciais.</w:t>
+              <w:t>O aplicativo exibe na tela as últimas atividades finalizadas pelo usuário.</w:t>
             </w:r>
           </w:p>
           <w:p>
@@ -11989,9 +12604,8 @@
               <w:pStyle w:val="PargrafodaLista"/>
               <w:numPr>
                 <w:ilvl w:val="0"/>
-                <w:numId w:val="43"/>
+                <w:numId w:val="54"/>
               </w:numPr>
-              <w:spacing w:line="256" w:lineRule="auto"/>
               <w:rPr>
                 <w:rFonts w:ascii="Arial" w:hAnsi="Arial" w:cs="Arial"/>
               </w:rPr>
@@ -12000,21 +12614,145 @@
               <w:rPr>
                 <w:rFonts w:ascii="Arial" w:hAnsi="Arial" w:cs="Arial"/>
               </w:rPr>
-              <w:t xml:space="preserve">  </w:t>
-            </w:r>
-            <w:r>
+              <w:t>Caso o usuário clique em ver mais, mostrará todas as atividades realizadas por ele(a).</w:t>
+            </w:r>
+          </w:p>
+        </w:tc>
+      </w:tr>
+      <w:tr>
+        <w:trPr>
+          <w:trHeight w:val="300"/>
+        </w:trPr>
+        <w:tc>
+          <w:tcPr>
+            <w:tcW w:w="9992" w:type="dxa"/>
+          </w:tcPr>
+          <w:p>
+            <w:pPr>
+              <w:jc w:val="center"/>
               <w:rPr>
                 <w:rFonts w:ascii="Arial" w:hAnsi="Arial" w:cs="Arial"/>
                 <w:b/>
                 <w:bCs/>
-              </w:rPr>
-              <w:t>Erro de Autenticação:</w:t>
-            </w:r>
-            <w:r>
-              <w:rPr>
-                <w:rFonts w:ascii="Arial" w:hAnsi="Arial" w:cs="Arial"/>
-              </w:rPr>
-              <w:t xml:space="preserve"> O sistema detecta que o e-mail ou senha não são válidos.</w:t>
+                <w:sz w:val="24"/>
+                <w:szCs w:val="24"/>
+              </w:rPr>
+            </w:pPr>
+            <w:r>
+              <w:rPr>
+                <w:rFonts w:ascii="Arial" w:hAnsi="Arial" w:cs="Arial"/>
+                <w:b/>
+                <w:bCs/>
+                <w:sz w:val="24"/>
+                <w:szCs w:val="24"/>
+              </w:rPr>
+              <w:t>CENÁRIO ALTERNATIVO</w:t>
+            </w:r>
+          </w:p>
+        </w:tc>
+      </w:tr>
+      <w:tr>
+        <w:trPr>
+          <w:trHeight w:val="543"/>
+        </w:trPr>
+        <w:tc>
+          <w:tcPr>
+            <w:tcW w:w="9992" w:type="dxa"/>
+          </w:tcPr>
+          <w:p>
+            <w:pPr>
+              <w:pStyle w:val="PargrafodaLista"/>
+              <w:numPr>
+                <w:ilvl w:val="0"/>
+                <w:numId w:val="53"/>
+              </w:numPr>
+              <w:spacing w:line="259" w:lineRule="auto"/>
+              <w:rPr>
+                <w:rFonts w:ascii="Arial" w:hAnsi="Arial" w:cs="Arial"/>
+              </w:rPr>
+            </w:pPr>
+            <w:r>
+              <w:rPr>
+                <w:rFonts w:ascii="Arial" w:hAnsi="Arial" w:cs="Arial"/>
+              </w:rPr>
+              <w:t>Caso o usuário entre no histórico sem estar cadastrado, aparecerá uma mensagem informado que é necessário login para ver o histórico.</w:t>
+            </w:r>
+          </w:p>
+          <w:p>
+            <w:pPr>
+              <w:jc w:val="center"/>
+              <w:rPr>
+                <w:rFonts w:ascii="Arial" w:hAnsi="Arial" w:cs="Arial"/>
+                <w:b/>
+                <w:bCs/>
+                <w:sz w:val="24"/>
+                <w:szCs w:val="24"/>
+              </w:rPr>
+            </w:pPr>
+          </w:p>
+        </w:tc>
+      </w:tr>
+      <w:tr>
+        <w:trPr>
+          <w:trHeight w:val="543"/>
+        </w:trPr>
+        <w:tc>
+          <w:tcPr>
+            <w:tcW w:w="9992" w:type="dxa"/>
+          </w:tcPr>
+          <w:p>
+            <w:pPr>
+              <w:jc w:val="center"/>
+              <w:rPr>
+                <w:rFonts w:ascii="Arial" w:hAnsi="Arial" w:cs="Arial"/>
+                <w:b/>
+                <w:bCs/>
+                <w:sz w:val="24"/>
+                <w:szCs w:val="24"/>
+              </w:rPr>
+            </w:pPr>
+            <w:r>
+              <w:rPr>
+                <w:rFonts w:ascii="Arial" w:hAnsi="Arial" w:cs="Arial"/>
+                <w:b/>
+                <w:bCs/>
+                <w:sz w:val="24"/>
+                <w:szCs w:val="24"/>
+              </w:rPr>
+              <w:t>CENÁRIO EXCESSÃO</w:t>
+            </w:r>
+          </w:p>
+        </w:tc>
+      </w:tr>
+      <w:tr>
+        <w:trPr>
+          <w:trHeight w:val="543"/>
+        </w:trPr>
+        <w:tc>
+          <w:tcPr>
+            <w:tcW w:w="9992" w:type="dxa"/>
+          </w:tcPr>
+          <w:p>
+            <w:pPr>
+              <w:pStyle w:val="PargrafodaLista"/>
+              <w:numPr>
+                <w:ilvl w:val="0"/>
+                <w:numId w:val="52"/>
+              </w:numPr>
+              <w:spacing w:line="259" w:lineRule="auto"/>
+              <w:rPr>
+                <w:rFonts w:ascii="Arial" w:hAnsi="Arial" w:cs="Arial"/>
+                <w:b/>
+                <w:bCs/>
+              </w:rPr>
+            </w:pPr>
+            <w:r>
+              <w:rPr>
+                <w:rFonts w:ascii="Arial" w:hAnsi="Arial" w:cs="Arial"/>
+                <w:b/>
+                <w:bCs/>
+              </w:rPr>
+              <w:t>Nenhuma atividade cadastrada.</w:t>
             </w:r>
           </w:p>
           <w:p>
@@ -12022,9 +12760,9 @@
               <w:pStyle w:val="PargrafodaLista"/>
               <w:numPr>
                 <w:ilvl w:val="0"/>
-                <w:numId w:val="43"/>
+                <w:numId w:val="52"/>
               </w:numPr>
-              <w:spacing w:line="256" w:lineRule="auto"/>
+              <w:spacing w:line="259" w:lineRule="auto"/>
               <w:rPr>
                 <w:rFonts w:ascii="Arial" w:hAnsi="Arial" w:cs="Arial"/>
               </w:rPr>
@@ -12033,7 +12771,7 @@
               <w:rPr>
                 <w:rFonts w:ascii="Arial" w:hAnsi="Arial" w:cs="Arial"/>
               </w:rPr>
-              <w:t>O sistema exibe uma mensagem de erro: "E-mail ou senha incorretos. Tente novamente."</w:t>
+              <w:t>Caso o usuário não tenha nenhuma atividade realizada, aparecerá uma mensagem informando que não há atividades realizadas.</w:t>
             </w:r>
           </w:p>
           <w:p>
@@ -12041,9 +12779,9 @@
               <w:pStyle w:val="PargrafodaLista"/>
               <w:numPr>
                 <w:ilvl w:val="0"/>
-                <w:numId w:val="43"/>
+                <w:numId w:val="52"/>
               </w:numPr>
-              <w:spacing w:line="256" w:lineRule="auto"/>
+              <w:spacing w:line="259" w:lineRule="auto"/>
               <w:rPr>
                 <w:rFonts w:ascii="Arial" w:hAnsi="Arial" w:cs="Arial"/>
               </w:rPr>
@@ -12052,29 +12790,16 @@
               <w:rPr>
                 <w:rFonts w:ascii="Arial" w:hAnsi="Arial" w:cs="Arial"/>
               </w:rPr>
-              <w:t xml:space="preserve">  </w:t>
-            </w:r>
-            <w:r>
-              <w:rPr>
-                <w:rFonts w:ascii="Arial" w:hAnsi="Arial" w:cs="Arial"/>
-                <w:b/>
-                <w:bCs/>
-              </w:rPr>
-              <w:t>Novo Login:</w:t>
-            </w:r>
-            <w:r>
-              <w:rPr>
-                <w:rFonts w:ascii="Arial" w:hAnsi="Arial" w:cs="Arial"/>
-              </w:rPr>
-              <w:t xml:space="preserve"> O usuário retorna à tela de login, podendo tentar novamente com credenciais corretas.</w:t>
+              <w:t>Não há restrições quanto a quantidade de atividades que possam ser realizadas.</w:t>
             </w:r>
           </w:p>
           <w:p>
             <w:pPr>
-              <w:spacing w:line="256" w:lineRule="auto"/>
-              <w:ind w:left="360"/>
-              <w:rPr>
-                <w:rFonts w:ascii="Arial" w:hAnsi="Arial" w:cs="Arial"/>
+              <w:jc w:val="center"/>
+              <w:rPr>
+                <w:rFonts w:ascii="Arial" w:hAnsi="Arial" w:cs="Arial"/>
+                <w:b/>
+                <w:bCs/>
                 <w:sz w:val="24"/>
                 <w:szCs w:val="24"/>
               </w:rPr>
@@ -12109,21 +12834,8 @@
                 <w:sz w:val="24"/>
                 <w:szCs w:val="24"/>
               </w:rPr>
-              <w:lastRenderedPageBreak/>
               <w:t>PRÉ-CONDIÇÕES</w:t>
             </w:r>
-          </w:p>
-          <w:p>
-            <w:pPr>
-              <w:pStyle w:val="PargrafodaLista"/>
-              <w:ind w:left="1485"/>
-              <w:rPr>
-                <w:rFonts w:ascii="Arial" w:hAnsi="Arial" w:cs="Arial"/>
-                <w:b/>
-                <w:sz w:val="24"/>
-                <w:szCs w:val="24"/>
-              </w:rPr>
-            </w:pPr>
           </w:p>
         </w:tc>
       </w:tr>
@@ -12140,21 +12852,32 @@
               <w:pStyle w:val="PargrafodaLista"/>
               <w:numPr>
                 <w:ilvl w:val="0"/>
-                <w:numId w:val="40"/>
+                <w:numId w:val="54"/>
               </w:numPr>
-              <w:rPr>
-                <w:rFonts w:ascii="Arial" w:hAnsi="Arial" w:cs="Arial"/>
-                <w:sz w:val="24"/>
-                <w:szCs w:val="24"/>
+              <w:spacing w:line="259" w:lineRule="auto"/>
+              <w:rPr>
+                <w:rFonts w:ascii="Arial" w:hAnsi="Arial" w:cs="Arial"/>
               </w:rPr>
             </w:pPr>
             <w:r>
               <w:rPr>
                 <w:rFonts w:ascii="Arial" w:hAnsi="Arial" w:cs="Arial"/>
-                <w:sz w:val="24"/>
-                <w:szCs w:val="24"/>
-              </w:rPr>
-              <w:t>O usuário já criou uma conta no aplicativo de Pomodoro.</w:t>
+              </w:rPr>
+              <w:t xml:space="preserve">O usuário deve estar </w:t>
+            </w:r>
+            <w:proofErr w:type="spellStart"/>
+            <w:r>
+              <w:rPr>
+                <w:rFonts w:ascii="Arial" w:hAnsi="Arial" w:cs="Arial"/>
+              </w:rPr>
+              <w:t>logado</w:t>
+            </w:r>
+            <w:proofErr w:type="spellEnd"/>
+            <w:r>
+              <w:rPr>
+                <w:rFonts w:ascii="Arial" w:hAnsi="Arial" w:cs="Arial"/>
+              </w:rPr>
+              <w:t>.</w:t>
             </w:r>
           </w:p>
           <w:p>
@@ -12162,8 +12885,35 @@
               <w:pStyle w:val="PargrafodaLista"/>
               <w:numPr>
                 <w:ilvl w:val="0"/>
-                <w:numId w:val="40"/>
+                <w:numId w:val="54"/>
               </w:numPr>
+              <w:spacing w:line="259" w:lineRule="auto"/>
+              <w:rPr>
+                <w:rFonts w:ascii="Arial" w:hAnsi="Arial" w:cs="Arial"/>
+              </w:rPr>
+            </w:pPr>
+            <w:r>
+              <w:rPr>
+                <w:rFonts w:ascii="Arial" w:hAnsi="Arial" w:cs="Arial"/>
+              </w:rPr>
+              <w:t>O usuário deve ter realizado pelo menos uma atividade.</w:t>
+            </w:r>
+          </w:p>
+        </w:tc>
+      </w:tr>
+      <w:tr>
+        <w:trPr>
+          <w:trHeight w:val="543"/>
+        </w:trPr>
+        <w:tc>
+          <w:tcPr>
+            <w:tcW w:w="9992" w:type="dxa"/>
+          </w:tcPr>
+          <w:p>
+            <w:pPr>
+              <w:pStyle w:val="PargrafodaLista"/>
+              <w:ind w:left="765"/>
+              <w:jc w:val="center"/>
               <w:rPr>
                 <w:rFonts w:ascii="Arial" w:hAnsi="Arial" w:cs="Arial"/>
                 <w:b/>
@@ -12174,10 +12924,927 @@
             <w:r>
               <w:rPr>
                 <w:rFonts w:ascii="Arial" w:hAnsi="Arial" w:cs="Arial"/>
+                <w:b/>
                 <w:sz w:val="24"/>
                 <w:szCs w:val="24"/>
               </w:rPr>
-              <w:t>O usuário possui conexão à internet.</w:t>
+              <w:t>PÓS-CONDIÇÕES</w:t>
+            </w:r>
+          </w:p>
+        </w:tc>
+      </w:tr>
+      <w:tr>
+        <w:trPr>
+          <w:trHeight w:val="543"/>
+        </w:trPr>
+        <w:tc>
+          <w:tcPr>
+            <w:tcW w:w="9992" w:type="dxa"/>
+          </w:tcPr>
+          <w:p>
+            <w:pPr>
+              <w:pStyle w:val="PargrafodaLista"/>
+              <w:numPr>
+                <w:ilvl w:val="0"/>
+                <w:numId w:val="54"/>
+              </w:numPr>
+              <w:spacing w:line="259" w:lineRule="auto"/>
+              <w:rPr>
+                <w:rFonts w:ascii="Arial" w:hAnsi="Arial" w:cs="Arial"/>
+              </w:rPr>
+            </w:pPr>
+            <w:r>
+              <w:rPr>
+                <w:rFonts w:ascii="Arial" w:hAnsi="Arial" w:cs="Arial"/>
+              </w:rPr>
+              <w:t>As atividades permanecem inalteradas, sem impacto em suas propriedades ou status.</w:t>
+            </w:r>
+          </w:p>
+        </w:tc>
+      </w:tr>
+    </w:tbl>
+    <w:p>
+      <w:pPr>
+        <w:rPr>
+          <w:rFonts w:ascii="Arial" w:hAnsi="Arial" w:cs="Arial"/>
+        </w:rPr>
+      </w:pPr>
+    </w:p>
+    <w:tbl>
+      <w:tblPr>
+        <w:tblStyle w:val="Tabelacomgrade"/>
+        <w:tblpPr w:leftFromText="141" w:rightFromText="141" w:vertAnchor="page" w:horzAnchor="margin" w:tblpXSpec="center" w:tblpY="1561"/>
+        <w:tblW w:w="9992" w:type="dxa"/>
+        <w:tblInd w:w="0" w:type="dxa"/>
+        <w:tblLook w:val="04A0" w:firstRow="1" w:lastRow="0" w:firstColumn="1" w:lastColumn="0" w:noHBand="0" w:noVBand="1"/>
+      </w:tblPr>
+      <w:tblGrid>
+        <w:gridCol w:w="9992"/>
+      </w:tblGrid>
+      <w:tr>
+        <w:trPr>
+          <w:trHeight w:val="143"/>
+        </w:trPr>
+        <w:tc>
+          <w:tcPr>
+            <w:tcW w:w="9992" w:type="dxa"/>
+          </w:tcPr>
+          <w:p>
+            <w:pPr>
+              <w:jc w:val="center"/>
+              <w:rPr>
+                <w:rFonts w:ascii="Arial" w:hAnsi="Arial" w:cs="Arial"/>
+              </w:rPr>
+            </w:pPr>
+            <w:r>
+              <w:rPr>
+                <w:rFonts w:ascii="Arial" w:hAnsi="Arial" w:cs="Arial"/>
+                <w:b/>
+                <w:sz w:val="28"/>
+                <w:szCs w:val="28"/>
+              </w:rPr>
+              <w:lastRenderedPageBreak/>
+              <w:t>NARRATIVA DE CASO DE USO</w:t>
+            </w:r>
+          </w:p>
+        </w:tc>
+      </w:tr>
+      <w:tr>
+        <w:trPr>
+          <w:trHeight w:val="1300"/>
+        </w:trPr>
+        <w:tc>
+          <w:tcPr>
+            <w:tcW w:w="9992" w:type="dxa"/>
+          </w:tcPr>
+          <w:p>
+            <w:pPr>
+              <w:rPr>
+                <w:rFonts w:ascii="Arial" w:hAnsi="Arial" w:cs="Arial"/>
+                <w:b/>
+                <w:sz w:val="24"/>
+                <w:szCs w:val="24"/>
+              </w:rPr>
+            </w:pPr>
+            <w:r>
+              <w:rPr>
+                <w:rFonts w:ascii="Arial" w:hAnsi="Arial" w:cs="Arial"/>
+                <w:b/>
+                <w:sz w:val="24"/>
+                <w:szCs w:val="24"/>
+              </w:rPr>
+              <w:t xml:space="preserve">Sigla/Nome: </w:t>
+            </w:r>
+            <w:r>
+              <w:t xml:space="preserve"> </w:t>
+            </w:r>
+            <w:r>
+              <w:rPr>
+                <w:sz w:val="20"/>
+              </w:rPr>
+              <w:t xml:space="preserve"> </w:t>
+            </w:r>
+            <w:r>
+              <w:rPr>
+                <w:rFonts w:ascii="Arial" w:hAnsi="Arial" w:cs="Arial"/>
+                <w:sz w:val="24"/>
+                <w:szCs w:val="24"/>
+              </w:rPr>
+              <w:t>CSU0</w:t>
+            </w:r>
+            <w:r>
+              <w:rPr>
+                <w:rFonts w:ascii="Arial" w:hAnsi="Arial" w:cs="Arial"/>
+                <w:sz w:val="24"/>
+                <w:szCs w:val="24"/>
+              </w:rPr>
+              <w:t>6 – Excluir Atividade</w:t>
+            </w:r>
+          </w:p>
+          <w:p>
+            <w:pPr>
+              <w:rPr>
+                <w:rFonts w:ascii="Arial" w:hAnsi="Arial" w:cs="Arial"/>
+                <w:sz w:val="24"/>
+                <w:szCs w:val="24"/>
+              </w:rPr>
+            </w:pPr>
+            <w:r>
+              <w:rPr>
+                <w:rFonts w:ascii="Arial" w:hAnsi="Arial" w:cs="Arial"/>
+                <w:b/>
+                <w:sz w:val="24"/>
+                <w:szCs w:val="24"/>
+              </w:rPr>
+              <w:t xml:space="preserve">Objetivo: </w:t>
+            </w:r>
+            <w:r>
+              <w:t xml:space="preserve"> </w:t>
+            </w:r>
+            <w:r>
+              <w:rPr>
+                <w:rFonts w:ascii="Arial" w:hAnsi="Arial" w:cs="Arial"/>
+                <w:sz w:val="24"/>
+                <w:szCs w:val="24"/>
+              </w:rPr>
+              <w:t xml:space="preserve">Permitir que o usuário </w:t>
+            </w:r>
+            <w:r>
+              <w:rPr>
+                <w:rFonts w:ascii="Arial" w:hAnsi="Arial" w:cs="Arial"/>
+                <w:sz w:val="24"/>
+                <w:szCs w:val="24"/>
+              </w:rPr>
+              <w:t>exclua a atividade caso não for o que esperava</w:t>
+            </w:r>
+          </w:p>
+          <w:p>
+            <w:pPr>
+              <w:rPr>
+                <w:rFonts w:ascii="Arial" w:hAnsi="Arial" w:cs="Arial"/>
+                <w:sz w:val="24"/>
+                <w:szCs w:val="24"/>
+              </w:rPr>
+            </w:pPr>
+            <w:r>
+              <w:rPr>
+                <w:rFonts w:ascii="Arial" w:hAnsi="Arial" w:cs="Arial"/>
+                <w:b/>
+                <w:sz w:val="24"/>
+                <w:szCs w:val="24"/>
+              </w:rPr>
+              <w:t xml:space="preserve">Frequência estimada: </w:t>
+            </w:r>
+            <w:r>
+              <w:rPr>
+                <w:rFonts w:ascii="Arial" w:hAnsi="Arial" w:cs="Arial"/>
+                <w:sz w:val="24"/>
+                <w:szCs w:val="24"/>
+              </w:rPr>
+              <w:t>Sempre que um novo usuário querer entra no aplicativo.</w:t>
+            </w:r>
+          </w:p>
+          <w:p>
+            <w:pPr>
+              <w:rPr>
+                <w:rFonts w:ascii="Arial" w:hAnsi="Arial" w:cs="Arial"/>
+                <w:sz w:val="24"/>
+                <w:szCs w:val="24"/>
+              </w:rPr>
+            </w:pPr>
+            <w:r>
+              <w:rPr>
+                <w:rFonts w:ascii="Arial" w:hAnsi="Arial" w:cs="Arial"/>
+                <w:b/>
+                <w:sz w:val="24"/>
+                <w:szCs w:val="24"/>
+              </w:rPr>
+              <w:t xml:space="preserve">Ator Principal: </w:t>
+            </w:r>
+            <w:r>
+              <w:rPr>
+                <w:rFonts w:ascii="Arial" w:hAnsi="Arial" w:cs="Arial"/>
+                <w:sz w:val="24"/>
+                <w:szCs w:val="24"/>
+              </w:rPr>
+              <w:t>Usuário.</w:t>
+            </w:r>
+          </w:p>
+          <w:p>
+            <w:pPr>
+              <w:rPr>
+                <w:rFonts w:ascii="Arial" w:hAnsi="Arial" w:cs="Arial"/>
+                <w:sz w:val="24"/>
+                <w:szCs w:val="24"/>
+              </w:rPr>
+            </w:pPr>
+          </w:p>
+        </w:tc>
+      </w:tr>
+      <w:tr>
+        <w:trPr>
+          <w:trHeight w:val="543"/>
+        </w:trPr>
+        <w:tc>
+          <w:tcPr>
+            <w:tcW w:w="9992" w:type="dxa"/>
+          </w:tcPr>
+          <w:p>
+            <w:pPr>
+              <w:jc w:val="center"/>
+              <w:rPr>
+                <w:rFonts w:ascii="Arial" w:hAnsi="Arial" w:cs="Arial"/>
+                <w:b/>
+                <w:sz w:val="28"/>
+                <w:szCs w:val="28"/>
+              </w:rPr>
+            </w:pPr>
+            <w:r>
+              <w:rPr>
+                <w:rFonts w:ascii="Arial" w:hAnsi="Arial" w:cs="Arial"/>
+                <w:b/>
+                <w:sz w:val="28"/>
+                <w:szCs w:val="28"/>
+              </w:rPr>
+              <w:t>CENARIO PRINCIPAL</w:t>
+            </w:r>
+          </w:p>
+        </w:tc>
+      </w:tr>
+      <w:tr>
+        <w:trPr>
+          <w:trHeight w:val="543"/>
+        </w:trPr>
+        <w:tc>
+          <w:tcPr>
+            <w:tcW w:w="9992" w:type="dxa"/>
+          </w:tcPr>
+          <w:p>
+            <w:pPr>
+              <w:pStyle w:val="PargrafodaLista"/>
+              <w:numPr>
+                <w:ilvl w:val="0"/>
+                <w:numId w:val="46"/>
+              </w:numPr>
+              <w:rPr>
+                <w:rFonts w:ascii="Arial" w:hAnsi="Arial" w:cs="Arial"/>
+                <w:bCs/>
+                <w:sz w:val="24"/>
+                <w:szCs w:val="24"/>
+              </w:rPr>
+            </w:pPr>
+            <w:r>
+              <w:rPr>
+                <w:rFonts w:ascii="Arial" w:hAnsi="Arial" w:cs="Arial"/>
+                <w:b/>
+                <w:bCs/>
+                <w:sz w:val="24"/>
+                <w:szCs w:val="24"/>
+              </w:rPr>
+              <w:t>Acesso à Lista de Atividades:</w:t>
+            </w:r>
+            <w:r>
+              <w:rPr>
+                <w:rFonts w:ascii="Arial" w:hAnsi="Arial" w:cs="Arial"/>
+                <w:bCs/>
+                <w:sz w:val="24"/>
+                <w:szCs w:val="24"/>
+              </w:rPr>
+              <w:t xml:space="preserve"> O usuário abre o aplicativo </w:t>
+            </w:r>
+            <w:proofErr w:type="spellStart"/>
+            <w:r>
+              <w:rPr>
+                <w:rFonts w:ascii="Arial" w:hAnsi="Arial" w:cs="Arial"/>
+                <w:bCs/>
+                <w:sz w:val="24"/>
+                <w:szCs w:val="24"/>
+              </w:rPr>
+              <w:t>Pomodoro</w:t>
+            </w:r>
+            <w:proofErr w:type="spellEnd"/>
+            <w:r>
+              <w:rPr>
+                <w:rFonts w:ascii="Arial" w:hAnsi="Arial" w:cs="Arial"/>
+                <w:bCs/>
+                <w:sz w:val="24"/>
+                <w:szCs w:val="24"/>
+              </w:rPr>
+              <w:t xml:space="preserve"> e navega até a seção de atividades, onde visualiza uma lista de suas tarefas programadas.</w:t>
+            </w:r>
+          </w:p>
+          <w:p>
+            <w:pPr>
+              <w:pStyle w:val="PargrafodaLista"/>
+              <w:numPr>
+                <w:ilvl w:val="0"/>
+                <w:numId w:val="46"/>
+              </w:numPr>
+              <w:rPr>
+                <w:rFonts w:ascii="Arial" w:hAnsi="Arial" w:cs="Arial"/>
+                <w:bCs/>
+                <w:sz w:val="24"/>
+                <w:szCs w:val="24"/>
+              </w:rPr>
+            </w:pPr>
+            <w:r>
+              <w:rPr>
+                <w:rFonts w:ascii="Arial" w:hAnsi="Arial" w:cs="Arial"/>
+                <w:b/>
+                <w:bCs/>
+                <w:sz w:val="24"/>
+                <w:szCs w:val="24"/>
+              </w:rPr>
+              <w:t>Seleção da Atividade:</w:t>
+            </w:r>
+            <w:r>
+              <w:rPr>
+                <w:rFonts w:ascii="Arial" w:hAnsi="Arial" w:cs="Arial"/>
+                <w:bCs/>
+                <w:sz w:val="24"/>
+                <w:szCs w:val="24"/>
+              </w:rPr>
+              <w:t xml:space="preserve"> O usuário identifica uma atividade que deseja excluir. Essa atividade pode ser uma tarefa que já foi concluída ou que não é mais relevante.</w:t>
+            </w:r>
+          </w:p>
+          <w:p>
+            <w:pPr>
+              <w:pStyle w:val="PargrafodaLista"/>
+              <w:numPr>
+                <w:ilvl w:val="0"/>
+                <w:numId w:val="46"/>
+              </w:numPr>
+              <w:rPr>
+                <w:rFonts w:ascii="Arial" w:hAnsi="Arial" w:cs="Arial"/>
+                <w:bCs/>
+                <w:sz w:val="24"/>
+                <w:szCs w:val="24"/>
+              </w:rPr>
+            </w:pPr>
+            <w:r>
+              <w:rPr>
+                <w:rFonts w:ascii="Arial" w:hAnsi="Arial" w:cs="Arial"/>
+                <w:b/>
+                <w:bCs/>
+                <w:sz w:val="24"/>
+                <w:szCs w:val="24"/>
+              </w:rPr>
+              <w:t>Ação de Exclusão:</w:t>
+            </w:r>
+            <w:r>
+              <w:rPr>
+                <w:rFonts w:ascii="Arial" w:hAnsi="Arial" w:cs="Arial"/>
+                <w:bCs/>
+                <w:sz w:val="24"/>
+                <w:szCs w:val="24"/>
+              </w:rPr>
+              <w:t xml:space="preserve"> O usuário toca no ícone de "excluir" (geralmente representado por uma lixeira) ao lado da atividade selecionada.</w:t>
+            </w:r>
+          </w:p>
+          <w:p>
+            <w:pPr>
+              <w:pStyle w:val="PargrafodaLista"/>
+              <w:numPr>
+                <w:ilvl w:val="0"/>
+                <w:numId w:val="46"/>
+              </w:numPr>
+              <w:rPr>
+                <w:rFonts w:ascii="Arial" w:hAnsi="Arial" w:cs="Arial"/>
+                <w:bCs/>
+                <w:sz w:val="24"/>
+                <w:szCs w:val="24"/>
+              </w:rPr>
+            </w:pPr>
+            <w:r>
+              <w:rPr>
+                <w:rFonts w:ascii="Arial" w:hAnsi="Arial" w:cs="Arial"/>
+                <w:b/>
+                <w:bCs/>
+                <w:sz w:val="24"/>
+                <w:szCs w:val="24"/>
+              </w:rPr>
+              <w:t>Confirmação de Exclusão:</w:t>
+            </w:r>
+            <w:r>
+              <w:rPr>
+                <w:rFonts w:ascii="Arial" w:hAnsi="Arial" w:cs="Arial"/>
+                <w:bCs/>
+                <w:sz w:val="24"/>
+                <w:szCs w:val="24"/>
+              </w:rPr>
+              <w:t xml:space="preserve"> O aplicativo exibe uma janela de confirmação perguntando se o usuário tem certeza de que deseja excluir a atividade. O usuário pode optar por "Sim" ou "Não".</w:t>
+            </w:r>
+          </w:p>
+          <w:p>
+            <w:pPr>
+              <w:ind w:left="873" w:hanging="873"/>
+              <w:rPr>
+                <w:rFonts w:ascii="Arial" w:hAnsi="Arial" w:cs="Arial"/>
+                <w:bCs/>
+                <w:sz w:val="24"/>
+                <w:szCs w:val="24"/>
+              </w:rPr>
+            </w:pPr>
+            <w:r>
+              <w:rPr>
+                <w:rFonts w:ascii="Arial" w:hAnsi="Arial" w:cs="Arial"/>
+                <w:bCs/>
+                <w:sz w:val="24"/>
+                <w:szCs w:val="24"/>
+              </w:rPr>
+              <w:t xml:space="preserve">              Se o usuário escolher "Sim":</w:t>
+            </w:r>
+          </w:p>
+          <w:p>
+            <w:pPr>
+              <w:pStyle w:val="PargrafodaLista"/>
+              <w:numPr>
+                <w:ilvl w:val="0"/>
+                <w:numId w:val="48"/>
+              </w:numPr>
+              <w:rPr>
+                <w:rFonts w:ascii="Arial" w:hAnsi="Arial" w:cs="Arial"/>
+                <w:bCs/>
+                <w:sz w:val="24"/>
+                <w:szCs w:val="24"/>
+              </w:rPr>
+            </w:pPr>
+            <w:r>
+              <w:rPr>
+                <w:rFonts w:ascii="Arial" w:hAnsi="Arial" w:cs="Arial"/>
+                <w:bCs/>
+                <w:sz w:val="24"/>
+                <w:szCs w:val="24"/>
+              </w:rPr>
+              <w:t>A atividade é removida da lista.</w:t>
+            </w:r>
+          </w:p>
+          <w:p>
+            <w:pPr>
+              <w:pStyle w:val="PargrafodaLista"/>
+              <w:numPr>
+                <w:ilvl w:val="0"/>
+                <w:numId w:val="48"/>
+              </w:numPr>
+              <w:rPr>
+                <w:rFonts w:ascii="Arial" w:hAnsi="Arial" w:cs="Arial"/>
+                <w:bCs/>
+                <w:sz w:val="24"/>
+                <w:szCs w:val="24"/>
+              </w:rPr>
+            </w:pPr>
+            <w:r>
+              <w:rPr>
+                <w:rFonts w:ascii="Arial" w:hAnsi="Arial" w:cs="Arial"/>
+                <w:bCs/>
+                <w:sz w:val="24"/>
+                <w:szCs w:val="24"/>
+              </w:rPr>
+              <w:t>O aplicativo exibe uma mensagem de sucesso confirmando a exclusão.</w:t>
+            </w:r>
+          </w:p>
+          <w:p>
+            <w:pPr>
+              <w:pStyle w:val="PargrafodaLista"/>
+              <w:numPr>
+                <w:ilvl w:val="0"/>
+                <w:numId w:val="48"/>
+              </w:numPr>
+              <w:rPr>
+                <w:rFonts w:ascii="Arial" w:hAnsi="Arial" w:cs="Arial"/>
+                <w:bCs/>
+                <w:sz w:val="24"/>
+                <w:szCs w:val="24"/>
+              </w:rPr>
+            </w:pPr>
+            <w:r>
+              <w:rPr>
+                <w:rFonts w:ascii="Arial" w:hAnsi="Arial" w:cs="Arial"/>
+                <w:bCs/>
+                <w:sz w:val="24"/>
+                <w:szCs w:val="24"/>
+              </w:rPr>
+              <w:t>A lista de atividades é atualizada automaticamente para refletir a mudança.</w:t>
+            </w:r>
+          </w:p>
+          <w:p>
+            <w:pPr>
+              <w:pStyle w:val="PargrafodaLista"/>
+              <w:numPr>
+                <w:ilvl w:val="0"/>
+                <w:numId w:val="48"/>
+              </w:numPr>
+              <w:rPr>
+                <w:rFonts w:ascii="Arial" w:hAnsi="Arial" w:cs="Arial"/>
+                <w:bCs/>
+                <w:sz w:val="24"/>
+                <w:szCs w:val="24"/>
+              </w:rPr>
+            </w:pPr>
+            <w:r>
+              <w:rPr>
+                <w:rFonts w:ascii="Arial" w:hAnsi="Arial" w:cs="Arial"/>
+                <w:bCs/>
+                <w:sz w:val="24"/>
+                <w:szCs w:val="24"/>
+              </w:rPr>
+              <w:t>Se o usuário escolher "Não":</w:t>
+            </w:r>
+          </w:p>
+          <w:p>
+            <w:pPr>
+              <w:pStyle w:val="PargrafodaLista"/>
+              <w:numPr>
+                <w:ilvl w:val="0"/>
+                <w:numId w:val="48"/>
+              </w:numPr>
+              <w:rPr>
+                <w:rFonts w:ascii="Arial" w:hAnsi="Arial" w:cs="Arial"/>
+                <w:bCs/>
+                <w:sz w:val="24"/>
+                <w:szCs w:val="24"/>
+              </w:rPr>
+            </w:pPr>
+            <w:r>
+              <w:rPr>
+                <w:rFonts w:ascii="Arial" w:hAnsi="Arial" w:cs="Arial"/>
+                <w:bCs/>
+                <w:sz w:val="24"/>
+                <w:szCs w:val="24"/>
+              </w:rPr>
+              <w:t>A janela de confirmação é fechada e o usuário retorna à lista de atividades sem alterações.</w:t>
+            </w:r>
+          </w:p>
+          <w:p>
+            <w:pPr>
+              <w:pStyle w:val="PargrafodaLista"/>
+              <w:numPr>
+                <w:ilvl w:val="0"/>
+                <w:numId w:val="46"/>
+              </w:numPr>
+              <w:rPr>
+                <w:rFonts w:ascii="Arial" w:hAnsi="Arial" w:cs="Arial"/>
+                <w:bCs/>
+                <w:sz w:val="24"/>
+                <w:szCs w:val="24"/>
+              </w:rPr>
+            </w:pPr>
+            <w:r>
+              <w:rPr>
+                <w:rFonts w:ascii="Arial" w:hAnsi="Arial" w:cs="Arial"/>
+                <w:b/>
+                <w:bCs/>
+                <w:sz w:val="24"/>
+                <w:szCs w:val="24"/>
+              </w:rPr>
+              <w:t xml:space="preserve">Feedback: </w:t>
+            </w:r>
+            <w:r>
+              <w:rPr>
+                <w:rFonts w:ascii="Arial" w:hAnsi="Arial" w:cs="Arial"/>
+                <w:bCs/>
+                <w:sz w:val="24"/>
+                <w:szCs w:val="24"/>
+              </w:rPr>
+              <w:t>O usuário recebe um feedback visual (como uma notificação) indicando que a atividade foi excluída com sucesso, reforçando a sensação de controle sobre suas tarefas.</w:t>
+            </w:r>
+          </w:p>
+          <w:p>
+            <w:pPr>
+              <w:pStyle w:val="PargrafodaLista"/>
+              <w:ind w:left="1353"/>
+              <w:rPr>
+                <w:rFonts w:ascii="Arial" w:hAnsi="Arial" w:cs="Arial"/>
+                <w:b/>
+              </w:rPr>
+            </w:pPr>
+          </w:p>
+        </w:tc>
+      </w:tr>
+      <w:tr>
+        <w:trPr>
+          <w:trHeight w:val="543"/>
+        </w:trPr>
+        <w:tc>
+          <w:tcPr>
+            <w:tcW w:w="9992" w:type="dxa"/>
+          </w:tcPr>
+          <w:p>
+            <w:pPr>
+              <w:jc w:val="center"/>
+              <w:rPr>
+                <w:rFonts w:ascii="Arial" w:hAnsi="Arial" w:cs="Arial"/>
+                <w:b/>
+                <w:sz w:val="24"/>
+                <w:szCs w:val="24"/>
+              </w:rPr>
+            </w:pPr>
+            <w:r>
+              <w:rPr>
+                <w:rFonts w:ascii="Arial" w:hAnsi="Arial" w:cs="Arial"/>
+                <w:b/>
+                <w:sz w:val="24"/>
+                <w:szCs w:val="24"/>
+              </w:rPr>
+              <w:t>CENÁRIO ALTERNATIVO</w:t>
+            </w:r>
+          </w:p>
+        </w:tc>
+      </w:tr>
+      <w:tr>
+        <w:trPr>
+          <w:trHeight w:val="543"/>
+        </w:trPr>
+        <w:tc>
+          <w:tcPr>
+            <w:tcW w:w="9992" w:type="dxa"/>
+          </w:tcPr>
+          <w:p>
+            <w:pPr>
+              <w:pStyle w:val="PargrafodaLista"/>
+              <w:numPr>
+                <w:ilvl w:val="0"/>
+                <w:numId w:val="45"/>
+              </w:numPr>
+              <w:rPr>
+                <w:rFonts w:ascii="Arial" w:hAnsi="Arial" w:cs="Arial"/>
+                <w:b/>
+                <w:sz w:val="24"/>
+                <w:szCs w:val="24"/>
+              </w:rPr>
+            </w:pPr>
+            <w:r>
+              <w:rPr>
+                <w:rFonts w:ascii="Arial" w:hAnsi="Arial" w:cs="Arial"/>
+                <w:b/>
+                <w:sz w:val="24"/>
+                <w:szCs w:val="24"/>
+              </w:rPr>
+              <w:t xml:space="preserve">Atividade Não Encontrada: </w:t>
+            </w:r>
+            <w:r>
+              <w:rPr>
+                <w:rFonts w:ascii="Arial" w:hAnsi="Arial" w:cs="Arial"/>
+                <w:sz w:val="24"/>
+                <w:szCs w:val="24"/>
+              </w:rPr>
+              <w:t>Caso o usuário tente excluir uma atividade que não existe (por exemplo, já foi excluída anteriormente), o aplicativo informa que a atividade não foi encontrada e sugere a atualização da lista.</w:t>
+            </w:r>
+          </w:p>
+        </w:tc>
+      </w:tr>
+      <w:tr>
+        <w:trPr>
+          <w:trHeight w:val="543"/>
+        </w:trPr>
+        <w:tc>
+          <w:tcPr>
+            <w:tcW w:w="9992" w:type="dxa"/>
+          </w:tcPr>
+          <w:p>
+            <w:pPr>
+              <w:jc w:val="center"/>
+              <w:rPr>
+                <w:rFonts w:ascii="Arial" w:hAnsi="Arial" w:cs="Arial"/>
+                <w:b/>
+                <w:sz w:val="24"/>
+                <w:szCs w:val="24"/>
+              </w:rPr>
+            </w:pPr>
+            <w:r>
+              <w:rPr>
+                <w:rFonts w:ascii="Arial" w:hAnsi="Arial" w:cs="Arial"/>
+                <w:b/>
+                <w:sz w:val="24"/>
+                <w:szCs w:val="24"/>
+              </w:rPr>
+              <w:t>CENÁRIO EXCESSÃO</w:t>
+            </w:r>
+          </w:p>
+        </w:tc>
+      </w:tr>
+      <w:tr>
+        <w:trPr>
+          <w:trHeight w:val="543"/>
+        </w:trPr>
+        <w:tc>
+          <w:tcPr>
+            <w:tcW w:w="9992" w:type="dxa"/>
+          </w:tcPr>
+          <w:p>
+            <w:pPr>
+              <w:pStyle w:val="PargrafodaLista"/>
+              <w:numPr>
+                <w:ilvl w:val="0"/>
+                <w:numId w:val="47"/>
+              </w:numPr>
+              <w:spacing w:line="256" w:lineRule="auto"/>
+              <w:rPr>
+                <w:rFonts w:ascii="Arial" w:hAnsi="Arial" w:cs="Arial"/>
+                <w:b/>
+                <w:sz w:val="24"/>
+                <w:szCs w:val="24"/>
+              </w:rPr>
+            </w:pPr>
+            <w:r>
+              <w:rPr>
+                <w:rFonts w:ascii="Arial" w:hAnsi="Arial" w:cs="Arial"/>
+                <w:b/>
+                <w:sz w:val="24"/>
+                <w:szCs w:val="24"/>
+              </w:rPr>
+              <w:t>Atividade Não Encontrada:</w:t>
+            </w:r>
+          </w:p>
+          <w:p>
+            <w:pPr>
+              <w:pStyle w:val="PargrafodaLista"/>
+              <w:numPr>
+                <w:ilvl w:val="0"/>
+                <w:numId w:val="50"/>
+              </w:numPr>
+              <w:spacing w:line="256" w:lineRule="auto"/>
+              <w:rPr>
+                <w:rFonts w:ascii="Arial" w:hAnsi="Arial" w:cs="Arial"/>
+                <w:sz w:val="24"/>
+                <w:szCs w:val="24"/>
+              </w:rPr>
+            </w:pPr>
+            <w:r>
+              <w:rPr>
+                <w:rFonts w:ascii="Arial" w:hAnsi="Arial" w:cs="Arial"/>
+                <w:sz w:val="24"/>
+                <w:szCs w:val="24"/>
+              </w:rPr>
+              <w:t>Se o usuário tenta excluir uma atividade que já foi removida ou não existe, o aplicativo exibe uma mensagem de erro: "Atividade não encontrada."</w:t>
+            </w:r>
+          </w:p>
+          <w:p>
+            <w:pPr>
+              <w:pStyle w:val="PargrafodaLista"/>
+              <w:numPr>
+                <w:ilvl w:val="0"/>
+                <w:numId w:val="50"/>
+              </w:numPr>
+              <w:spacing w:line="256" w:lineRule="auto"/>
+              <w:rPr>
+                <w:rFonts w:ascii="Arial" w:hAnsi="Arial" w:cs="Arial"/>
+                <w:sz w:val="24"/>
+                <w:szCs w:val="24"/>
+              </w:rPr>
+            </w:pPr>
+            <w:r>
+              <w:rPr>
+                <w:rFonts w:ascii="Arial" w:hAnsi="Arial" w:cs="Arial"/>
+                <w:sz w:val="24"/>
+                <w:szCs w:val="24"/>
+              </w:rPr>
+              <w:t>O aplicativo sugere que o usuário atualize a lista de atividades.</w:t>
+            </w:r>
+          </w:p>
+          <w:p>
+            <w:pPr>
+              <w:pStyle w:val="PargrafodaLista"/>
+              <w:numPr>
+                <w:ilvl w:val="0"/>
+                <w:numId w:val="47"/>
+              </w:numPr>
+              <w:spacing w:line="256" w:lineRule="auto"/>
+              <w:rPr>
+                <w:rFonts w:ascii="Arial" w:hAnsi="Arial" w:cs="Arial"/>
+                <w:b/>
+                <w:sz w:val="24"/>
+                <w:szCs w:val="24"/>
+              </w:rPr>
+            </w:pPr>
+            <w:r>
+              <w:rPr>
+                <w:rFonts w:ascii="Arial" w:hAnsi="Arial" w:cs="Arial"/>
+                <w:b/>
+                <w:sz w:val="24"/>
+                <w:szCs w:val="24"/>
+              </w:rPr>
+              <w:t>Erro de Conexão:</w:t>
+            </w:r>
+          </w:p>
+          <w:p>
+            <w:pPr>
+              <w:pStyle w:val="PargrafodaLista"/>
+              <w:numPr>
+                <w:ilvl w:val="0"/>
+                <w:numId w:val="51"/>
+              </w:numPr>
+              <w:spacing w:line="256" w:lineRule="auto"/>
+              <w:rPr>
+                <w:rFonts w:ascii="Arial" w:hAnsi="Arial" w:cs="Arial"/>
+                <w:sz w:val="24"/>
+                <w:szCs w:val="24"/>
+              </w:rPr>
+            </w:pPr>
+            <w:r>
+              <w:rPr>
+                <w:rFonts w:ascii="Arial" w:hAnsi="Arial" w:cs="Arial"/>
+                <w:sz w:val="24"/>
+                <w:szCs w:val="24"/>
+              </w:rPr>
+              <w:t>Se houver problemas de conexão com o servidor ao tentar excluir a atividade</w:t>
+            </w:r>
+          </w:p>
+          <w:p>
+            <w:pPr>
+              <w:pStyle w:val="PargrafodaLista"/>
+              <w:spacing w:line="256" w:lineRule="auto"/>
+              <w:ind w:left="1080"/>
+              <w:rPr>
+                <w:rFonts w:ascii="Arial" w:hAnsi="Arial" w:cs="Arial"/>
+                <w:b/>
+                <w:sz w:val="24"/>
+                <w:szCs w:val="24"/>
+              </w:rPr>
+            </w:pPr>
+          </w:p>
+        </w:tc>
+      </w:tr>
+      <w:tr>
+        <w:trPr>
+          <w:trHeight w:val="543"/>
+        </w:trPr>
+        <w:tc>
+          <w:tcPr>
+            <w:tcW w:w="9992" w:type="dxa"/>
+          </w:tcPr>
+          <w:p>
+            <w:pPr>
+              <w:pStyle w:val="PargrafodaLista"/>
+              <w:ind w:left="765"/>
+              <w:jc w:val="center"/>
+              <w:rPr>
+                <w:rFonts w:ascii="Arial" w:hAnsi="Arial" w:cs="Arial"/>
+                <w:b/>
+                <w:sz w:val="24"/>
+                <w:szCs w:val="24"/>
+              </w:rPr>
+            </w:pPr>
+            <w:r>
+              <w:rPr>
+                <w:rFonts w:ascii="Arial" w:hAnsi="Arial" w:cs="Arial"/>
+                <w:b/>
+                <w:sz w:val="24"/>
+                <w:szCs w:val="24"/>
+              </w:rPr>
+              <w:t>PRÉ-CONDIÇÕES</w:t>
+            </w:r>
+          </w:p>
+        </w:tc>
+      </w:tr>
+      <w:tr>
+        <w:trPr>
+          <w:trHeight w:val="543"/>
+        </w:trPr>
+        <w:tc>
+          <w:tcPr>
+            <w:tcW w:w="9992" w:type="dxa"/>
+          </w:tcPr>
+          <w:p>
+            <w:pPr>
+              <w:pStyle w:val="PargrafodaLista"/>
+              <w:numPr>
+                <w:ilvl w:val="0"/>
+                <w:numId w:val="49"/>
+              </w:numPr>
+              <w:rPr>
+                <w:rFonts w:ascii="Arial" w:hAnsi="Arial" w:cs="Arial"/>
+                <w:sz w:val="24"/>
+                <w:szCs w:val="24"/>
+              </w:rPr>
+            </w:pPr>
+            <w:r>
+              <w:rPr>
+                <w:rFonts w:ascii="Arial" w:hAnsi="Arial" w:cs="Arial"/>
+                <w:sz w:val="24"/>
+                <w:szCs w:val="24"/>
+              </w:rPr>
+              <w:t>O usuário está autenticado no aplicativo e possui atividades registradas em sua lista.</w:t>
             </w:r>
           </w:p>
         </w:tc>
@@ -12241,7 +13908,8 @@
                 <w:sz w:val="24"/>
                 <w:szCs w:val="24"/>
               </w:rPr>
-              <w:t>O usuário está autenticado no sistema e pode utilizar o aplicativo para gerenciar suas sessões de Pomodoro.</w:t>
+              <w:lastRenderedPageBreak/>
+              <w:t>A atividade é removida da lista do usuário, e o aplicativo reflete a nova lista de tarefas.</w:t>
             </w:r>
           </w:p>
         </w:tc>
@@ -12279,7 +13947,7 @@
           <w:szCs w:val="24"/>
         </w:rPr>
       </w:pPr>
-      <w:bookmarkStart w:id="19" w:name="_Toc14160058"/>
+      <w:bookmarkStart w:id="20" w:name="_Toc14160058"/>
       <w:r>
         <w:rPr>
           <w:rFonts w:ascii="Arial" w:hAnsi="Arial" w:cs="Arial"/>
@@ -12289,7 +13957,7 @@
         </w:rPr>
         <w:t>Plano de testes</w:t>
       </w:r>
-      <w:bookmarkEnd w:id="19"/>
+      <w:bookmarkEnd w:id="20"/>
     </w:p>
     <w:p>
       <w:pPr>
@@ -12326,7 +13994,7 @@
           <w:szCs w:val="24"/>
         </w:rPr>
       </w:pPr>
-      <w:bookmarkStart w:id="20" w:name="_Toc14160059"/>
+      <w:bookmarkStart w:id="21" w:name="_Toc14160059"/>
       <w:r>
         <w:rPr>
           <w:rFonts w:ascii="Arial" w:hAnsi="Arial" w:cs="Arial"/>
@@ -12336,7 +14004,7 @@
         </w:rPr>
         <w:t>Resultados</w:t>
       </w:r>
-      <w:bookmarkEnd w:id="20"/>
+      <w:bookmarkEnd w:id="21"/>
     </w:p>
     <w:p>
       <w:pPr>
@@ -12373,7 +14041,7 @@
           <w:szCs w:val="24"/>
         </w:rPr>
       </w:pPr>
-      <w:bookmarkStart w:id="21" w:name="_Toc14160060"/>
+      <w:bookmarkStart w:id="22" w:name="_Toc14160060"/>
       <w:r>
         <w:rPr>
           <w:rFonts w:ascii="Arial" w:hAnsi="Arial" w:cs="Arial"/>
@@ -12392,7 +14060,7 @@
         </w:rPr>
         <w:t>Retrospectiva</w:t>
       </w:r>
-      <w:bookmarkEnd w:id="21"/>
+      <w:bookmarkEnd w:id="22"/>
     </w:p>
     <w:p>
       <w:pPr>
@@ -12430,7 +14098,6 @@
           <w:rFonts w:ascii="Arial" w:hAnsi="Arial" w:cs="Arial"/>
           <w:noProof/>
         </w:rPr>
-        <w:lastRenderedPageBreak/>
         <w:drawing>
           <wp:inline distT="0" distB="0" distL="0" distR="0" wp14:anchorId="7AD73D89" wp14:editId="213B6E2B">
             <wp:extent cx="5438774" cy="5000625"/>
@@ -12524,7 +14191,6 @@
           <w:rFonts w:ascii="Arial" w:hAnsi="Arial" w:cs="Arial"/>
           <w:noProof/>
         </w:rPr>
-        <w:lastRenderedPageBreak/>
         <w:drawing>
           <wp:inline distT="0" distB="0" distL="0" distR="0" wp14:anchorId="496E7894" wp14:editId="1A34AB7F">
             <wp:extent cx="5762626" cy="4600575"/>
@@ -13138,7 +14804,7 @@
         <w:pStyle w:val="PargrafodaLista"/>
         <w:numPr>
           <w:ilvl w:val="1"/>
-          <w:numId w:val="39"/>
+          <w:numId w:val="38"/>
         </w:numPr>
         <w:rPr>
           <w:rFonts w:ascii="Arial" w:hAnsi="Arial" w:cs="Arial"/>
@@ -13231,6 +14897,86 @@
           <w:szCs w:val="24"/>
         </w:rPr>
         <w:t xml:space="preserve">Após a contagem de horas, foi realizado o cálculo de dias que o sprint teria, desconsiderando feriados, finais de semana e as aulas de Programação de Dispositivos Móveis. A partir disso, foi encontrado um total de 240 horas. </w:t>
+      </w:r>
+    </w:p>
+    <w:p>
+      <w:pPr>
+        <w:pStyle w:val="PargrafodaLista"/>
+        <w:numPr>
+          <w:ilvl w:val="0"/>
+          <w:numId w:val="36"/>
+        </w:numPr>
+        <w:spacing w:after="160" w:line="259" w:lineRule="auto"/>
+        <w:rPr>
+          <w:rFonts w:ascii="Arial" w:hAnsi="Arial" w:cs="Arial"/>
+          <w:color w:val="FF0000"/>
+          <w:sz w:val="24"/>
+          <w:szCs w:val="24"/>
+        </w:rPr>
+      </w:pPr>
+      <w:r>
+        <w:rPr>
+          <w:rFonts w:ascii="Arial" w:hAnsi="Arial" w:cs="Arial"/>
+          <w:color w:val="FF0000"/>
+          <w:sz w:val="24"/>
+          <w:szCs w:val="24"/>
+        </w:rPr>
+        <w:t xml:space="preserve">20 dias uteis → 240 horas no Sprint 2 </w:t>
+      </w:r>
+    </w:p>
+    <w:p>
+      <w:pPr>
+        <w:rPr>
+          <w:rFonts w:ascii="Arial" w:hAnsi="Arial" w:cs="Arial"/>
+          <w:sz w:val="24"/>
+          <w:szCs w:val="24"/>
+        </w:rPr>
+      </w:pPr>
+      <w:r>
+        <w:rPr>
+          <w:rFonts w:ascii="Arial" w:hAnsi="Arial" w:cs="Arial"/>
+          <w:sz w:val="24"/>
+          <w:szCs w:val="24"/>
+        </w:rPr>
+        <w:t xml:space="preserve">Dessa forma, foi definida uma meta de trabalho de 230 horas, disponibilizando 20 horas (12,5% do sprint) para possíveis imprevistos e atrasos. Portanto, para uma boa execução do sprint seria necessárias 10 horas de trabalho diárias. </w:t>
+      </w:r>
+    </w:p>
+    <w:p>
+      <w:pPr>
+        <w:rPr>
+          <w:rFonts w:ascii="Arial" w:hAnsi="Arial" w:cs="Arial"/>
+          <w:b/>
+          <w:bCs/>
+          <w:sz w:val="28"/>
+          <w:szCs w:val="28"/>
+        </w:rPr>
+      </w:pPr>
+      <w:r>
+        <w:rPr>
+          <w:rFonts w:ascii="Arial" w:hAnsi="Arial" w:cs="Arial"/>
+          <w:b/>
+          <w:bCs/>
+          <w:sz w:val="28"/>
+          <w:szCs w:val="28"/>
+        </w:rPr>
+        <w:t>Metas do Segundo Sprint</w:t>
+      </w:r>
+    </w:p>
+    <w:p>
+      <w:pPr>
+        <w:rPr>
+          <w:rFonts w:ascii="Arial" w:hAnsi="Arial" w:cs="Arial"/>
+          <w:sz w:val="24"/>
+          <w:szCs w:val="24"/>
+        </w:rPr>
+      </w:pPr>
+      <w:r>
+        <w:rPr>
+          <w:rFonts w:ascii="Arial" w:hAnsi="Arial" w:cs="Arial"/>
+          <w:sz w:val="24"/>
+          <w:szCs w:val="24"/>
+        </w:rPr>
+        <w:t>Para esse Sprint o grupo separou as seguintes metas a serem cumpridas:</w:t>
       </w:r>
     </w:p>
     <w:p>
@@ -13243,74 +14989,28 @@
         <w:spacing w:after="160" w:line="259" w:lineRule="auto"/>
         <w:rPr>
           <w:rFonts w:ascii="Arial" w:hAnsi="Arial" w:cs="Arial"/>
-          <w:color w:val="FF0000"/>
-          <w:sz w:val="24"/>
-          <w:szCs w:val="24"/>
-        </w:rPr>
-      </w:pPr>
-      <w:r>
-        <w:rPr>
-          <w:rFonts w:ascii="Arial" w:hAnsi="Arial" w:cs="Arial"/>
-          <w:color w:val="FF0000"/>
-          <w:sz w:val="24"/>
-          <w:szCs w:val="24"/>
-        </w:rPr>
-        <w:t xml:space="preserve">20 dias uteis → 240 horas no Sprint 2 </w:t>
-      </w:r>
-    </w:p>
-    <w:p>
-      <w:pPr>
-        <w:rPr>
-          <w:rFonts w:ascii="Arial" w:hAnsi="Arial" w:cs="Arial"/>
-          <w:sz w:val="24"/>
-          <w:szCs w:val="24"/>
-        </w:rPr>
-      </w:pPr>
-      <w:r>
-        <w:rPr>
-          <w:rFonts w:ascii="Arial" w:hAnsi="Arial" w:cs="Arial"/>
-          <w:sz w:val="24"/>
-          <w:szCs w:val="24"/>
-        </w:rPr>
-        <w:t xml:space="preserve">Dessa forma, foi definida uma meta de trabalho de 230 horas, disponibilizando 20 horas (12,5% do sprint) para possíveis imprevistos e atrasos. Portanto, para uma boa execução do sprint seria necessárias 10 horas de trabalho diárias. </w:t>
-      </w:r>
-    </w:p>
-    <w:p>
-      <w:pPr>
-        <w:rPr>
-          <w:rFonts w:ascii="Arial" w:hAnsi="Arial" w:cs="Arial"/>
           <w:b/>
-          <w:bCs/>
-          <w:sz w:val="28"/>
-          <w:szCs w:val="28"/>
+          <w:sz w:val="24"/>
+          <w:szCs w:val="24"/>
         </w:rPr>
       </w:pPr>
       <w:r>
         <w:rPr>
           <w:rFonts w:ascii="Arial" w:hAnsi="Arial" w:cs="Arial"/>
           <w:b/>
-          <w:bCs/>
-          <w:sz w:val="28"/>
-          <w:szCs w:val="28"/>
-        </w:rPr>
-        <w:t>Metas do Segundo Sprint</w:t>
-      </w:r>
-    </w:p>
-    <w:p>
-      <w:pPr>
-        <w:rPr>
-          <w:rFonts w:ascii="Arial" w:hAnsi="Arial" w:cs="Arial"/>
-          <w:sz w:val="24"/>
-          <w:szCs w:val="24"/>
-        </w:rPr>
-      </w:pPr>
-      <w:r>
-        <w:rPr>
-          <w:rFonts w:ascii="Arial" w:hAnsi="Arial" w:cs="Arial"/>
-          <w:sz w:val="24"/>
-          <w:szCs w:val="24"/>
-        </w:rPr>
-        <w:t>Para esse Sprint o grupo separou as seguintes metas a serem cumpridas:</w:t>
+          <w:sz w:val="24"/>
+          <w:szCs w:val="24"/>
+        </w:rPr>
+        <w:t xml:space="preserve"> </w:t>
+      </w:r>
+      <w:r>
+        <w:rPr>
+          <w:rFonts w:ascii="Arial" w:hAnsi="Arial" w:cs="Arial"/>
+          <w:b/>
+          <w:sz w:val="24"/>
+          <w:szCs w:val="24"/>
+        </w:rPr>
+        <w:t>Construir os Componentes das Telas Do projetos.</w:t>
       </w:r>
     </w:p>
     <w:p>
@@ -13318,41 +15018,7 @@
         <w:pStyle w:val="PargrafodaLista"/>
         <w:numPr>
           <w:ilvl w:val="0"/>
-          <w:numId w:val="38"/>
-        </w:numPr>
-        <w:spacing w:after="160" w:line="259" w:lineRule="auto"/>
-        <w:rPr>
-          <w:rFonts w:ascii="Arial" w:hAnsi="Arial" w:cs="Arial"/>
-          <w:b/>
-          <w:sz w:val="24"/>
-          <w:szCs w:val="24"/>
-        </w:rPr>
-      </w:pPr>
-      <w:r>
-        <w:rPr>
-          <w:rFonts w:ascii="Arial" w:hAnsi="Arial" w:cs="Arial"/>
-          <w:b/>
-          <w:sz w:val="24"/>
-          <w:szCs w:val="24"/>
-        </w:rPr>
-        <w:t xml:space="preserve"> </w:t>
-      </w:r>
-      <w:r>
-        <w:rPr>
-          <w:rFonts w:ascii="Arial" w:hAnsi="Arial" w:cs="Arial"/>
-          <w:b/>
-          <w:sz w:val="24"/>
-          <w:szCs w:val="24"/>
-        </w:rPr>
-        <w:t>Construir os Componentes das Telas Do projetos.</w:t>
-      </w:r>
-    </w:p>
-    <w:p>
-      <w:pPr>
-        <w:pStyle w:val="PargrafodaLista"/>
-        <w:numPr>
-          <w:ilvl w:val="0"/>
-          <w:numId w:val="38"/>
+          <w:numId w:val="37"/>
         </w:numPr>
         <w:spacing w:after="160" w:line="259" w:lineRule="auto"/>
         <w:rPr>
@@ -13404,7 +15070,7 @@
         <w:pStyle w:val="PargrafodaLista"/>
         <w:numPr>
           <w:ilvl w:val="1"/>
-          <w:numId w:val="38"/>
+          <w:numId w:val="37"/>
         </w:numPr>
         <w:spacing w:after="160" w:line="259" w:lineRule="auto"/>
         <w:rPr>
@@ -13429,7 +15095,7 @@
         <w:pStyle w:val="PargrafodaLista"/>
         <w:numPr>
           <w:ilvl w:val="2"/>
-          <w:numId w:val="39"/>
+          <w:numId w:val="38"/>
         </w:numPr>
         <w:rPr>
           <w:rFonts w:ascii="Arial" w:hAnsi="Arial" w:cs="Arial"/>
@@ -13474,7 +15140,7 @@
         <w:pStyle w:val="PargrafodaLista"/>
         <w:numPr>
           <w:ilvl w:val="2"/>
-          <w:numId w:val="39"/>
+          <w:numId w:val="38"/>
         </w:numPr>
         <w:rPr>
           <w:rFonts w:ascii="Arial" w:hAnsi="Arial" w:cs="Arial"/>
@@ -13991,7 +15657,6 @@
           <w:sz w:val="24"/>
           <w:szCs w:val="24"/>
         </w:rPr>
-        <w:lastRenderedPageBreak/>
         <w:t>9.2.6 Kanban e Retrospectiva</w:t>
       </w:r>
     </w:p>
@@ -14250,7 +15915,7 @@
               </wp:inline>
             </w:drawing>
           </mc:Choice>
-          <mc:Fallback>
+          <mc:Fallback xmlns:w16sdtdh="http://schemas.microsoft.com/office/word/2020/wordml/sdtdatahash" xmlns:w16du="http://schemas.microsoft.com/office/word/2023/wordml/word16du" xmlns:w16="http://schemas.microsoft.com/office/word/2018/wordml" xmlns:w16cex="http://schemas.microsoft.com/office/word/2018/wordml/cex" xmlns:oel="http://schemas.microsoft.com/office/2019/extlst">
             <w:pict>
               <v:rect w14:anchorId="7827A6F0" id="Retângulo 10" o:spid="_x0000_s1026" alt="image.png" style="width:24.3pt;height:24.3pt;visibility:visible;mso-wrap-style:square;mso-left-percent:-10001;mso-top-percent:-10001;mso-position-horizontal:absolute;mso-position-horizontal-relative:char;mso-position-vertical:absolute;mso-position-vertical-relative:line;mso-left-percent:-10001;mso-top-percent:-10001;v-text-anchor:top" o:gfxdata="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" filled="f" stroked="f">
                 <o:lock v:ext="edit" aspectratio="t"/>
@@ -14857,7 +16522,7 @@
               </wp:inline>
             </w:drawing>
           </mc:Choice>
-          <mc:Fallback>
+          <mc:Fallback xmlns:w16sdtdh="http://schemas.microsoft.com/office/word/2020/wordml/sdtdatahash" xmlns:w16du="http://schemas.microsoft.com/office/word/2023/wordml/word16du" xmlns:w16="http://schemas.microsoft.com/office/word/2018/wordml" xmlns:w16cex="http://schemas.microsoft.com/office/word/2018/wordml/cex" xmlns:oel="http://schemas.microsoft.com/office/2019/extlst">
             <w:pict>
               <v:rect w14:anchorId="029F886D" id="Retângulo 14" o:spid="_x0000_s1026" alt="image.png" style="width:24.3pt;height:24.3pt;visibility:visible;mso-wrap-style:square;mso-left-percent:-10001;mso-top-percent:-10001;mso-position-horizontal:absolute;mso-position-horizontal-relative:char;mso-position-vertical:absolute;mso-position-vertical-relative:line;mso-left-percent:-10001;mso-top-percent:-10001;v-text-anchor:top" o:gfxdata="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" filled="f" stroked="f">
                 <o:lock v:ext="edit" aspectratio="t"/>
@@ -15078,7 +16743,7 @@
               </wp:inline>
             </w:drawing>
           </mc:Choice>
-          <mc:Fallback>
+          <mc:Fallback xmlns:w16sdtdh="http://schemas.microsoft.com/office/word/2020/wordml/sdtdatahash" xmlns:w16du="http://schemas.microsoft.com/office/word/2023/wordml/word16du" xmlns:w16="http://schemas.microsoft.com/office/word/2018/wordml" xmlns:w16cex="http://schemas.microsoft.com/office/word/2018/wordml/cex" xmlns:oel="http://schemas.microsoft.com/office/2019/extlst">
             <w:pict>
               <v:rect w14:anchorId="35F92097" id="Retângulo 16" o:spid="_x0000_s1026" alt="image.png" style="width:24.3pt;height:24.3pt;visibility:visible;mso-wrap-style:square;mso-left-percent:-10001;mso-top-percent:-10001;mso-position-horizontal:absolute;mso-position-horizontal-relative:char;mso-position-vertical:absolute;mso-position-vertical-relative:line;mso-left-percent:-10001;mso-top-percent:-10001;v-text-anchor:top" o:gfxdata="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" filled="f" stroked="f">
                 <o:lock v:ext="edit" aspectratio="t"/>
@@ -15287,7 +16952,7 @@
         <w:pStyle w:val="PargrafodaLista"/>
         <w:numPr>
           <w:ilvl w:val="0"/>
-          <w:numId w:val="37"/>
+          <w:numId w:val="36"/>
         </w:numPr>
         <w:spacing w:after="0" w:line="240" w:lineRule="auto"/>
         <w:rPr>
@@ -15304,6 +16969,7 @@
           <w:szCs w:val="24"/>
           <w:lang w:eastAsia="pt-BR"/>
         </w:rPr>
+        <w:lastRenderedPageBreak/>
         <w:t>Organização</w:t>
       </w:r>
       <w:r>
@@ -15332,7 +16998,7 @@
         <w:pStyle w:val="PargrafodaLista"/>
         <w:numPr>
           <w:ilvl w:val="0"/>
-          <w:numId w:val="37"/>
+          <w:numId w:val="36"/>
         </w:numPr>
         <w:spacing w:after="0" w:line="240" w:lineRule="auto"/>
         <w:rPr>
@@ -15349,7 +17015,6 @@
           <w:szCs w:val="24"/>
           <w:lang w:eastAsia="pt-BR"/>
         </w:rPr>
-        <w:lastRenderedPageBreak/>
         <w:t>Divisão</w:t>
       </w:r>
       <w:r>
@@ -15378,7 +17043,7 @@
         <w:pStyle w:val="NormalWeb"/>
         <w:numPr>
           <w:ilvl w:val="0"/>
-          <w:numId w:val="37"/>
+          <w:numId w:val="36"/>
         </w:numPr>
         <w:rPr>
           <w:rFonts w:ascii="Arial" w:hAnsi="Arial" w:cs="Arial"/>
@@ -15427,7 +17092,7 @@
         <w:pStyle w:val="PargrafodaLista"/>
         <w:numPr>
           <w:ilvl w:val="0"/>
-          <w:numId w:val="37"/>
+          <w:numId w:val="36"/>
         </w:numPr>
         <w:spacing w:after="0" w:line="240" w:lineRule="auto"/>
         <w:rPr>
@@ -15472,7 +17137,7 @@
         <w:pStyle w:val="PargrafodaLista"/>
         <w:numPr>
           <w:ilvl w:val="0"/>
-          <w:numId w:val="37"/>
+          <w:numId w:val="36"/>
         </w:numPr>
         <w:spacing w:after="0" w:line="240" w:lineRule="auto"/>
         <w:rPr>
@@ -15517,7 +17182,7 @@
         <w:pStyle w:val="NormalWeb"/>
         <w:numPr>
           <w:ilvl w:val="0"/>
-          <w:numId w:val="37"/>
+          <w:numId w:val="36"/>
         </w:numPr>
         <w:rPr>
           <w:rFonts w:ascii="Arial" w:hAnsi="Arial" w:cs="Arial"/>
@@ -15566,7 +17231,7 @@
         <w:pStyle w:val="PargrafodaLista"/>
         <w:numPr>
           <w:ilvl w:val="0"/>
-          <w:numId w:val="37"/>
+          <w:numId w:val="36"/>
         </w:numPr>
         <w:spacing w:after="0" w:line="240" w:lineRule="auto"/>
         <w:rPr>
@@ -15611,7 +17276,7 @@
         <w:pStyle w:val="PargrafodaLista"/>
         <w:numPr>
           <w:ilvl w:val="0"/>
-          <w:numId w:val="37"/>
+          <w:numId w:val="36"/>
         </w:numPr>
         <w:spacing w:after="0" w:line="240" w:lineRule="auto"/>
         <w:rPr>
@@ -15656,7 +17321,7 @@
         <w:pStyle w:val="PargrafodaLista"/>
         <w:numPr>
           <w:ilvl w:val="0"/>
-          <w:numId w:val="37"/>
+          <w:numId w:val="36"/>
         </w:numPr>
         <w:spacing w:after="0" w:line="240" w:lineRule="auto"/>
         <w:rPr>
@@ -15701,7 +17366,7 @@
         <w:pStyle w:val="NormalWeb"/>
         <w:numPr>
           <w:ilvl w:val="0"/>
-          <w:numId w:val="37"/>
+          <w:numId w:val="36"/>
         </w:numPr>
         <w:rPr>
           <w:rFonts w:ascii="Arial" w:hAnsi="Arial" w:cs="Arial"/>
@@ -15761,7 +17426,7 @@
           <w:szCs w:val="24"/>
         </w:rPr>
       </w:pPr>
-      <w:bookmarkStart w:id="22" w:name="_Toc14160061"/>
+      <w:bookmarkStart w:id="23" w:name="_Toc14160061"/>
       <w:r>
         <w:rPr>
           <w:rFonts w:ascii="Arial" w:hAnsi="Arial" w:cs="Arial"/>
@@ -15771,7 +17436,7 @@
         </w:rPr>
         <w:t>Modelo de Dados</w:t>
       </w:r>
-      <w:bookmarkEnd w:id="22"/>
+      <w:bookmarkEnd w:id="23"/>
     </w:p>
     <w:p>
       <w:pPr>
@@ -15809,7 +17474,7 @@
           <w:szCs w:val="24"/>
         </w:rPr>
       </w:pPr>
-      <w:bookmarkStart w:id="23" w:name="_Toc14160062"/>
+      <w:bookmarkStart w:id="24" w:name="_Toc14160062"/>
       <w:r>
         <w:rPr>
           <w:rFonts w:ascii="Arial" w:hAnsi="Arial" w:cs="Arial"/>
@@ -15822,7 +17487,7 @@
         <w:lastRenderedPageBreak/>
         <w:t>Diagrama de Entidade e Relacionamento</w:t>
       </w:r>
-      <w:bookmarkEnd w:id="23"/>
+      <w:bookmarkEnd w:id="24"/>
     </w:p>
     <w:p>
       <w:pPr>
@@ -15897,7 +17562,7 @@
           <w:szCs w:val="24"/>
         </w:rPr>
       </w:pPr>
-      <w:bookmarkStart w:id="24" w:name="_Toc14160063"/>
+      <w:bookmarkStart w:id="25" w:name="_Toc14160063"/>
       <w:r>
         <w:rPr>
           <w:rFonts w:ascii="Arial" w:hAnsi="Arial" w:cs="Arial"/>
@@ -15909,7 +17574,7 @@
         </w:rPr>
         <w:t>Modelo lógico do banco de dados</w:t>
       </w:r>
-      <w:bookmarkEnd w:id="24"/>
+      <w:bookmarkEnd w:id="25"/>
       <w:r>
         <w:rPr>
           <w:rFonts w:ascii="Arial" w:hAnsi="Arial" w:cs="Arial"/>
@@ -15995,7 +17660,7 @@
           <w:szCs w:val="24"/>
         </w:rPr>
       </w:pPr>
-      <w:bookmarkStart w:id="25" w:name="_Toc14160064"/>
+      <w:bookmarkStart w:id="26" w:name="_Toc14160064"/>
       <w:r>
         <w:rPr>
           <w:rFonts w:ascii="Arial" w:hAnsi="Arial" w:cs="Arial"/>
@@ -16007,7 +17672,7 @@
         <w:lastRenderedPageBreak/>
         <w:t>Dicionário de dados</w:t>
       </w:r>
-      <w:bookmarkEnd w:id="25"/>
+      <w:bookmarkEnd w:id="26"/>
       <w:r>
         <w:rPr>
           <w:rFonts w:ascii="Arial" w:hAnsi="Arial" w:cs="Arial"/>
@@ -16082,7 +17747,7 @@
           <w:lang w:val="en-US"/>
         </w:rPr>
       </w:pPr>
-      <w:bookmarkStart w:id="26" w:name="_Toc14160065"/>
+      <w:bookmarkStart w:id="27" w:name="_Toc14160065"/>
       <w:r>
         <w:rPr>
           <w:rFonts w:ascii="Arial" w:hAnsi="Arial" w:cs="Arial"/>
@@ -16094,7 +17759,7 @@
         <w:lastRenderedPageBreak/>
         <w:t>PRINCIPAIS TELAS DO SISTEMA</w:t>
       </w:r>
-      <w:bookmarkEnd w:id="26"/>
+      <w:bookmarkEnd w:id="27"/>
     </w:p>
     <w:p>
       <w:pPr>
@@ -16878,7 +18543,7 @@
           <w:szCs w:val="24"/>
         </w:rPr>
       </w:pPr>
-      <w:bookmarkStart w:id="27" w:name="_Toc14160066"/>
+      <w:bookmarkStart w:id="28" w:name="_Toc14160066"/>
       <w:r>
         <w:rPr>
           <w:rFonts w:ascii="Arial" w:hAnsi="Arial" w:cs="Arial"/>
@@ -16888,7 +18553,7 @@
         </w:rPr>
         <w:t>CONCLUSÃO</w:t>
       </w:r>
-      <w:bookmarkEnd w:id="27"/>
+      <w:bookmarkEnd w:id="28"/>
     </w:p>
     <w:p>
       <w:pPr>
@@ -16906,8 +18571,8 @@
           <w:szCs w:val="24"/>
         </w:rPr>
       </w:pPr>
-      <w:bookmarkStart w:id="28" w:name="_Toc14160067"/>
-      <w:bookmarkStart w:id="29" w:name="_Toc90215145"/>
+      <w:bookmarkStart w:id="29" w:name="_Toc14160067"/>
+      <w:bookmarkStart w:id="30" w:name="_Toc90215145"/>
       <w:r>
         <w:rPr>
           <w:rFonts w:ascii="Arial" w:hAnsi="Arial" w:cs="Arial"/>
@@ -16917,7 +18582,7 @@
         </w:rPr>
         <w:t>Escreva os resultados obtidos</w:t>
       </w:r>
-      <w:bookmarkEnd w:id="28"/>
+      <w:bookmarkEnd w:id="29"/>
     </w:p>
     <w:p>
       <w:pPr>
@@ -16962,7 +18627,7 @@
           <w:szCs w:val="24"/>
         </w:rPr>
       </w:pPr>
-      <w:bookmarkStart w:id="30" w:name="_Toc14160068"/>
+      <w:bookmarkStart w:id="31" w:name="_Toc14160068"/>
       <w:r>
         <w:rPr>
           <w:rFonts w:ascii="Arial" w:hAnsi="Arial" w:cs="Arial"/>
@@ -16972,9 +18637,9 @@
         </w:rPr>
         <w:t>Constatações</w:t>
       </w:r>
-      <w:bookmarkStart w:id="31" w:name="_Toc90215144"/>
-      <w:bookmarkEnd w:id="29"/>
+      <w:bookmarkStart w:id="32" w:name="_Toc90215144"/>
       <w:bookmarkEnd w:id="30"/>
+      <w:bookmarkEnd w:id="31"/>
       <w:r>
         <w:rPr>
           <w:rFonts w:ascii="Arial" w:hAnsi="Arial" w:cs="Arial"/>
@@ -16985,7 +18650,7 @@
         <w:t xml:space="preserve"> </w:t>
       </w:r>
     </w:p>
-    <w:bookmarkEnd w:id="31"/>
+    <w:bookmarkEnd w:id="32"/>
     <w:p>
       <w:pPr>
         <w:spacing w:line="360" w:lineRule="auto"/>
@@ -17021,8 +18686,8 @@
           <w:szCs w:val="24"/>
         </w:rPr>
       </w:pPr>
-      <w:bookmarkStart w:id="32" w:name="_Toc90215146"/>
-      <w:bookmarkStart w:id="33" w:name="_Toc14160069"/>
+      <w:bookmarkStart w:id="33" w:name="_Toc90215146"/>
+      <w:bookmarkStart w:id="34" w:name="_Toc14160069"/>
       <w:r>
         <w:rPr>
           <w:rFonts w:ascii="Arial" w:hAnsi="Arial" w:cs="Arial"/>
@@ -17041,8 +18706,8 @@
         </w:rPr>
         <w:t>ugestões de possíveis aperfeiçoamentos técnicos</w:t>
       </w:r>
-      <w:bookmarkEnd w:id="32"/>
       <w:bookmarkEnd w:id="33"/>
+      <w:bookmarkEnd w:id="34"/>
       <w:r>
         <w:rPr>
           <w:rFonts w:ascii="Arial" w:hAnsi="Arial" w:cs="Arial"/>
@@ -17119,7 +18784,7 @@
           <w:szCs w:val="24"/>
         </w:rPr>
       </w:pPr>
-      <w:bookmarkStart w:id="34" w:name="_Toc14160070"/>
+      <w:bookmarkStart w:id="35" w:name="_Toc14160070"/>
       <w:r>
         <w:rPr>
           <w:rFonts w:ascii="Arial" w:hAnsi="Arial" w:cs="Arial"/>
@@ -17130,7 +18795,7 @@
         <w:lastRenderedPageBreak/>
         <w:t>REFERÊNCIAS</w:t>
       </w:r>
-      <w:bookmarkEnd w:id="34"/>
+      <w:bookmarkEnd w:id="35"/>
     </w:p>
     <w:p>
       <w:pPr>
@@ -17184,7 +18849,7 @@
           <w:szCs w:val="24"/>
         </w:rPr>
       </w:pPr>
-      <w:bookmarkStart w:id="35" w:name="_Toc14160071"/>
+      <w:bookmarkStart w:id="36" w:name="_Toc14160071"/>
       <w:r>
         <w:rPr>
           <w:rFonts w:ascii="Arial" w:hAnsi="Arial" w:cs="Arial"/>
@@ -17195,7 +18860,7 @@
         <w:lastRenderedPageBreak/>
         <w:t>GLOSSÁRIO</w:t>
       </w:r>
-      <w:bookmarkEnd w:id="35"/>
+      <w:bookmarkEnd w:id="36"/>
     </w:p>
     <w:p>
       <w:pPr>
@@ -17245,7 +18910,7 @@
           <w:szCs w:val="24"/>
         </w:rPr>
       </w:pPr>
-      <w:bookmarkStart w:id="36" w:name="_Toc14160072"/>
+      <w:bookmarkStart w:id="37" w:name="_Toc14160072"/>
       <w:r>
         <w:rPr>
           <w:rFonts w:ascii="Arial" w:hAnsi="Arial" w:cs="Arial"/>
@@ -17256,7 +18921,7 @@
         <w:lastRenderedPageBreak/>
         <w:t>ANEXOS</w:t>
       </w:r>
-      <w:bookmarkEnd w:id="36"/>
+      <w:bookmarkEnd w:id="37"/>
     </w:p>
     <w:p>
       <w:pPr>
@@ -17379,7 +19044,7 @@
 </file>
 
 <file path=word/endnotes.xml><?xml version="1.0" encoding="utf-8"?>
-<w:endnotes xmlns:wpc="http://schemas.microsoft.com/office/word/2010/wordprocessingCanvas" xmlns:cx="http://schemas.microsoft.com/office/drawing/2014/chartex" xmlns:cx1="http://schemas.microsoft.com/office/drawing/2015/9/8/chartex" xmlns:cx2="http://schemas.microsoft.com/office/drawing/2015/10/21/chartex" xmlns:cx3="http://schemas.microsoft.com/office/drawing/2016/5/9/chartex" xmlns:cx4="http://schemas.microsoft.com/office/drawing/2016/5/10/chartex" xmlns:cx5="http://schemas.microsoft.com/office/drawing/2016/5/11/chartex" xmlns:cx6="http://schemas.microsoft.com/office/drawing/2016/5/12/chartex" xmlns:cx7="http://schemas.microsoft.com/office/drawing/2016/5/13/chartex" xmlns:cx8="http://schemas.microsoft.com/office/drawing/2016/5/14/chartex" xmlns:mc="http://schemas.openxmlformats.org/markup-compatibility/2006" xmlns:aink="http://schemas.microsoft.com/office/drawing/2016/ink" xmlns:am3d="http://schemas.microsoft.com/office/drawing/2017/model3d" xmlns:o="urn:schemas-microsoft-com:office:office" xmlns:oel="http://schemas.microsoft.com/office/2019/extlst" xmlns:r="http://schemas.openxmlformats.org/officeDocument/2006/relationships" xmlns:m="http://schemas.openxmlformats.org/officeDocument/2006/math" xmlns:v="urn:schemas-microsoft-com:vml" xmlns:wp14="http://schemas.microsoft.com/office/word/2010/wordprocessingDrawing" xmlns:wp="http://schemas.openxmlformats.org/drawingml/2006/wordprocessingDrawing" xmlns:w10="urn:schemas-microsoft-com:office:word" xmlns:w="http://schemas.openxmlformats.org/wordprocessingml/2006/main" xmlns:w14="http://schemas.microsoft.com/office/word/2010/wordml" xmlns:w15="http://schemas.microsoft.com/office/word/2012/wordml" xmlns:w16cex="http://schemas.microsoft.com/office/word/2018/wordml/cex" xmlns:w16cid="http://schemas.microsoft.com/office/word/2016/wordml/cid" xmlns:w16="http://schemas.microsoft.com/office/word/2018/wordml" xmlns:w16du="http://schemas.microsoft.com/office/word/2023/wordml/word16du" xmlns:w16sdtdh="http://schemas.microsoft.com/office/word/2020/wordml/sdtdatahash" xmlns:w16se="http://schemas.microsoft.com/office/word/2015/wordml/symex" xmlns:wpg="http://schemas.microsoft.com/office/word/2010/wordprocessingGroup" xmlns:wpi="http://schemas.microsoft.com/office/word/2010/wordprocessingInk" xmlns:wne="http://schemas.microsoft.com/office/word/2006/wordml" xmlns:wps="http://schemas.microsoft.com/office/word/2010/wordprocessingShape" mc:Ignorable="w14 w15 w16se w16cid w16 w16cex w16sdtdh w16du wp14">
+<w:endnotes xmlns:wpc="http://schemas.microsoft.com/office/word/2010/wordprocessingCanvas" xmlns:cx="http://schemas.microsoft.com/office/drawing/2014/chartex" xmlns:cx1="http://schemas.microsoft.com/office/drawing/2015/9/8/chartex" xmlns:cx2="http://schemas.microsoft.com/office/drawing/2015/10/21/chartex" xmlns:cx3="http://schemas.microsoft.com/office/drawing/2016/5/9/chartex" xmlns:cx4="http://schemas.microsoft.com/office/drawing/2016/5/10/chartex" xmlns:cx5="http://schemas.microsoft.com/office/drawing/2016/5/11/chartex" xmlns:cx6="http://schemas.microsoft.com/office/drawing/2016/5/12/chartex" xmlns:cx7="http://schemas.microsoft.com/office/drawing/2016/5/13/chartex" xmlns:cx8="http://schemas.microsoft.com/office/drawing/2016/5/14/chartex" xmlns:mc="http://schemas.openxmlformats.org/markup-compatibility/2006" xmlns:aink="http://schemas.microsoft.com/office/drawing/2016/ink" xmlns:am3d="http://schemas.microsoft.com/office/drawing/2017/model3d" xmlns:o="urn:schemas-microsoft-com:office:office" xmlns:r="http://schemas.openxmlformats.org/officeDocument/2006/relationships" xmlns:m="http://schemas.openxmlformats.org/officeDocument/2006/math" xmlns:v="urn:schemas-microsoft-com:vml" xmlns:wp14="http://schemas.microsoft.com/office/word/2010/wordprocessingDrawing" xmlns:wp="http://schemas.openxmlformats.org/drawingml/2006/wordprocessingDrawing" xmlns:w10="urn:schemas-microsoft-com:office:word" xmlns:w="http://schemas.openxmlformats.org/wordprocessingml/2006/main" xmlns:w14="http://schemas.microsoft.com/office/word/2010/wordml" xmlns:w15="http://schemas.microsoft.com/office/word/2012/wordml" xmlns:w16cid="http://schemas.microsoft.com/office/word/2016/wordml/cid" xmlns:w16se="http://schemas.microsoft.com/office/word/2015/wordml/symex" xmlns:wpg="http://schemas.microsoft.com/office/word/2010/wordprocessingGroup" xmlns:wpi="http://schemas.microsoft.com/office/word/2010/wordprocessingInk" xmlns:wne="http://schemas.microsoft.com/office/word/2006/wordml" xmlns:wps="http://schemas.microsoft.com/office/word/2010/wordprocessingShape" mc:Ignorable="w14 w15 w16se w16cid wp14">
   <w:endnote w:type="separator" w:id="-1">
     <w:p>
       <w:pPr>
@@ -17404,7 +19069,7 @@
 </file>
 
 <file path=word/footer1.xml><?xml version="1.0" encoding="utf-8"?>
-<w:ftr xmlns:wpc="http://schemas.microsoft.com/office/word/2010/wordprocessingCanvas" xmlns:cx="http://schemas.microsoft.com/office/drawing/2014/chartex" xmlns:cx1="http://schemas.microsoft.com/office/drawing/2015/9/8/chartex" xmlns:cx2="http://schemas.microsoft.com/office/drawing/2015/10/21/chartex" xmlns:cx3="http://schemas.microsoft.com/office/drawing/2016/5/9/chartex" xmlns:cx4="http://schemas.microsoft.com/office/drawing/2016/5/10/chartex" xmlns:cx5="http://schemas.microsoft.com/office/drawing/2016/5/11/chartex" xmlns:cx6="http://schemas.microsoft.com/office/drawing/2016/5/12/chartex" xmlns:cx7="http://schemas.microsoft.com/office/drawing/2016/5/13/chartex" xmlns:cx8="http://schemas.microsoft.com/office/drawing/2016/5/14/chartex" xmlns:mc="http://schemas.openxmlformats.org/markup-compatibility/2006" xmlns:aink="http://schemas.microsoft.com/office/drawing/2016/ink" xmlns:am3d="http://schemas.microsoft.com/office/drawing/2017/model3d" xmlns:o="urn:schemas-microsoft-com:office:office" xmlns:oel="http://schemas.microsoft.com/office/2019/extlst" xmlns:r="http://schemas.openxmlformats.org/officeDocument/2006/relationships" xmlns:m="http://schemas.openxmlformats.org/officeDocument/2006/math" xmlns:v="urn:schemas-microsoft-com:vml" xmlns:wp14="http://schemas.microsoft.com/office/word/2010/wordprocessingDrawing" xmlns:wp="http://schemas.openxmlformats.org/drawingml/2006/wordprocessingDrawing" xmlns:w10="urn:schemas-microsoft-com:office:word" xmlns:w="http://schemas.openxmlformats.org/wordprocessingml/2006/main" xmlns:w14="http://schemas.microsoft.com/office/word/2010/wordml" xmlns:w15="http://schemas.microsoft.com/office/word/2012/wordml" xmlns:w16cex="http://schemas.microsoft.com/office/word/2018/wordml/cex" xmlns:w16cid="http://schemas.microsoft.com/office/word/2016/wordml/cid" xmlns:w16="http://schemas.microsoft.com/office/word/2018/wordml" xmlns:w16du="http://schemas.microsoft.com/office/word/2023/wordml/word16du" xmlns:w16sdtdh="http://schemas.microsoft.com/office/word/2020/wordml/sdtdatahash" xmlns:w16se="http://schemas.microsoft.com/office/word/2015/wordml/symex" xmlns:wpg="http://schemas.microsoft.com/office/word/2010/wordprocessingGroup" xmlns:wpi="http://schemas.microsoft.com/office/word/2010/wordprocessingInk" xmlns:wne="http://schemas.microsoft.com/office/word/2006/wordml" xmlns:wps="http://schemas.microsoft.com/office/word/2010/wordprocessingShape" mc:Ignorable="w14 w15 w16se w16cid w16 w16cex w16sdtdh w16du wp14">
+<w:ftr xmlns:wpc="http://schemas.microsoft.com/office/word/2010/wordprocessingCanvas" xmlns:cx="http://schemas.microsoft.com/office/drawing/2014/chartex" xmlns:cx1="http://schemas.microsoft.com/office/drawing/2015/9/8/chartex" xmlns:cx2="http://schemas.microsoft.com/office/drawing/2015/10/21/chartex" xmlns:cx3="http://schemas.microsoft.com/office/drawing/2016/5/9/chartex" xmlns:cx4="http://schemas.microsoft.com/office/drawing/2016/5/10/chartex" xmlns:cx5="http://schemas.microsoft.com/office/drawing/2016/5/11/chartex" xmlns:cx6="http://schemas.microsoft.com/office/drawing/2016/5/12/chartex" xmlns:cx7="http://schemas.microsoft.com/office/drawing/2016/5/13/chartex" xmlns:cx8="http://schemas.microsoft.com/office/drawing/2016/5/14/chartex" xmlns:mc="http://schemas.openxmlformats.org/markup-compatibility/2006" xmlns:aink="http://schemas.microsoft.com/office/drawing/2016/ink" xmlns:am3d="http://schemas.microsoft.com/office/drawing/2017/model3d" xmlns:o="urn:schemas-microsoft-com:office:office" xmlns:r="http://schemas.openxmlformats.org/officeDocument/2006/relationships" xmlns:m="http://schemas.openxmlformats.org/officeDocument/2006/math" xmlns:v="urn:schemas-microsoft-com:vml" xmlns:wp14="http://schemas.microsoft.com/office/word/2010/wordprocessingDrawing" xmlns:wp="http://schemas.openxmlformats.org/drawingml/2006/wordprocessingDrawing" xmlns:w10="urn:schemas-microsoft-com:office:word" xmlns:w="http://schemas.openxmlformats.org/wordprocessingml/2006/main" xmlns:w14="http://schemas.microsoft.com/office/word/2010/wordml" xmlns:w15="http://schemas.microsoft.com/office/word/2012/wordml" xmlns:w16cid="http://schemas.microsoft.com/office/word/2016/wordml/cid" xmlns:w16se="http://schemas.microsoft.com/office/word/2015/wordml/symex" xmlns:wpg="http://schemas.microsoft.com/office/word/2010/wordprocessingGroup" xmlns:wpi="http://schemas.microsoft.com/office/word/2010/wordprocessingInk" xmlns:wne="http://schemas.microsoft.com/office/word/2006/wordml" xmlns:wps="http://schemas.microsoft.com/office/word/2010/wordprocessingShape" mc:Ignorable="w14 w15 w16se w16cid wp14">
   <w:p>
     <w:pPr>
       <w:pStyle w:val="Rodap"/>
@@ -17420,7 +19085,7 @@
 </file>
 
 <file path=word/footer2.xml><?xml version="1.0" encoding="utf-8"?>
-<w:ftr xmlns:wpc="http://schemas.microsoft.com/office/word/2010/wordprocessingCanvas" xmlns:cx="http://schemas.microsoft.com/office/drawing/2014/chartex" xmlns:cx1="http://schemas.microsoft.com/office/drawing/2015/9/8/chartex" xmlns:cx2="http://schemas.microsoft.com/office/drawing/2015/10/21/chartex" xmlns:cx3="http://schemas.microsoft.com/office/drawing/2016/5/9/chartex" xmlns:cx4="http://schemas.microsoft.com/office/drawing/2016/5/10/chartex" xmlns:cx5="http://schemas.microsoft.com/office/drawing/2016/5/11/chartex" xmlns:cx6="http://schemas.microsoft.com/office/drawing/2016/5/12/chartex" xmlns:cx7="http://schemas.microsoft.com/office/drawing/2016/5/13/chartex" xmlns:cx8="http://schemas.microsoft.com/office/drawing/2016/5/14/chartex" xmlns:mc="http://schemas.openxmlformats.org/markup-compatibility/2006" xmlns:aink="http://schemas.microsoft.com/office/drawing/2016/ink" xmlns:am3d="http://schemas.microsoft.com/office/drawing/2017/model3d" xmlns:o="urn:schemas-microsoft-com:office:office" xmlns:oel="http://schemas.microsoft.com/office/2019/extlst" xmlns:r="http://schemas.openxmlformats.org/officeDocument/2006/relationships" xmlns:m="http://schemas.openxmlformats.org/officeDocument/2006/math" xmlns:v="urn:schemas-microsoft-com:vml" xmlns:wp14="http://schemas.microsoft.com/office/word/2010/wordprocessingDrawing" xmlns:wp="http://schemas.openxmlformats.org/drawingml/2006/wordprocessingDrawing" xmlns:w10="urn:schemas-microsoft-com:office:word" xmlns:w="http://schemas.openxmlformats.org/wordprocessingml/2006/main" xmlns:w14="http://schemas.microsoft.com/office/word/2010/wordml" xmlns:w15="http://schemas.microsoft.com/office/word/2012/wordml" xmlns:w16cex="http://schemas.microsoft.com/office/word/2018/wordml/cex" xmlns:w16cid="http://schemas.microsoft.com/office/word/2016/wordml/cid" xmlns:w16="http://schemas.microsoft.com/office/word/2018/wordml" xmlns:w16du="http://schemas.microsoft.com/office/word/2023/wordml/word16du" xmlns:w16sdtdh="http://schemas.microsoft.com/office/word/2020/wordml/sdtdatahash" xmlns:w16se="http://schemas.microsoft.com/office/word/2015/wordml/symex" xmlns:wpg="http://schemas.microsoft.com/office/word/2010/wordprocessingGroup" xmlns:wpi="http://schemas.microsoft.com/office/word/2010/wordprocessingInk" xmlns:wne="http://schemas.microsoft.com/office/word/2006/wordml" xmlns:wps="http://schemas.microsoft.com/office/word/2010/wordprocessingShape" mc:Ignorable="w14 w15 w16se w16cid w16 w16cex w16sdtdh w16du wp14">
+<w:ftr xmlns:wpc="http://schemas.microsoft.com/office/word/2010/wordprocessingCanvas" xmlns:cx="http://schemas.microsoft.com/office/drawing/2014/chartex" xmlns:cx1="http://schemas.microsoft.com/office/drawing/2015/9/8/chartex" xmlns:cx2="http://schemas.microsoft.com/office/drawing/2015/10/21/chartex" xmlns:cx3="http://schemas.microsoft.com/office/drawing/2016/5/9/chartex" xmlns:cx4="http://schemas.microsoft.com/office/drawing/2016/5/10/chartex" xmlns:cx5="http://schemas.microsoft.com/office/drawing/2016/5/11/chartex" xmlns:cx6="http://schemas.microsoft.com/office/drawing/2016/5/12/chartex" xmlns:cx7="http://schemas.microsoft.com/office/drawing/2016/5/13/chartex" xmlns:cx8="http://schemas.microsoft.com/office/drawing/2016/5/14/chartex" xmlns:mc="http://schemas.openxmlformats.org/markup-compatibility/2006" xmlns:aink="http://schemas.microsoft.com/office/drawing/2016/ink" xmlns:am3d="http://schemas.microsoft.com/office/drawing/2017/model3d" xmlns:o="urn:schemas-microsoft-com:office:office" xmlns:r="http://schemas.openxmlformats.org/officeDocument/2006/relationships" xmlns:m="http://schemas.openxmlformats.org/officeDocument/2006/math" xmlns:v="urn:schemas-microsoft-com:vml" xmlns:wp14="http://schemas.microsoft.com/office/word/2010/wordprocessingDrawing" xmlns:wp="http://schemas.openxmlformats.org/drawingml/2006/wordprocessingDrawing" xmlns:w10="urn:schemas-microsoft-com:office:word" xmlns:w="http://schemas.openxmlformats.org/wordprocessingml/2006/main" xmlns:w14="http://schemas.microsoft.com/office/word/2010/wordml" xmlns:w15="http://schemas.microsoft.com/office/word/2012/wordml" xmlns:w16cid="http://schemas.microsoft.com/office/word/2016/wordml/cid" xmlns:w16se="http://schemas.microsoft.com/office/word/2015/wordml/symex" xmlns:wpg="http://schemas.microsoft.com/office/word/2010/wordprocessingGroup" xmlns:wpi="http://schemas.microsoft.com/office/word/2010/wordprocessingInk" xmlns:wne="http://schemas.microsoft.com/office/word/2006/wordml" xmlns:wps="http://schemas.microsoft.com/office/word/2010/wordprocessingShape" mc:Ignorable="w14 w15 w16se w16cid wp14">
   <w:p>
     <w:pPr>
       <w:pStyle w:val="Rodap"/>
@@ -17436,7 +19101,7 @@
 </file>
 
 <file path=word/footnotes.xml><?xml version="1.0" encoding="utf-8"?>
-<w:footnotes xmlns:wpc="http://schemas.microsoft.com/office/word/2010/wordprocessingCanvas" xmlns:cx="http://schemas.microsoft.com/office/drawing/2014/chartex" xmlns:cx1="http://schemas.microsoft.com/office/drawing/2015/9/8/chartex" xmlns:cx2="http://schemas.microsoft.com/office/drawing/2015/10/21/chartex" xmlns:cx3="http://schemas.microsoft.com/office/drawing/2016/5/9/chartex" xmlns:cx4="http://schemas.microsoft.com/office/drawing/2016/5/10/chartex" xmlns:cx5="http://schemas.microsoft.com/office/drawing/2016/5/11/chartex" xmlns:cx6="http://schemas.microsoft.com/office/drawing/2016/5/12/chartex" xmlns:cx7="http://schemas.microsoft.com/office/drawing/2016/5/13/chartex" xmlns:cx8="http://schemas.microsoft.com/office/drawing/2016/5/14/chartex" xmlns:mc="http://schemas.openxmlformats.org/markup-compatibility/2006" xmlns:aink="http://schemas.microsoft.com/office/drawing/2016/ink" xmlns:am3d="http://schemas.microsoft.com/office/drawing/2017/model3d" xmlns:o="urn:schemas-microsoft-com:office:office" xmlns:oel="http://schemas.microsoft.com/office/2019/extlst" xmlns:r="http://schemas.openxmlformats.org/officeDocument/2006/relationships" xmlns:m="http://schemas.openxmlformats.org/officeDocument/2006/math" xmlns:v="urn:schemas-microsoft-com:vml" xmlns:wp14="http://schemas.microsoft.com/office/word/2010/wordprocessingDrawing" xmlns:wp="http://schemas.openxmlformats.org/drawingml/2006/wordprocessingDrawing" xmlns:w10="urn:schemas-microsoft-com:office:word" xmlns:w="http://schemas.openxmlformats.org/wordprocessingml/2006/main" xmlns:w14="http://schemas.microsoft.com/office/word/2010/wordml" xmlns:w15="http://schemas.microsoft.com/office/word/2012/wordml" xmlns:w16cex="http://schemas.microsoft.com/office/word/2018/wordml/cex" xmlns:w16cid="http://schemas.microsoft.com/office/word/2016/wordml/cid" xmlns:w16="http://schemas.microsoft.com/office/word/2018/wordml" xmlns:w16du="http://schemas.microsoft.com/office/word/2023/wordml/word16du" xmlns:w16sdtdh="http://schemas.microsoft.com/office/word/2020/wordml/sdtdatahash" xmlns:w16se="http://schemas.microsoft.com/office/word/2015/wordml/symex" xmlns:wpg="http://schemas.microsoft.com/office/word/2010/wordprocessingGroup" xmlns:wpi="http://schemas.microsoft.com/office/word/2010/wordprocessingInk" xmlns:wne="http://schemas.microsoft.com/office/word/2006/wordml" xmlns:wps="http://schemas.microsoft.com/office/word/2010/wordprocessingShape" mc:Ignorable="w14 w15 w16se w16cid w16 w16cex w16sdtdh w16du wp14">
+<w:footnotes xmlns:wpc="http://schemas.microsoft.com/office/word/2010/wordprocessingCanvas" xmlns:cx="http://schemas.microsoft.com/office/drawing/2014/chartex" xmlns:cx1="http://schemas.microsoft.com/office/drawing/2015/9/8/chartex" xmlns:cx2="http://schemas.microsoft.com/office/drawing/2015/10/21/chartex" xmlns:cx3="http://schemas.microsoft.com/office/drawing/2016/5/9/chartex" xmlns:cx4="http://schemas.microsoft.com/office/drawing/2016/5/10/chartex" xmlns:cx5="http://schemas.microsoft.com/office/drawing/2016/5/11/chartex" xmlns:cx6="http://schemas.microsoft.com/office/drawing/2016/5/12/chartex" xmlns:cx7="http://schemas.microsoft.com/office/drawing/2016/5/13/chartex" xmlns:cx8="http://schemas.microsoft.com/office/drawing/2016/5/14/chartex" xmlns:mc="http://schemas.openxmlformats.org/markup-compatibility/2006" xmlns:aink="http://schemas.microsoft.com/office/drawing/2016/ink" xmlns:am3d="http://schemas.microsoft.com/office/drawing/2017/model3d" xmlns:o="urn:schemas-microsoft-com:office:office" xmlns:r="http://schemas.openxmlformats.org/officeDocument/2006/relationships" xmlns:m="http://schemas.openxmlformats.org/officeDocument/2006/math" xmlns:v="urn:schemas-microsoft-com:vml" xmlns:wp14="http://schemas.microsoft.com/office/word/2010/wordprocessingDrawing" xmlns:wp="http://schemas.openxmlformats.org/drawingml/2006/wordprocessingDrawing" xmlns:w10="urn:schemas-microsoft-com:office:word" xmlns:w="http://schemas.openxmlformats.org/wordprocessingml/2006/main" xmlns:w14="http://schemas.microsoft.com/office/word/2010/wordml" xmlns:w15="http://schemas.microsoft.com/office/word/2012/wordml" xmlns:w16cid="http://schemas.microsoft.com/office/word/2016/wordml/cid" xmlns:w16se="http://schemas.microsoft.com/office/word/2015/wordml/symex" xmlns:wpg="http://schemas.microsoft.com/office/word/2010/wordprocessingGroup" xmlns:wpi="http://schemas.microsoft.com/office/word/2010/wordprocessingInk" xmlns:wne="http://schemas.microsoft.com/office/word/2006/wordml" xmlns:wps="http://schemas.microsoft.com/office/word/2010/wordprocessingShape" mc:Ignorable="w14 w15 w16se w16cid wp14">
   <w:footnote w:type="separator" w:id="-1">
     <w:p>
       <w:pPr>
@@ -17461,7 +19126,7 @@
 </file>
 
 <file path=word/header1.xml><?xml version="1.0" encoding="utf-8"?>
-<w:hdr xmlns:wpc="http://schemas.microsoft.com/office/word/2010/wordprocessingCanvas" xmlns:cx="http://schemas.microsoft.com/office/drawing/2014/chartex" xmlns:cx1="http://schemas.microsoft.com/office/drawing/2015/9/8/chartex" xmlns:cx2="http://schemas.microsoft.com/office/drawing/2015/10/21/chartex" xmlns:cx3="http://schemas.microsoft.com/office/drawing/2016/5/9/chartex" xmlns:cx4="http://schemas.microsoft.com/office/drawing/2016/5/10/chartex" xmlns:cx5="http://schemas.microsoft.com/office/drawing/2016/5/11/chartex" xmlns:cx6="http://schemas.microsoft.com/office/drawing/2016/5/12/chartex" xmlns:cx7="http://schemas.microsoft.com/office/drawing/2016/5/13/chartex" xmlns:cx8="http://schemas.microsoft.com/office/drawing/2016/5/14/chartex" xmlns:mc="http://schemas.openxmlformats.org/markup-compatibility/2006" xmlns:aink="http://schemas.microsoft.com/office/drawing/2016/ink" xmlns:am3d="http://schemas.microsoft.com/office/drawing/2017/model3d" xmlns:o="urn:schemas-microsoft-com:office:office" xmlns:oel="http://schemas.microsoft.com/office/2019/extlst" xmlns:r="http://schemas.openxmlformats.org/officeDocument/2006/relationships" xmlns:m="http://schemas.openxmlformats.org/officeDocument/2006/math" xmlns:v="urn:schemas-microsoft-com:vml" xmlns:wp14="http://schemas.microsoft.com/office/word/2010/wordprocessingDrawing" xmlns:wp="http://schemas.openxmlformats.org/drawingml/2006/wordprocessingDrawing" xmlns:w10="urn:schemas-microsoft-com:office:word" xmlns:w="http://schemas.openxmlformats.org/wordprocessingml/2006/main" xmlns:w14="http://schemas.microsoft.com/office/word/2010/wordml" xmlns:w15="http://schemas.microsoft.com/office/word/2012/wordml" xmlns:w16cex="http://schemas.microsoft.com/office/word/2018/wordml/cex" xmlns:w16cid="http://schemas.microsoft.com/office/word/2016/wordml/cid" xmlns:w16="http://schemas.microsoft.com/office/word/2018/wordml" xmlns:w16du="http://schemas.microsoft.com/office/word/2023/wordml/word16du" xmlns:w16sdtdh="http://schemas.microsoft.com/office/word/2020/wordml/sdtdatahash" xmlns:w16se="http://schemas.microsoft.com/office/word/2015/wordml/symex" xmlns:wpg="http://schemas.microsoft.com/office/word/2010/wordprocessingGroup" xmlns:wpi="http://schemas.microsoft.com/office/word/2010/wordprocessingInk" xmlns:wne="http://schemas.microsoft.com/office/word/2006/wordml" xmlns:wps="http://schemas.microsoft.com/office/word/2010/wordprocessingShape" mc:Ignorable="w14 w15 w16se w16cid w16 w16cex w16sdtdh w16du wp14">
+<w:hdr xmlns:wpc="http://schemas.microsoft.com/office/word/2010/wordprocessingCanvas" xmlns:cx="http://schemas.microsoft.com/office/drawing/2014/chartex" xmlns:cx1="http://schemas.microsoft.com/office/drawing/2015/9/8/chartex" xmlns:cx2="http://schemas.microsoft.com/office/drawing/2015/10/21/chartex" xmlns:cx3="http://schemas.microsoft.com/office/drawing/2016/5/9/chartex" xmlns:cx4="http://schemas.microsoft.com/office/drawing/2016/5/10/chartex" xmlns:cx5="http://schemas.microsoft.com/office/drawing/2016/5/11/chartex" xmlns:cx6="http://schemas.microsoft.com/office/drawing/2016/5/12/chartex" xmlns:cx7="http://schemas.microsoft.com/office/drawing/2016/5/13/chartex" xmlns:cx8="http://schemas.microsoft.com/office/drawing/2016/5/14/chartex" xmlns:mc="http://schemas.openxmlformats.org/markup-compatibility/2006" xmlns:aink="http://schemas.microsoft.com/office/drawing/2016/ink" xmlns:am3d="http://schemas.microsoft.com/office/drawing/2017/model3d" xmlns:o="urn:schemas-microsoft-com:office:office" xmlns:r="http://schemas.openxmlformats.org/officeDocument/2006/relationships" xmlns:m="http://schemas.openxmlformats.org/officeDocument/2006/math" xmlns:v="urn:schemas-microsoft-com:vml" xmlns:wp14="http://schemas.microsoft.com/office/word/2010/wordprocessingDrawing" xmlns:wp="http://schemas.openxmlformats.org/drawingml/2006/wordprocessingDrawing" xmlns:w10="urn:schemas-microsoft-com:office:word" xmlns:w="http://schemas.openxmlformats.org/wordprocessingml/2006/main" xmlns:w14="http://schemas.microsoft.com/office/word/2010/wordml" xmlns:w15="http://schemas.microsoft.com/office/word/2012/wordml" xmlns:w16cid="http://schemas.microsoft.com/office/word/2016/wordml/cid" xmlns:w16se="http://schemas.microsoft.com/office/word/2015/wordml/symex" xmlns:wpg="http://schemas.microsoft.com/office/word/2010/wordprocessingGroup" xmlns:wpi="http://schemas.microsoft.com/office/word/2010/wordprocessingInk" xmlns:wne="http://schemas.microsoft.com/office/word/2006/wordml" xmlns:wps="http://schemas.microsoft.com/office/word/2010/wordprocessingShape" mc:Ignorable="w14 w15 w16se w16cid wp14">
   <w:p>
     <w:pPr>
       <w:pStyle w:val="Cabealho"/>
@@ -17476,7 +19141,7 @@
 </file>
 
 <file path=word/header2.xml><?xml version="1.0" encoding="utf-8"?>
-<w:hdr xmlns:wpc="http://schemas.microsoft.com/office/word/2010/wordprocessingCanvas" xmlns:cx="http://schemas.microsoft.com/office/drawing/2014/chartex" xmlns:cx1="http://schemas.microsoft.com/office/drawing/2015/9/8/chartex" xmlns:cx2="http://schemas.microsoft.com/office/drawing/2015/10/21/chartex" xmlns:cx3="http://schemas.microsoft.com/office/drawing/2016/5/9/chartex" xmlns:cx4="http://schemas.microsoft.com/office/drawing/2016/5/10/chartex" xmlns:cx5="http://schemas.microsoft.com/office/drawing/2016/5/11/chartex" xmlns:cx6="http://schemas.microsoft.com/office/drawing/2016/5/12/chartex" xmlns:cx7="http://schemas.microsoft.com/office/drawing/2016/5/13/chartex" xmlns:cx8="http://schemas.microsoft.com/office/drawing/2016/5/14/chartex" xmlns:mc="http://schemas.openxmlformats.org/markup-compatibility/2006" xmlns:aink="http://schemas.microsoft.com/office/drawing/2016/ink" xmlns:am3d="http://schemas.microsoft.com/office/drawing/2017/model3d" xmlns:o="urn:schemas-microsoft-com:office:office" xmlns:oel="http://schemas.microsoft.com/office/2019/extlst" xmlns:r="http://schemas.openxmlformats.org/officeDocument/2006/relationships" xmlns:m="http://schemas.openxmlformats.org/officeDocument/2006/math" xmlns:v="urn:schemas-microsoft-com:vml" xmlns:wp14="http://schemas.microsoft.com/office/word/2010/wordprocessingDrawing" xmlns:wp="http://schemas.openxmlformats.org/drawingml/2006/wordprocessingDrawing" xmlns:w10="urn:schemas-microsoft-com:office:word" xmlns:w="http://schemas.openxmlformats.org/wordprocessingml/2006/main" xmlns:w14="http://schemas.microsoft.com/office/word/2010/wordml" xmlns:w15="http://schemas.microsoft.com/office/word/2012/wordml" xmlns:w16cex="http://schemas.microsoft.com/office/word/2018/wordml/cex" xmlns:w16cid="http://schemas.microsoft.com/office/word/2016/wordml/cid" xmlns:w16="http://schemas.microsoft.com/office/word/2018/wordml" xmlns:w16du="http://schemas.microsoft.com/office/word/2023/wordml/word16du" xmlns:w16sdtdh="http://schemas.microsoft.com/office/word/2020/wordml/sdtdatahash" xmlns:w16se="http://schemas.microsoft.com/office/word/2015/wordml/symex" xmlns:wpg="http://schemas.microsoft.com/office/word/2010/wordprocessingGroup" xmlns:wpi="http://schemas.microsoft.com/office/word/2010/wordprocessingInk" xmlns:wne="http://schemas.microsoft.com/office/word/2006/wordml" xmlns:wps="http://schemas.microsoft.com/office/word/2010/wordprocessingShape" mc:Ignorable="w14 w15 w16se w16cid w16 w16cex w16sdtdh w16du wp14">
+<w:hdr xmlns:wpc="http://schemas.microsoft.com/office/word/2010/wordprocessingCanvas" xmlns:cx="http://schemas.microsoft.com/office/drawing/2014/chartex" xmlns:cx1="http://schemas.microsoft.com/office/drawing/2015/9/8/chartex" xmlns:cx2="http://schemas.microsoft.com/office/drawing/2015/10/21/chartex" xmlns:cx3="http://schemas.microsoft.com/office/drawing/2016/5/9/chartex" xmlns:cx4="http://schemas.microsoft.com/office/drawing/2016/5/10/chartex" xmlns:cx5="http://schemas.microsoft.com/office/drawing/2016/5/11/chartex" xmlns:cx6="http://schemas.microsoft.com/office/drawing/2016/5/12/chartex" xmlns:cx7="http://schemas.microsoft.com/office/drawing/2016/5/13/chartex" xmlns:cx8="http://schemas.microsoft.com/office/drawing/2016/5/14/chartex" xmlns:mc="http://schemas.openxmlformats.org/markup-compatibility/2006" xmlns:aink="http://schemas.microsoft.com/office/drawing/2016/ink" xmlns:am3d="http://schemas.microsoft.com/office/drawing/2017/model3d" xmlns:o="urn:schemas-microsoft-com:office:office" xmlns:r="http://schemas.openxmlformats.org/officeDocument/2006/relationships" xmlns:m="http://schemas.openxmlformats.org/officeDocument/2006/math" xmlns:v="urn:schemas-microsoft-com:vml" xmlns:wp14="http://schemas.microsoft.com/office/word/2010/wordprocessingDrawing" xmlns:wp="http://schemas.openxmlformats.org/drawingml/2006/wordprocessingDrawing" xmlns:w10="urn:schemas-microsoft-com:office:word" xmlns:w="http://schemas.openxmlformats.org/wordprocessingml/2006/main" xmlns:w14="http://schemas.microsoft.com/office/word/2010/wordml" xmlns:w15="http://schemas.microsoft.com/office/word/2012/wordml" xmlns:w16cid="http://schemas.microsoft.com/office/word/2016/wordml/cid" xmlns:w16se="http://schemas.microsoft.com/office/word/2015/wordml/symex" xmlns:wpg="http://schemas.microsoft.com/office/word/2010/wordprocessingGroup" xmlns:wpi="http://schemas.microsoft.com/office/word/2010/wordprocessingInk" xmlns:wne="http://schemas.microsoft.com/office/word/2006/wordml" xmlns:wps="http://schemas.microsoft.com/office/word/2010/wordprocessingShape" mc:Ignorable="w14 w15 w16se w16cid wp14">
   <w:sdt>
     <w:sdtPr>
       <w:id w:val="-747578550"/>
@@ -17547,7 +19212,7 @@
 </file>
 
 <file path=word/header3.xml><?xml version="1.0" encoding="utf-8"?>
-<w:hdr xmlns:wpc="http://schemas.microsoft.com/office/word/2010/wordprocessingCanvas" xmlns:cx="http://schemas.microsoft.com/office/drawing/2014/chartex" xmlns:cx1="http://schemas.microsoft.com/office/drawing/2015/9/8/chartex" xmlns:cx2="http://schemas.microsoft.com/office/drawing/2015/10/21/chartex" xmlns:cx3="http://schemas.microsoft.com/office/drawing/2016/5/9/chartex" xmlns:cx4="http://schemas.microsoft.com/office/drawing/2016/5/10/chartex" xmlns:cx5="http://schemas.microsoft.com/office/drawing/2016/5/11/chartex" xmlns:cx6="http://schemas.microsoft.com/office/drawing/2016/5/12/chartex" xmlns:cx7="http://schemas.microsoft.com/office/drawing/2016/5/13/chartex" xmlns:cx8="http://schemas.microsoft.com/office/drawing/2016/5/14/chartex" xmlns:mc="http://schemas.openxmlformats.org/markup-compatibility/2006" xmlns:aink="http://schemas.microsoft.com/office/drawing/2016/ink" xmlns:am3d="http://schemas.microsoft.com/office/drawing/2017/model3d" xmlns:o="urn:schemas-microsoft-com:office:office" xmlns:oel="http://schemas.microsoft.com/office/2019/extlst" xmlns:r="http://schemas.openxmlformats.org/officeDocument/2006/relationships" xmlns:m="http://schemas.openxmlformats.org/officeDocument/2006/math" xmlns:v="urn:schemas-microsoft-com:vml" xmlns:wp14="http://schemas.microsoft.com/office/word/2010/wordprocessingDrawing" xmlns:wp="http://schemas.openxmlformats.org/drawingml/2006/wordprocessingDrawing" xmlns:w10="urn:schemas-microsoft-com:office:word" xmlns:w="http://schemas.openxmlformats.org/wordprocessingml/2006/main" xmlns:w14="http://schemas.microsoft.com/office/word/2010/wordml" xmlns:w15="http://schemas.microsoft.com/office/word/2012/wordml" xmlns:w16cex="http://schemas.microsoft.com/office/word/2018/wordml/cex" xmlns:w16cid="http://schemas.microsoft.com/office/word/2016/wordml/cid" xmlns:w16="http://schemas.microsoft.com/office/word/2018/wordml" xmlns:w16du="http://schemas.microsoft.com/office/word/2023/wordml/word16du" xmlns:w16sdtdh="http://schemas.microsoft.com/office/word/2020/wordml/sdtdatahash" xmlns:w16se="http://schemas.microsoft.com/office/word/2015/wordml/symex" xmlns:wpg="http://schemas.microsoft.com/office/word/2010/wordprocessingGroup" xmlns:wpi="http://schemas.microsoft.com/office/word/2010/wordprocessingInk" xmlns:wne="http://schemas.microsoft.com/office/word/2006/wordml" xmlns:wps="http://schemas.microsoft.com/office/word/2010/wordprocessingShape" mc:Ignorable="w14 w15 w16se w16cid w16 w16cex w16sdtdh w16du wp14">
+<w:hdr xmlns:wpc="http://schemas.microsoft.com/office/word/2010/wordprocessingCanvas" xmlns:cx="http://schemas.microsoft.com/office/drawing/2014/chartex" xmlns:cx1="http://schemas.microsoft.com/office/drawing/2015/9/8/chartex" xmlns:cx2="http://schemas.microsoft.com/office/drawing/2015/10/21/chartex" xmlns:cx3="http://schemas.microsoft.com/office/drawing/2016/5/9/chartex" xmlns:cx4="http://schemas.microsoft.com/office/drawing/2016/5/10/chartex" xmlns:cx5="http://schemas.microsoft.com/office/drawing/2016/5/11/chartex" xmlns:cx6="http://schemas.microsoft.com/office/drawing/2016/5/12/chartex" xmlns:cx7="http://schemas.microsoft.com/office/drawing/2016/5/13/chartex" xmlns:cx8="http://schemas.microsoft.com/office/drawing/2016/5/14/chartex" xmlns:mc="http://schemas.openxmlformats.org/markup-compatibility/2006" xmlns:aink="http://schemas.microsoft.com/office/drawing/2016/ink" xmlns:am3d="http://schemas.microsoft.com/office/drawing/2017/model3d" xmlns:o="urn:schemas-microsoft-com:office:office" xmlns:r="http://schemas.openxmlformats.org/officeDocument/2006/relationships" xmlns:m="http://schemas.openxmlformats.org/officeDocument/2006/math" xmlns:v="urn:schemas-microsoft-com:vml" xmlns:wp14="http://schemas.microsoft.com/office/word/2010/wordprocessingDrawing" xmlns:wp="http://schemas.openxmlformats.org/drawingml/2006/wordprocessingDrawing" xmlns:w10="urn:schemas-microsoft-com:office:word" xmlns:w="http://schemas.openxmlformats.org/wordprocessingml/2006/main" xmlns:w14="http://schemas.microsoft.com/office/word/2010/wordml" xmlns:w15="http://schemas.microsoft.com/office/word/2012/wordml" xmlns:w16cid="http://schemas.microsoft.com/office/word/2016/wordml/cid" xmlns:w16se="http://schemas.microsoft.com/office/word/2015/wordml/symex" xmlns:wpg="http://schemas.microsoft.com/office/word/2010/wordprocessingGroup" xmlns:wpi="http://schemas.microsoft.com/office/word/2010/wordprocessingInk" xmlns:wne="http://schemas.microsoft.com/office/word/2006/wordml" xmlns:wps="http://schemas.microsoft.com/office/word/2010/wordprocessingShape" mc:Ignorable="w14 w15 w16se w16cid wp14">
   <w:sdt>
     <w:sdtPr>
       <w:id w:val="-1212647906"/>
@@ -17621,7 +19286,7 @@
 </file>
 
 <file path=word/numbering.xml><?xml version="1.0" encoding="utf-8"?>
-<w:numbering xmlns:wpc="http://schemas.microsoft.com/office/word/2010/wordprocessingCanvas" xmlns:cx="http://schemas.microsoft.com/office/drawing/2014/chartex" xmlns:cx1="http://schemas.microsoft.com/office/drawing/2015/9/8/chartex" xmlns:cx2="http://schemas.microsoft.com/office/drawing/2015/10/21/chartex" xmlns:cx3="http://schemas.microsoft.com/office/drawing/2016/5/9/chartex" xmlns:cx4="http://schemas.microsoft.com/office/drawing/2016/5/10/chartex" xmlns:cx5="http://schemas.microsoft.com/office/drawing/2016/5/11/chartex" xmlns:cx6="http://schemas.microsoft.com/office/drawing/2016/5/12/chartex" xmlns:cx7="http://schemas.microsoft.com/office/drawing/2016/5/13/chartex" xmlns:cx8="http://schemas.microsoft.com/office/drawing/2016/5/14/chartex" xmlns:mc="http://schemas.openxmlformats.org/markup-compatibility/2006" xmlns:aink="http://schemas.microsoft.com/office/drawing/2016/ink" xmlns:am3d="http://schemas.microsoft.com/office/drawing/2017/model3d" xmlns:o="urn:schemas-microsoft-com:office:office" xmlns:oel="http://schemas.microsoft.com/office/2019/extlst" xmlns:r="http://schemas.openxmlformats.org/officeDocument/2006/relationships" xmlns:m="http://schemas.openxmlformats.org/officeDocument/2006/math" xmlns:v="urn:schemas-microsoft-com:vml" xmlns:wp14="http://schemas.microsoft.com/office/word/2010/wordprocessingDrawing" xmlns:wp="http://schemas.openxmlformats.org/drawingml/2006/wordprocessingDrawing" xmlns:w10="urn:schemas-microsoft-com:office:word" xmlns:w="http://schemas.openxmlformats.org/wordprocessingml/2006/main" xmlns:w14="http://schemas.microsoft.com/office/word/2010/wordml" xmlns:w15="http://schemas.microsoft.com/office/word/2012/wordml" xmlns:w16cex="http://schemas.microsoft.com/office/word/2018/wordml/cex" xmlns:w16cid="http://schemas.microsoft.com/office/word/2016/wordml/cid" xmlns:w16="http://schemas.microsoft.com/office/word/2018/wordml" xmlns:w16du="http://schemas.microsoft.com/office/word/2023/wordml/word16du" xmlns:w16sdtdh="http://schemas.microsoft.com/office/word/2020/wordml/sdtdatahash" xmlns:w16se="http://schemas.microsoft.com/office/word/2015/wordml/symex" xmlns:wpg="http://schemas.microsoft.com/office/word/2010/wordprocessingGroup" xmlns:wpi="http://schemas.microsoft.com/office/word/2010/wordprocessingInk" xmlns:wne="http://schemas.microsoft.com/office/word/2006/wordml" xmlns:wps="http://schemas.microsoft.com/office/word/2010/wordprocessingShape" mc:Ignorable="w14 w15 w16se w16cid w16 w16cex w16sdtdh w16du wp14">
+<w:numbering xmlns:wpc="http://schemas.microsoft.com/office/word/2010/wordprocessingCanvas" xmlns:cx="http://schemas.microsoft.com/office/drawing/2014/chartex" xmlns:cx1="http://schemas.microsoft.com/office/drawing/2015/9/8/chartex" xmlns:cx2="http://schemas.microsoft.com/office/drawing/2015/10/21/chartex" xmlns:cx3="http://schemas.microsoft.com/office/drawing/2016/5/9/chartex" xmlns:cx4="http://schemas.microsoft.com/office/drawing/2016/5/10/chartex" xmlns:cx5="http://schemas.microsoft.com/office/drawing/2016/5/11/chartex" xmlns:cx6="http://schemas.microsoft.com/office/drawing/2016/5/12/chartex" xmlns:cx7="http://schemas.microsoft.com/office/drawing/2016/5/13/chartex" xmlns:cx8="http://schemas.microsoft.com/office/drawing/2016/5/14/chartex" xmlns:mc="http://schemas.openxmlformats.org/markup-compatibility/2006" xmlns:aink="http://schemas.microsoft.com/office/drawing/2016/ink" xmlns:am3d="http://schemas.microsoft.com/office/drawing/2017/model3d" xmlns:o="urn:schemas-microsoft-com:office:office" xmlns:r="http://schemas.openxmlformats.org/officeDocument/2006/relationships" xmlns:m="http://schemas.openxmlformats.org/officeDocument/2006/math" xmlns:v="urn:schemas-microsoft-com:vml" xmlns:wp14="http://schemas.microsoft.com/office/word/2010/wordprocessingDrawing" xmlns:wp="http://schemas.openxmlformats.org/drawingml/2006/wordprocessingDrawing" xmlns:w10="urn:schemas-microsoft-com:office:word" xmlns:w="http://schemas.openxmlformats.org/wordprocessingml/2006/main" xmlns:w14="http://schemas.microsoft.com/office/word/2010/wordml" xmlns:w15="http://schemas.microsoft.com/office/word/2012/wordml" xmlns:w16cid="http://schemas.microsoft.com/office/word/2016/wordml/cid" xmlns:w16se="http://schemas.microsoft.com/office/word/2015/wordml/symex" xmlns:wpg="http://schemas.microsoft.com/office/word/2010/wordprocessingGroup" xmlns:wpi="http://schemas.microsoft.com/office/word/2010/wordprocessingInk" xmlns:wne="http://schemas.microsoft.com/office/word/2006/wordml" xmlns:wps="http://schemas.microsoft.com/office/word/2010/wordprocessingShape" mc:Ignorable="w14 w15 w16se w16cid wp14">
   <w:abstractNum w:abstractNumId="0" w15:restartNumberingAfterBreak="0">
     <w:nsid w:val="0373FE28"/>
     <w:multiLevelType w:val="hybridMultilevel"/>
@@ -17962,6 +19627,96 @@
     </w:lvl>
   </w:abstractNum>
   <w:abstractNum w:abstractNumId="3" w15:restartNumberingAfterBreak="0">
+    <w:nsid w:val="0AFB7921"/>
+    <w:multiLevelType w:val="hybridMultilevel"/>
+    <w:tmpl w:val="BF3E4328"/>
+    <w:lvl w:ilvl="0" w:tplc="EA568F50">
+      <w:start w:val="1"/>
+      <w:numFmt w:val="decimal"/>
+      <w:lvlText w:val="%1."/>
+      <w:lvlJc w:val="left"/>
+      <w:pPr>
+        <w:ind w:left="1125" w:hanging="360"/>
+      </w:pPr>
+      <w:rPr>
+        <w:rFonts w:hint="default"/>
+        <w:b/>
+      </w:rPr>
+    </w:lvl>
+    <w:lvl w:ilvl="1" w:tplc="04160019" w:tentative="1">
+      <w:start w:val="1"/>
+      <w:numFmt w:val="lowerLetter"/>
+      <w:lvlText w:val="%2."/>
+      <w:lvlJc w:val="left"/>
+      <w:pPr>
+        <w:ind w:left="1845" w:hanging="360"/>
+      </w:pPr>
+    </w:lvl>
+    <w:lvl w:ilvl="2" w:tplc="0416001B" w:tentative="1">
+      <w:start w:val="1"/>
+      <w:numFmt w:val="lowerRoman"/>
+      <w:lvlText w:val="%3."/>
+      <w:lvlJc w:val="right"/>
+      <w:pPr>
+        <w:ind w:left="2565" w:hanging="180"/>
+      </w:pPr>
+    </w:lvl>
+    <w:lvl w:ilvl="3" w:tplc="0416000F" w:tentative="1">
+      <w:start w:val="1"/>
+      <w:numFmt w:val="decimal"/>
+      <w:lvlText w:val="%4."/>
+      <w:lvlJc w:val="left"/>
+      <w:pPr>
+        <w:ind w:left="3285" w:hanging="360"/>
+      </w:pPr>
+    </w:lvl>
+    <w:lvl w:ilvl="4" w:tplc="04160019" w:tentative="1">
+      <w:start w:val="1"/>
+      <w:numFmt w:val="lowerLetter"/>
+      <w:lvlText w:val="%5."/>
+      <w:lvlJc w:val="left"/>
+      <w:pPr>
+        <w:ind w:left="4005" w:hanging="360"/>
+      </w:pPr>
+    </w:lvl>
+    <w:lvl w:ilvl="5" w:tplc="0416001B" w:tentative="1">
+      <w:start w:val="1"/>
+      <w:numFmt w:val="lowerRoman"/>
+      <w:lvlText w:val="%6."/>
+      <w:lvlJc w:val="right"/>
+      <w:pPr>
+        <w:ind w:left="4725" w:hanging="180"/>
+      </w:pPr>
+    </w:lvl>
+    <w:lvl w:ilvl="6" w:tplc="0416000F" w:tentative="1">
+      <w:start w:val="1"/>
+      <w:numFmt w:val="decimal"/>
+      <w:lvlText w:val="%7."/>
+      <w:lvlJc w:val="left"/>
+      <w:pPr>
+        <w:ind w:left="5445" w:hanging="360"/>
+      </w:pPr>
+    </w:lvl>
+    <w:lvl w:ilvl="7" w:tplc="04160019" w:tentative="1">
+      <w:start w:val="1"/>
+      <w:numFmt w:val="lowerLetter"/>
+      <w:lvlText w:val="%8."/>
+      <w:lvlJc w:val="left"/>
+      <w:pPr>
+        <w:ind w:left="6165" w:hanging="360"/>
+      </w:pPr>
+    </w:lvl>
+    <w:lvl w:ilvl="8" w:tplc="0416001B" w:tentative="1">
+      <w:start w:val="1"/>
+      <w:numFmt w:val="lowerRoman"/>
+      <w:lvlText w:val="%9."/>
+      <w:lvlJc w:val="right"/>
+      <w:pPr>
+        <w:ind w:left="6885" w:hanging="180"/>
+      </w:pPr>
+    </w:lvl>
+  </w:abstractNum>
+  <w:abstractNum w:abstractNumId="4" w15:restartNumberingAfterBreak="0">
     <w:nsid w:val="0C095A24"/>
     <w:multiLevelType w:val="multilevel"/>
     <w:tmpl w:val="B5EA418C"/>
@@ -18080,155 +19835,6 @@
         </w:tabs>
         <w:ind w:left="6480" w:hanging="360"/>
       </w:pPr>
-    </w:lvl>
-  </w:abstractNum>
-  <w:abstractNum w:abstractNumId="4" w15:restartNumberingAfterBreak="0">
-    <w:nsid w:val="14926921"/>
-    <w:multiLevelType w:val="multilevel"/>
-    <w:tmpl w:val="CE7ACA5E"/>
-    <w:lvl w:ilvl="0">
-      <w:start w:val="1"/>
-      <w:numFmt w:val="bullet"/>
-      <w:lvlText w:val=""/>
-      <w:lvlJc w:val="left"/>
-      <w:pPr>
-        <w:tabs>
-          <w:tab w:val="num" w:pos="720"/>
-        </w:tabs>
-        <w:ind w:left="720" w:hanging="360"/>
-      </w:pPr>
-      <w:rPr>
-        <w:rFonts w:ascii="Symbol" w:hAnsi="Symbol" w:hint="default"/>
-        <w:sz w:val="20"/>
-      </w:rPr>
-    </w:lvl>
-    <w:lvl w:ilvl="1" w:tentative="1">
-      <w:start w:val="1"/>
-      <w:numFmt w:val="bullet"/>
-      <w:lvlText w:val="o"/>
-      <w:lvlJc w:val="left"/>
-      <w:pPr>
-        <w:tabs>
-          <w:tab w:val="num" w:pos="1440"/>
-        </w:tabs>
-        <w:ind w:left="1440" w:hanging="360"/>
-      </w:pPr>
-      <w:rPr>
-        <w:rFonts w:ascii="Courier New" w:hAnsi="Courier New" w:hint="default"/>
-        <w:sz w:val="20"/>
-      </w:rPr>
-    </w:lvl>
-    <w:lvl w:ilvl="2" w:tentative="1">
-      <w:start w:val="1"/>
-      <w:numFmt w:val="bullet"/>
-      <w:lvlText w:val=""/>
-      <w:lvlJc w:val="left"/>
-      <w:pPr>
-        <w:tabs>
-          <w:tab w:val="num" w:pos="2160"/>
-        </w:tabs>
-        <w:ind w:left="2160" w:hanging="360"/>
-      </w:pPr>
-      <w:rPr>
-        <w:rFonts w:ascii="Wingdings" w:hAnsi="Wingdings" w:hint="default"/>
-        <w:sz w:val="20"/>
-      </w:rPr>
-    </w:lvl>
-    <w:lvl w:ilvl="3" w:tentative="1">
-      <w:start w:val="1"/>
-      <w:numFmt w:val="bullet"/>
-      <w:lvlText w:val=""/>
-      <w:lvlJc w:val="left"/>
-      <w:pPr>
-        <w:tabs>
-          <w:tab w:val="num" w:pos="2880"/>
-        </w:tabs>
-        <w:ind w:left="2880" w:hanging="360"/>
-      </w:pPr>
-      <w:rPr>
-        <w:rFonts w:ascii="Wingdings" w:hAnsi="Wingdings" w:hint="default"/>
-        <w:sz w:val="20"/>
-      </w:rPr>
-    </w:lvl>
-    <w:lvl w:ilvl="4" w:tentative="1">
-      <w:start w:val="1"/>
-      <w:numFmt w:val="bullet"/>
-      <w:lvlText w:val=""/>
-      <w:lvlJc w:val="left"/>
-      <w:pPr>
-        <w:tabs>
-          <w:tab w:val="num" w:pos="3600"/>
-        </w:tabs>
-        <w:ind w:left="3600" w:hanging="360"/>
-      </w:pPr>
-      <w:rPr>
-        <w:rFonts w:ascii="Wingdings" w:hAnsi="Wingdings" w:hint="default"/>
-        <w:sz w:val="20"/>
-      </w:rPr>
-    </w:lvl>
-    <w:lvl w:ilvl="5" w:tentative="1">
-      <w:start w:val="1"/>
-      <w:numFmt w:val="bullet"/>
-      <w:lvlText w:val=""/>
-      <w:lvlJc w:val="left"/>
-      <w:pPr>
-        <w:tabs>
-          <w:tab w:val="num" w:pos="4320"/>
-        </w:tabs>
-        <w:ind w:left="4320" w:hanging="360"/>
-      </w:pPr>
-      <w:rPr>
-        <w:rFonts w:ascii="Wingdings" w:hAnsi="Wingdings" w:hint="default"/>
-        <w:sz w:val="20"/>
-      </w:rPr>
-    </w:lvl>
-    <w:lvl w:ilvl="6" w:tentative="1">
-      <w:start w:val="1"/>
-      <w:numFmt w:val="bullet"/>
-      <w:lvlText w:val=""/>
-      <w:lvlJc w:val="left"/>
-      <w:pPr>
-        <w:tabs>
-          <w:tab w:val="num" w:pos="5040"/>
-        </w:tabs>
-        <w:ind w:left="5040" w:hanging="360"/>
-      </w:pPr>
-      <w:rPr>
-        <w:rFonts w:ascii="Wingdings" w:hAnsi="Wingdings" w:hint="default"/>
-        <w:sz w:val="20"/>
-      </w:rPr>
-    </w:lvl>
-    <w:lvl w:ilvl="7" w:tentative="1">
-      <w:start w:val="1"/>
-      <w:numFmt w:val="bullet"/>
-      <w:lvlText w:val=""/>
-      <w:lvlJc w:val="left"/>
-      <w:pPr>
-        <w:tabs>
-          <w:tab w:val="num" w:pos="5760"/>
-        </w:tabs>
-        <w:ind w:left="5760" w:hanging="360"/>
-      </w:pPr>
-      <w:rPr>
-        <w:rFonts w:ascii="Wingdings" w:hAnsi="Wingdings" w:hint="default"/>
-        <w:sz w:val="20"/>
-      </w:rPr>
-    </w:lvl>
-    <w:lvl w:ilvl="8" w:tentative="1">
-      <w:start w:val="1"/>
-      <w:numFmt w:val="bullet"/>
-      <w:lvlText w:val=""/>
-      <w:lvlJc w:val="left"/>
-      <w:pPr>
-        <w:tabs>
-          <w:tab w:val="num" w:pos="6480"/>
-        </w:tabs>
-        <w:ind w:left="6480" w:hanging="360"/>
-      </w:pPr>
-      <w:rPr>
-        <w:rFonts w:ascii="Wingdings" w:hAnsi="Wingdings" w:hint="default"/>
-        <w:sz w:val="20"/>
-      </w:rPr>
     </w:lvl>
   </w:abstractNum>
   <w:abstractNum w:abstractNumId="5" w15:restartNumberingAfterBreak="0">
@@ -18483,6 +20089,136 @@
     </w:lvl>
   </w:abstractNum>
   <w:abstractNum w:abstractNumId="7" w15:restartNumberingAfterBreak="0">
+    <w:nsid w:val="1A241A05"/>
+    <w:multiLevelType w:val="multilevel"/>
+    <w:tmpl w:val="EEF23F2C"/>
+    <w:lvl w:ilvl="0">
+      <w:start w:val="1"/>
+      <w:numFmt w:val="decimal"/>
+      <w:lvlText w:val="%1."/>
+      <w:lvlJc w:val="left"/>
+      <w:pPr>
+        <w:ind w:left="1080" w:hanging="360"/>
+      </w:pPr>
+      <w:rPr>
+        <w:rFonts w:hint="default"/>
+        <w:b/>
+      </w:rPr>
+    </w:lvl>
+    <w:lvl w:ilvl="1">
+      <w:start w:val="1"/>
+      <w:numFmt w:val="decimal"/>
+      <w:isLgl/>
+      <w:lvlText w:val="%1.%2"/>
+      <w:lvlJc w:val="left"/>
+      <w:pPr>
+        <w:ind w:left="1530" w:hanging="450"/>
+      </w:pPr>
+      <w:rPr>
+        <w:rFonts w:hint="default"/>
+        <w:b/>
+      </w:rPr>
+    </w:lvl>
+    <w:lvl w:ilvl="2">
+      <w:start w:val="1"/>
+      <w:numFmt w:val="decimal"/>
+      <w:isLgl/>
+      <w:lvlText w:val="%1.%2.%3"/>
+      <w:lvlJc w:val="left"/>
+      <w:pPr>
+        <w:ind w:left="2160" w:hanging="720"/>
+      </w:pPr>
+      <w:rPr>
+        <w:rFonts w:hint="default"/>
+        <w:b/>
+      </w:rPr>
+    </w:lvl>
+    <w:lvl w:ilvl="3">
+      <w:start w:val="1"/>
+      <w:numFmt w:val="decimal"/>
+      <w:isLgl/>
+      <w:lvlText w:val="%1.%2.%3.%4"/>
+      <w:lvlJc w:val="left"/>
+      <w:pPr>
+        <w:ind w:left="2880" w:hanging="1080"/>
+      </w:pPr>
+      <w:rPr>
+        <w:rFonts w:hint="default"/>
+        <w:b/>
+      </w:rPr>
+    </w:lvl>
+    <w:lvl w:ilvl="4">
+      <w:start w:val="1"/>
+      <w:numFmt w:val="decimal"/>
+      <w:isLgl/>
+      <w:lvlText w:val="%1.%2.%3.%4.%5"/>
+      <w:lvlJc w:val="left"/>
+      <w:pPr>
+        <w:ind w:left="3240" w:hanging="1080"/>
+      </w:pPr>
+      <w:rPr>
+        <w:rFonts w:hint="default"/>
+        <w:b/>
+      </w:rPr>
+    </w:lvl>
+    <w:lvl w:ilvl="5">
+      <w:start w:val="1"/>
+      <w:numFmt w:val="decimal"/>
+      <w:isLgl/>
+      <w:lvlText w:val="%1.%2.%3.%4.%5.%6"/>
+      <w:lvlJc w:val="left"/>
+      <w:pPr>
+        <w:ind w:left="3960" w:hanging="1440"/>
+      </w:pPr>
+      <w:rPr>
+        <w:rFonts w:hint="default"/>
+        <w:b/>
+      </w:rPr>
+    </w:lvl>
+    <w:lvl w:ilvl="6">
+      <w:start w:val="1"/>
+      <w:numFmt w:val="decimal"/>
+      <w:isLgl/>
+      <w:lvlText w:val="%1.%2.%3.%4.%5.%6.%7"/>
+      <w:lvlJc w:val="left"/>
+      <w:pPr>
+        <w:ind w:left="4320" w:hanging="1440"/>
+      </w:pPr>
+      <w:rPr>
+        <w:rFonts w:hint="default"/>
+        <w:b/>
+      </w:rPr>
+    </w:lvl>
+    <w:lvl w:ilvl="7">
+      <w:start w:val="1"/>
+      <w:numFmt w:val="decimal"/>
+      <w:isLgl/>
+      <w:lvlText w:val="%1.%2.%3.%4.%5.%6.%7.%8"/>
+      <w:lvlJc w:val="left"/>
+      <w:pPr>
+        <w:ind w:left="5040" w:hanging="1800"/>
+      </w:pPr>
+      <w:rPr>
+        <w:rFonts w:hint="default"/>
+        <w:b/>
+      </w:rPr>
+    </w:lvl>
+    <w:lvl w:ilvl="8">
+      <w:start w:val="1"/>
+      <w:numFmt w:val="decimal"/>
+      <w:isLgl/>
+      <w:lvlText w:val="%1.%2.%3.%4.%5.%6.%7.%8.%9"/>
+      <w:lvlJc w:val="left"/>
+      <w:pPr>
+        <w:ind w:left="5400" w:hanging="1800"/>
+      </w:pPr>
+      <w:rPr>
+        <w:rFonts w:hint="default"/>
+        <w:b/>
+      </w:rPr>
+    </w:lvl>
+  </w:abstractNum>
+  <w:abstractNum w:abstractNumId="8" w15:restartNumberingAfterBreak="0">
     <w:nsid w:val="1BAD675C"/>
     <w:multiLevelType w:val="multilevel"/>
     <w:tmpl w:val="04C8B43A"/>
@@ -18631,7 +20367,7 @@
       </w:rPr>
     </w:lvl>
   </w:abstractNum>
-  <w:abstractNum w:abstractNumId="8" w15:restartNumberingAfterBreak="0">
+  <w:abstractNum w:abstractNumId="9" w15:restartNumberingAfterBreak="0">
     <w:nsid w:val="1C813AAF"/>
     <w:multiLevelType w:val="hybridMultilevel"/>
     <w:tmpl w:val="580ACD06"/>
@@ -18744,7 +20480,120 @@
       </w:rPr>
     </w:lvl>
   </w:abstractNum>
-  <w:abstractNum w:abstractNumId="9" w15:restartNumberingAfterBreak="0">
+  <w:abstractNum w:abstractNumId="10" w15:restartNumberingAfterBreak="0">
+    <w:nsid w:val="1DA5067A"/>
+    <w:multiLevelType w:val="hybridMultilevel"/>
+    <w:tmpl w:val="56CE9DD2"/>
+    <w:lvl w:ilvl="0" w:tplc="04160001">
+      <w:start w:val="1"/>
+      <w:numFmt w:val="bullet"/>
+      <w:lvlText w:val=""/>
+      <w:lvlJc w:val="left"/>
+      <w:pPr>
+        <w:ind w:left="1800" w:hanging="360"/>
+      </w:pPr>
+      <w:rPr>
+        <w:rFonts w:ascii="Symbol" w:hAnsi="Symbol" w:hint="default"/>
+      </w:rPr>
+    </w:lvl>
+    <w:lvl w:ilvl="1" w:tplc="04160003" w:tentative="1">
+      <w:start w:val="1"/>
+      <w:numFmt w:val="bullet"/>
+      <w:lvlText w:val="o"/>
+      <w:lvlJc w:val="left"/>
+      <w:pPr>
+        <w:ind w:left="2520" w:hanging="360"/>
+      </w:pPr>
+      <w:rPr>
+        <w:rFonts w:ascii="Courier New" w:hAnsi="Courier New" w:cs="Courier New" w:hint="default"/>
+      </w:rPr>
+    </w:lvl>
+    <w:lvl w:ilvl="2" w:tplc="04160005" w:tentative="1">
+      <w:start w:val="1"/>
+      <w:numFmt w:val="bullet"/>
+      <w:lvlText w:val=""/>
+      <w:lvlJc w:val="left"/>
+      <w:pPr>
+        <w:ind w:left="3240" w:hanging="360"/>
+      </w:pPr>
+      <w:rPr>
+        <w:rFonts w:ascii="Wingdings" w:hAnsi="Wingdings" w:hint="default"/>
+      </w:rPr>
+    </w:lvl>
+    <w:lvl w:ilvl="3" w:tplc="04160001" w:tentative="1">
+      <w:start w:val="1"/>
+      <w:numFmt w:val="bullet"/>
+      <w:lvlText w:val=""/>
+      <w:lvlJc w:val="left"/>
+      <w:pPr>
+        <w:ind w:left="3960" w:hanging="360"/>
+      </w:pPr>
+      <w:rPr>
+        <w:rFonts w:ascii="Symbol" w:hAnsi="Symbol" w:hint="default"/>
+      </w:rPr>
+    </w:lvl>
+    <w:lvl w:ilvl="4" w:tplc="04160003" w:tentative="1">
+      <w:start w:val="1"/>
+      <w:numFmt w:val="bullet"/>
+      <w:lvlText w:val="o"/>
+      <w:lvlJc w:val="left"/>
+      <w:pPr>
+        <w:ind w:left="4680" w:hanging="360"/>
+      </w:pPr>
+      <w:rPr>
+        <w:rFonts w:ascii="Courier New" w:hAnsi="Courier New" w:cs="Courier New" w:hint="default"/>
+      </w:rPr>
+    </w:lvl>
+    <w:lvl w:ilvl="5" w:tplc="04160005" w:tentative="1">
+      <w:start w:val="1"/>
+      <w:numFmt w:val="bullet"/>
+      <w:lvlText w:val=""/>
+      <w:lvlJc w:val="left"/>
+      <w:pPr>
+        <w:ind w:left="5400" w:hanging="360"/>
+      </w:pPr>
+      <w:rPr>
+        <w:rFonts w:ascii="Wingdings" w:hAnsi="Wingdings" w:hint="default"/>
+      </w:rPr>
+    </w:lvl>
+    <w:lvl w:ilvl="6" w:tplc="04160001" w:tentative="1">
+      <w:start w:val="1"/>
+      <w:numFmt w:val="bullet"/>
+      <w:lvlText w:val=""/>
+      <w:lvlJc w:val="left"/>
+      <w:pPr>
+        <w:ind w:left="6120" w:hanging="360"/>
+      </w:pPr>
+      <w:rPr>
+        <w:rFonts w:ascii="Symbol" w:hAnsi="Symbol" w:hint="default"/>
+      </w:rPr>
+    </w:lvl>
+    <w:lvl w:ilvl="7" w:tplc="04160003" w:tentative="1">
+      <w:start w:val="1"/>
+      <w:numFmt w:val="bullet"/>
+      <w:lvlText w:val="o"/>
+      <w:lvlJc w:val="left"/>
+      <w:pPr>
+        <w:ind w:left="6840" w:hanging="360"/>
+      </w:pPr>
+      <w:rPr>
+        <w:rFonts w:ascii="Courier New" w:hAnsi="Courier New" w:cs="Courier New" w:hint="default"/>
+      </w:rPr>
+    </w:lvl>
+    <w:lvl w:ilvl="8" w:tplc="04160005" w:tentative="1">
+      <w:start w:val="1"/>
+      <w:numFmt w:val="bullet"/>
+      <w:lvlText w:val=""/>
+      <w:lvlJc w:val="left"/>
+      <w:pPr>
+        <w:ind w:left="7560" w:hanging="360"/>
+      </w:pPr>
+      <w:rPr>
+        <w:rFonts w:ascii="Wingdings" w:hAnsi="Wingdings" w:hint="default"/>
+      </w:rPr>
+    </w:lvl>
+  </w:abstractNum>
+  <w:abstractNum w:abstractNumId="11" w15:restartNumberingAfterBreak="0">
     <w:nsid w:val="1DA61BDF"/>
     <w:multiLevelType w:val="multilevel"/>
     <w:tmpl w:val="F70C42D8"/>
@@ -18838,7 +20687,7 @@
       </w:pPr>
     </w:lvl>
   </w:abstractNum>
-  <w:abstractNum w:abstractNumId="10" w15:restartNumberingAfterBreak="0">
+  <w:abstractNum w:abstractNumId="12" w15:restartNumberingAfterBreak="0">
     <w:nsid w:val="1E125F33"/>
     <w:multiLevelType w:val="multilevel"/>
     <w:tmpl w:val="F70C42D8"/>
@@ -18959,7 +20808,7 @@
       </w:rPr>
     </w:lvl>
   </w:abstractNum>
-  <w:abstractNum w:abstractNumId="11" w15:restartNumberingAfterBreak="0">
+  <w:abstractNum w:abstractNumId="13" w15:restartNumberingAfterBreak="0">
     <w:nsid w:val="1F9F837C"/>
     <w:multiLevelType w:val="hybridMultilevel"/>
     <w:tmpl w:val="FD26629C"/>
@@ -19072,7 +20921,7 @@
       </w:rPr>
     </w:lvl>
   </w:abstractNum>
-  <w:abstractNum w:abstractNumId="12" w15:restartNumberingAfterBreak="0">
+  <w:abstractNum w:abstractNumId="14" w15:restartNumberingAfterBreak="0">
     <w:nsid w:val="20D41BF3"/>
     <w:multiLevelType w:val="multilevel"/>
     <w:tmpl w:val="F20A33FC"/>
@@ -19189,7 +21038,7 @@
       </w:pPr>
     </w:lvl>
   </w:abstractNum>
-  <w:abstractNum w:abstractNumId="13" w15:restartNumberingAfterBreak="0">
+  <w:abstractNum w:abstractNumId="15" w15:restartNumberingAfterBreak="0">
     <w:nsid w:val="222C1837"/>
     <w:multiLevelType w:val="multilevel"/>
     <w:tmpl w:val="6C1CCC6E"/>
@@ -19338,7 +21187,7 @@
       </w:rPr>
     </w:lvl>
   </w:abstractNum>
-  <w:abstractNum w:abstractNumId="14" w15:restartNumberingAfterBreak="0">
+  <w:abstractNum w:abstractNumId="16" w15:restartNumberingAfterBreak="0">
     <w:nsid w:val="22E31FCD"/>
     <w:multiLevelType w:val="multilevel"/>
     <w:tmpl w:val="84EE1076"/>
@@ -19455,7 +21304,7 @@
       </w:pPr>
     </w:lvl>
   </w:abstractNum>
-  <w:abstractNum w:abstractNumId="15" w15:restartNumberingAfterBreak="0">
+  <w:abstractNum w:abstractNumId="17" w15:restartNumberingAfterBreak="0">
     <w:nsid w:val="23B9375B"/>
     <w:multiLevelType w:val="hybridMultilevel"/>
     <w:tmpl w:val="CFA43FD0"/>
@@ -19541,7 +21390,120 @@
       </w:pPr>
     </w:lvl>
   </w:abstractNum>
-  <w:abstractNum w:abstractNumId="16" w15:restartNumberingAfterBreak="0">
+  <w:abstractNum w:abstractNumId="18" w15:restartNumberingAfterBreak="0">
+    <w:nsid w:val="26A54A90"/>
+    <w:multiLevelType w:val="hybridMultilevel"/>
+    <w:tmpl w:val="651C38E0"/>
+    <w:lvl w:ilvl="0" w:tplc="04160001">
+      <w:start w:val="1"/>
+      <w:numFmt w:val="bullet"/>
+      <w:lvlText w:val=""/>
+      <w:lvlJc w:val="left"/>
+      <w:pPr>
+        <w:ind w:left="1440" w:hanging="360"/>
+      </w:pPr>
+      <w:rPr>
+        <w:rFonts w:ascii="Symbol" w:hAnsi="Symbol" w:hint="default"/>
+      </w:rPr>
+    </w:lvl>
+    <w:lvl w:ilvl="1" w:tplc="04160003" w:tentative="1">
+      <w:start w:val="1"/>
+      <w:numFmt w:val="bullet"/>
+      <w:lvlText w:val="o"/>
+      <w:lvlJc w:val="left"/>
+      <w:pPr>
+        <w:ind w:left="2160" w:hanging="360"/>
+      </w:pPr>
+      <w:rPr>
+        <w:rFonts w:ascii="Courier New" w:hAnsi="Courier New" w:cs="Courier New" w:hint="default"/>
+      </w:rPr>
+    </w:lvl>
+    <w:lvl w:ilvl="2" w:tplc="04160005" w:tentative="1">
+      <w:start w:val="1"/>
+      <w:numFmt w:val="bullet"/>
+      <w:lvlText w:val=""/>
+      <w:lvlJc w:val="left"/>
+      <w:pPr>
+        <w:ind w:left="2880" w:hanging="360"/>
+      </w:pPr>
+      <w:rPr>
+        <w:rFonts w:ascii="Wingdings" w:hAnsi="Wingdings" w:hint="default"/>
+      </w:rPr>
+    </w:lvl>
+    <w:lvl w:ilvl="3" w:tplc="04160001" w:tentative="1">
+      <w:start w:val="1"/>
+      <w:numFmt w:val="bullet"/>
+      <w:lvlText w:val=""/>
+      <w:lvlJc w:val="left"/>
+      <w:pPr>
+        <w:ind w:left="3600" w:hanging="360"/>
+      </w:pPr>
+      <w:rPr>
+        <w:rFonts w:ascii="Symbol" w:hAnsi="Symbol" w:hint="default"/>
+      </w:rPr>
+    </w:lvl>
+    <w:lvl w:ilvl="4" w:tplc="04160003" w:tentative="1">
+      <w:start w:val="1"/>
+      <w:numFmt w:val="bullet"/>
+      <w:lvlText w:val="o"/>
+      <w:lvlJc w:val="left"/>
+      <w:pPr>
+        <w:ind w:left="4320" w:hanging="360"/>
+      </w:pPr>
+      <w:rPr>
+        <w:rFonts w:ascii="Courier New" w:hAnsi="Courier New" w:cs="Courier New" w:hint="default"/>
+      </w:rPr>
+    </w:lvl>
+    <w:lvl w:ilvl="5" w:tplc="04160005" w:tentative="1">
+      <w:start w:val="1"/>
+      <w:numFmt w:val="bullet"/>
+      <w:lvlText w:val=""/>
+      <w:lvlJc w:val="left"/>
+      <w:pPr>
+        <w:ind w:left="5040" w:hanging="360"/>
+      </w:pPr>
+      <w:rPr>
+        <w:rFonts w:ascii="Wingdings" w:hAnsi="Wingdings" w:hint="default"/>
+      </w:rPr>
+    </w:lvl>
+    <w:lvl w:ilvl="6" w:tplc="04160001" w:tentative="1">
+      <w:start w:val="1"/>
+      <w:numFmt w:val="bullet"/>
+      <w:lvlText w:val=""/>
+      <w:lvlJc w:val="left"/>
+      <w:pPr>
+        <w:ind w:left="5760" w:hanging="360"/>
+      </w:pPr>
+      <w:rPr>
+        <w:rFonts w:ascii="Symbol" w:hAnsi="Symbol" w:hint="default"/>
+      </w:rPr>
+    </w:lvl>
+    <w:lvl w:ilvl="7" w:tplc="04160003" w:tentative="1">
+      <w:start w:val="1"/>
+      <w:numFmt w:val="bullet"/>
+      <w:lvlText w:val="o"/>
+      <w:lvlJc w:val="left"/>
+      <w:pPr>
+        <w:ind w:left="6480" w:hanging="360"/>
+      </w:pPr>
+      <w:rPr>
+        <w:rFonts w:ascii="Courier New" w:hAnsi="Courier New" w:cs="Courier New" w:hint="default"/>
+      </w:rPr>
+    </w:lvl>
+    <w:lvl w:ilvl="8" w:tplc="04160005" w:tentative="1">
+      <w:start w:val="1"/>
+      <w:numFmt w:val="bullet"/>
+      <w:lvlText w:val=""/>
+      <w:lvlJc w:val="left"/>
+      <w:pPr>
+        <w:ind w:left="7200" w:hanging="360"/>
+      </w:pPr>
+      <w:rPr>
+        <w:rFonts w:ascii="Wingdings" w:hAnsi="Wingdings" w:hint="default"/>
+      </w:rPr>
+    </w:lvl>
+  </w:abstractNum>
+  <w:abstractNum w:abstractNumId="19" w15:restartNumberingAfterBreak="0">
     <w:nsid w:val="28062DB1"/>
     <w:multiLevelType w:val="hybridMultilevel"/>
     <w:tmpl w:val="26A25FE0"/>
@@ -19654,7 +21616,7 @@
       </w:rPr>
     </w:lvl>
   </w:abstractNum>
-  <w:abstractNum w:abstractNumId="17" w15:restartNumberingAfterBreak="0">
+  <w:abstractNum w:abstractNumId="20" w15:restartNumberingAfterBreak="0">
     <w:nsid w:val="28B31FB9"/>
     <w:multiLevelType w:val="multilevel"/>
     <w:tmpl w:val="A8C05508"/>
@@ -19743,7 +21705,7 @@
       </w:pPr>
     </w:lvl>
   </w:abstractNum>
-  <w:abstractNum w:abstractNumId="18" w15:restartNumberingAfterBreak="0">
+  <w:abstractNum w:abstractNumId="21" w15:restartNumberingAfterBreak="0">
     <w:nsid w:val="28EC2056"/>
     <w:multiLevelType w:val="multilevel"/>
     <w:tmpl w:val="5A922EB8"/>
@@ -19892,7 +21854,7 @@
       </w:rPr>
     </w:lvl>
   </w:abstractNum>
-  <w:abstractNum w:abstractNumId="19" w15:restartNumberingAfterBreak="0">
+  <w:abstractNum w:abstractNumId="22" w15:restartNumberingAfterBreak="0">
     <w:nsid w:val="2A383C93"/>
     <w:multiLevelType w:val="hybridMultilevel"/>
     <w:tmpl w:val="57361CA2"/>
@@ -19978,7 +21940,7 @@
       </w:pPr>
     </w:lvl>
   </w:abstractNum>
-  <w:abstractNum w:abstractNumId="20" w15:restartNumberingAfterBreak="0">
+  <w:abstractNum w:abstractNumId="23" w15:restartNumberingAfterBreak="0">
     <w:nsid w:val="2DD1705E"/>
     <w:multiLevelType w:val="multilevel"/>
     <w:tmpl w:val="46A82D74"/>
@@ -20099,7 +22061,7 @@
       </w:rPr>
     </w:lvl>
   </w:abstractNum>
-  <w:abstractNum w:abstractNumId="21" w15:restartNumberingAfterBreak="0">
+  <w:abstractNum w:abstractNumId="24" w15:restartNumberingAfterBreak="0">
     <w:nsid w:val="2FC0F728"/>
     <w:multiLevelType w:val="hybridMultilevel"/>
     <w:tmpl w:val="964AFB7E"/>
@@ -20212,7 +22174,97 @@
       </w:rPr>
     </w:lvl>
   </w:abstractNum>
-  <w:abstractNum w:abstractNumId="22" w15:restartNumberingAfterBreak="0">
+  <w:abstractNum w:abstractNumId="25" w15:restartNumberingAfterBreak="0">
+    <w:nsid w:val="30641EBB"/>
+    <w:multiLevelType w:val="hybridMultilevel"/>
+    <w:tmpl w:val="EE864ADA"/>
+    <w:lvl w:ilvl="0" w:tplc="17B4ACF2">
+      <w:start w:val="1"/>
+      <w:numFmt w:val="decimal"/>
+      <w:lvlText w:val="%1."/>
+      <w:lvlJc w:val="left"/>
+      <w:pPr>
+        <w:ind w:left="1095" w:hanging="360"/>
+      </w:pPr>
+      <w:rPr>
+        <w:rFonts w:hint="default"/>
+        <w:b/>
+      </w:rPr>
+    </w:lvl>
+    <w:lvl w:ilvl="1" w:tplc="04160019" w:tentative="1">
+      <w:start w:val="1"/>
+      <w:numFmt w:val="lowerLetter"/>
+      <w:lvlText w:val="%2."/>
+      <w:lvlJc w:val="left"/>
+      <w:pPr>
+        <w:ind w:left="1815" w:hanging="360"/>
+      </w:pPr>
+    </w:lvl>
+    <w:lvl w:ilvl="2" w:tplc="0416001B" w:tentative="1">
+      <w:start w:val="1"/>
+      <w:numFmt w:val="lowerRoman"/>
+      <w:lvlText w:val="%3."/>
+      <w:lvlJc w:val="right"/>
+      <w:pPr>
+        <w:ind w:left="2535" w:hanging="180"/>
+      </w:pPr>
+    </w:lvl>
+    <w:lvl w:ilvl="3" w:tplc="0416000F" w:tentative="1">
+      <w:start w:val="1"/>
+      <w:numFmt w:val="decimal"/>
+      <w:lvlText w:val="%4."/>
+      <w:lvlJc w:val="left"/>
+      <w:pPr>
+        <w:ind w:left="3255" w:hanging="360"/>
+      </w:pPr>
+    </w:lvl>
+    <w:lvl w:ilvl="4" w:tplc="04160019" w:tentative="1">
+      <w:start w:val="1"/>
+      <w:numFmt w:val="lowerLetter"/>
+      <w:lvlText w:val="%5."/>
+      <w:lvlJc w:val="left"/>
+      <w:pPr>
+        <w:ind w:left="3975" w:hanging="360"/>
+      </w:pPr>
+    </w:lvl>
+    <w:lvl w:ilvl="5" w:tplc="0416001B" w:tentative="1">
+      <w:start w:val="1"/>
+      <w:numFmt w:val="lowerRoman"/>
+      <w:lvlText w:val="%6."/>
+      <w:lvlJc w:val="right"/>
+      <w:pPr>
+        <w:ind w:left="4695" w:hanging="180"/>
+      </w:pPr>
+    </w:lvl>
+    <w:lvl w:ilvl="6" w:tplc="0416000F" w:tentative="1">
+      <w:start w:val="1"/>
+      <w:numFmt w:val="decimal"/>
+      <w:lvlText w:val="%7."/>
+      <w:lvlJc w:val="left"/>
+      <w:pPr>
+        <w:ind w:left="5415" w:hanging="360"/>
+      </w:pPr>
+    </w:lvl>
+    <w:lvl w:ilvl="7" w:tplc="04160019" w:tentative="1">
+      <w:start w:val="1"/>
+      <w:numFmt w:val="lowerLetter"/>
+      <w:lvlText w:val="%8."/>
+      <w:lvlJc w:val="left"/>
+      <w:pPr>
+        <w:ind w:left="6135" w:hanging="360"/>
+      </w:pPr>
+    </w:lvl>
+    <w:lvl w:ilvl="8" w:tplc="0416001B" w:tentative="1">
+      <w:start w:val="1"/>
+      <w:numFmt w:val="lowerRoman"/>
+      <w:lvlText w:val="%9."/>
+      <w:lvlJc w:val="right"/>
+      <w:pPr>
+        <w:ind w:left="6855" w:hanging="180"/>
+      </w:pPr>
+    </w:lvl>
+  </w:abstractNum>
+  <w:abstractNum w:abstractNumId="26" w15:restartNumberingAfterBreak="0">
     <w:nsid w:val="312E74A5"/>
     <w:multiLevelType w:val="hybridMultilevel"/>
     <w:tmpl w:val="392CC20E"/>
@@ -20325,7 +22377,7 @@
       </w:rPr>
     </w:lvl>
   </w:abstractNum>
-  <w:abstractNum w:abstractNumId="23" w15:restartNumberingAfterBreak="0">
+  <w:abstractNum w:abstractNumId="27" w15:restartNumberingAfterBreak="0">
     <w:nsid w:val="359831F1"/>
     <w:multiLevelType w:val="hybridMultilevel"/>
     <w:tmpl w:val="F01055DC"/>
@@ -20438,7 +22490,130 @@
       </w:rPr>
     </w:lvl>
   </w:abstractNum>
-  <w:abstractNum w:abstractNumId="24" w15:restartNumberingAfterBreak="0">
+  <w:abstractNum w:abstractNumId="28" w15:restartNumberingAfterBreak="0">
+    <w:nsid w:val="37F038CE"/>
+    <w:multiLevelType w:val="multilevel"/>
+    <w:tmpl w:val="C2C0F950"/>
+    <w:lvl w:ilvl="0">
+      <w:start w:val="1"/>
+      <w:numFmt w:val="decimal"/>
+      <w:lvlText w:val="%1."/>
+      <w:lvlJc w:val="left"/>
+      <w:pPr>
+        <w:ind w:left="720" w:hanging="360"/>
+      </w:pPr>
+      <w:rPr>
+        <w:rFonts w:hint="default"/>
+        <w:b/>
+      </w:rPr>
+    </w:lvl>
+    <w:lvl w:ilvl="1">
+      <w:start w:val="1"/>
+      <w:numFmt w:val="decimal"/>
+      <w:isLgl/>
+      <w:lvlText w:val="%1.%2"/>
+      <w:lvlJc w:val="left"/>
+      <w:pPr>
+        <w:ind w:left="1353" w:hanging="360"/>
+      </w:pPr>
+      <w:rPr>
+        <w:rFonts w:hint="default"/>
+        <w:b/>
+      </w:rPr>
+    </w:lvl>
+    <w:lvl w:ilvl="2">
+      <w:start w:val="1"/>
+      <w:numFmt w:val="decimal"/>
+      <w:isLgl/>
+      <w:lvlText w:val="%1.%2.%3"/>
+      <w:lvlJc w:val="left"/>
+      <w:pPr>
+        <w:ind w:left="1800" w:hanging="720"/>
+      </w:pPr>
+      <w:rPr>
+        <w:rFonts w:hint="default"/>
+      </w:rPr>
+    </w:lvl>
+    <w:lvl w:ilvl="3">
+      <w:start w:val="1"/>
+      <w:numFmt w:val="decimal"/>
+      <w:isLgl/>
+      <w:lvlText w:val="%1.%2.%3.%4"/>
+      <w:lvlJc w:val="left"/>
+      <w:pPr>
+        <w:ind w:left="2160" w:hanging="720"/>
+      </w:pPr>
+      <w:rPr>
+        <w:rFonts w:hint="default"/>
+      </w:rPr>
+    </w:lvl>
+    <w:lvl w:ilvl="4">
+      <w:start w:val="1"/>
+      <w:numFmt w:val="decimal"/>
+      <w:isLgl/>
+      <w:lvlText w:val="%1.%2.%3.%4.%5"/>
+      <w:lvlJc w:val="left"/>
+      <w:pPr>
+        <w:ind w:left="2880" w:hanging="1080"/>
+      </w:pPr>
+      <w:rPr>
+        <w:rFonts w:hint="default"/>
+      </w:rPr>
+    </w:lvl>
+    <w:lvl w:ilvl="5">
+      <w:start w:val="1"/>
+      <w:numFmt w:val="decimal"/>
+      <w:isLgl/>
+      <w:lvlText w:val="%1.%2.%3.%4.%5.%6"/>
+      <w:lvlJc w:val="left"/>
+      <w:pPr>
+        <w:ind w:left="3240" w:hanging="1080"/>
+      </w:pPr>
+      <w:rPr>
+        <w:rFonts w:hint="default"/>
+      </w:rPr>
+    </w:lvl>
+    <w:lvl w:ilvl="6">
+      <w:start w:val="1"/>
+      <w:numFmt w:val="decimal"/>
+      <w:isLgl/>
+      <w:lvlText w:val="%1.%2.%3.%4.%5.%6.%7"/>
+      <w:lvlJc w:val="left"/>
+      <w:pPr>
+        <w:ind w:left="3960" w:hanging="1440"/>
+      </w:pPr>
+      <w:rPr>
+        <w:rFonts w:hint="default"/>
+      </w:rPr>
+    </w:lvl>
+    <w:lvl w:ilvl="7">
+      <w:start w:val="1"/>
+      <w:numFmt w:val="decimal"/>
+      <w:isLgl/>
+      <w:lvlText w:val="%1.%2.%3.%4.%5.%6.%7.%8"/>
+      <w:lvlJc w:val="left"/>
+      <w:pPr>
+        <w:ind w:left="4320" w:hanging="1440"/>
+      </w:pPr>
+      <w:rPr>
+        <w:rFonts w:hint="default"/>
+      </w:rPr>
+    </w:lvl>
+    <w:lvl w:ilvl="8">
+      <w:start w:val="1"/>
+      <w:numFmt w:val="decimal"/>
+      <w:isLgl/>
+      <w:lvlText w:val="%1.%2.%3.%4.%5.%6.%7.%8.%9"/>
+      <w:lvlJc w:val="left"/>
+      <w:pPr>
+        <w:ind w:left="5040" w:hanging="1800"/>
+      </w:pPr>
+      <w:rPr>
+        <w:rFonts w:hint="default"/>
+      </w:rPr>
+    </w:lvl>
+  </w:abstractNum>
+  <w:abstractNum w:abstractNumId="29" w15:restartNumberingAfterBreak="0">
     <w:nsid w:val="3B4A7A1D"/>
     <w:multiLevelType w:val="hybridMultilevel"/>
     <w:tmpl w:val="8BF4B4DC"/>
@@ -20551,7 +22726,7 @@
       </w:rPr>
     </w:lvl>
   </w:abstractNum>
-  <w:abstractNum w:abstractNumId="25" w15:restartNumberingAfterBreak="0">
+  <w:abstractNum w:abstractNumId="30" w15:restartNumberingAfterBreak="0">
     <w:nsid w:val="3EB0336B"/>
     <w:multiLevelType w:val="multilevel"/>
     <w:tmpl w:val="ADAA086A"/>
@@ -20668,7 +22843,7 @@
       </w:pPr>
     </w:lvl>
   </w:abstractNum>
-  <w:abstractNum w:abstractNumId="26" w15:restartNumberingAfterBreak="0">
+  <w:abstractNum w:abstractNumId="31" w15:restartNumberingAfterBreak="0">
     <w:nsid w:val="42323993"/>
     <w:multiLevelType w:val="multilevel"/>
     <w:tmpl w:val="1B3E64DA"/>
@@ -20817,7 +22992,7 @@
       </w:rPr>
     </w:lvl>
   </w:abstractNum>
-  <w:abstractNum w:abstractNumId="27" w15:restartNumberingAfterBreak="0">
+  <w:abstractNum w:abstractNumId="32" w15:restartNumberingAfterBreak="0">
     <w:nsid w:val="432471FC"/>
     <w:multiLevelType w:val="multilevel"/>
     <w:tmpl w:val="2EB0898C"/>
@@ -20966,7 +23141,7 @@
       </w:rPr>
     </w:lvl>
   </w:abstractNum>
-  <w:abstractNum w:abstractNumId="28" w15:restartNumberingAfterBreak="0">
+  <w:abstractNum w:abstractNumId="33" w15:restartNumberingAfterBreak="0">
     <w:nsid w:val="4A0F7870"/>
     <w:multiLevelType w:val="multilevel"/>
     <w:tmpl w:val="F20A33FC"/>
@@ -21083,7 +23258,7 @@
       </w:pPr>
     </w:lvl>
   </w:abstractNum>
-  <w:abstractNum w:abstractNumId="29" w15:restartNumberingAfterBreak="0">
+  <w:abstractNum w:abstractNumId="34" w15:restartNumberingAfterBreak="0">
     <w:nsid w:val="4AD633D6"/>
     <w:multiLevelType w:val="multilevel"/>
     <w:tmpl w:val="270424DE"/>
@@ -21197,7 +23372,7 @@
       </w:rPr>
     </w:lvl>
   </w:abstractNum>
-  <w:abstractNum w:abstractNumId="30" w15:restartNumberingAfterBreak="0">
+  <w:abstractNum w:abstractNumId="35" w15:restartNumberingAfterBreak="0">
     <w:nsid w:val="4AE90F7B"/>
     <w:multiLevelType w:val="multilevel"/>
     <w:tmpl w:val="18362EAE"/>
@@ -21346,7 +23521,7 @@
       </w:rPr>
     </w:lvl>
   </w:abstractNum>
-  <w:abstractNum w:abstractNumId="31" w15:restartNumberingAfterBreak="0">
+  <w:abstractNum w:abstractNumId="36" w15:restartNumberingAfterBreak="0">
     <w:nsid w:val="4D86413D"/>
     <w:multiLevelType w:val="multilevel"/>
     <w:tmpl w:val="160622EC"/>
@@ -21459,7 +23634,7 @@
       </w:pPr>
     </w:lvl>
   </w:abstractNum>
-  <w:abstractNum w:abstractNumId="32" w15:restartNumberingAfterBreak="0">
+  <w:abstractNum w:abstractNumId="37" w15:restartNumberingAfterBreak="0">
     <w:nsid w:val="4E031745"/>
     <w:multiLevelType w:val="multilevel"/>
     <w:tmpl w:val="EB3E482C"/>
@@ -21608,7 +23783,7 @@
       </w:rPr>
     </w:lvl>
   </w:abstractNum>
-  <w:abstractNum w:abstractNumId="33" w15:restartNumberingAfterBreak="0">
+  <w:abstractNum w:abstractNumId="38" w15:restartNumberingAfterBreak="0">
     <w:nsid w:val="4E282BA0"/>
     <w:multiLevelType w:val="hybridMultilevel"/>
     <w:tmpl w:val="7B2A8EDC"/>
@@ -21698,7 +23873,7 @@
       </w:pPr>
     </w:lvl>
   </w:abstractNum>
-  <w:abstractNum w:abstractNumId="34" w15:restartNumberingAfterBreak="0">
+  <w:abstractNum w:abstractNumId="39" w15:restartNumberingAfterBreak="0">
     <w:nsid w:val="55739BFC"/>
     <w:multiLevelType w:val="hybridMultilevel"/>
     <w:tmpl w:val="A02C6470"/>
@@ -21811,7 +23986,7 @@
       </w:rPr>
     </w:lvl>
   </w:abstractNum>
-  <w:abstractNum w:abstractNumId="35" w15:restartNumberingAfterBreak="0">
+  <w:abstractNum w:abstractNumId="40" w15:restartNumberingAfterBreak="0">
     <w:nsid w:val="56B23B97"/>
     <w:multiLevelType w:val="hybridMultilevel"/>
     <w:tmpl w:val="342E4D7A"/>
@@ -21924,7 +24099,120 @@
       </w:rPr>
     </w:lvl>
   </w:abstractNum>
-  <w:abstractNum w:abstractNumId="36" w15:restartNumberingAfterBreak="0">
+  <w:abstractNum w:abstractNumId="41" w15:restartNumberingAfterBreak="0">
+    <w:nsid w:val="581F6C6C"/>
+    <w:multiLevelType w:val="hybridMultilevel"/>
+    <w:tmpl w:val="87F68C84"/>
+    <w:lvl w:ilvl="0" w:tplc="04160001">
+      <w:start w:val="1"/>
+      <w:numFmt w:val="bullet"/>
+      <w:lvlText w:val=""/>
+      <w:lvlJc w:val="left"/>
+      <w:pPr>
+        <w:ind w:left="1800" w:hanging="360"/>
+      </w:pPr>
+      <w:rPr>
+        <w:rFonts w:ascii="Symbol" w:hAnsi="Symbol" w:hint="default"/>
+      </w:rPr>
+    </w:lvl>
+    <w:lvl w:ilvl="1" w:tplc="04160003" w:tentative="1">
+      <w:start w:val="1"/>
+      <w:numFmt w:val="bullet"/>
+      <w:lvlText w:val="o"/>
+      <w:lvlJc w:val="left"/>
+      <w:pPr>
+        <w:ind w:left="2520" w:hanging="360"/>
+      </w:pPr>
+      <w:rPr>
+        <w:rFonts w:ascii="Courier New" w:hAnsi="Courier New" w:cs="Courier New" w:hint="default"/>
+      </w:rPr>
+    </w:lvl>
+    <w:lvl w:ilvl="2" w:tplc="04160005" w:tentative="1">
+      <w:start w:val="1"/>
+      <w:numFmt w:val="bullet"/>
+      <w:lvlText w:val=""/>
+      <w:lvlJc w:val="left"/>
+      <w:pPr>
+        <w:ind w:left="3240" w:hanging="360"/>
+      </w:pPr>
+      <w:rPr>
+        <w:rFonts w:ascii="Wingdings" w:hAnsi="Wingdings" w:hint="default"/>
+      </w:rPr>
+    </w:lvl>
+    <w:lvl w:ilvl="3" w:tplc="04160001" w:tentative="1">
+      <w:start w:val="1"/>
+      <w:numFmt w:val="bullet"/>
+      <w:lvlText w:val=""/>
+      <w:lvlJc w:val="left"/>
+      <w:pPr>
+        <w:ind w:left="3960" w:hanging="360"/>
+      </w:pPr>
+      <w:rPr>
+        <w:rFonts w:ascii="Symbol" w:hAnsi="Symbol" w:hint="default"/>
+      </w:rPr>
+    </w:lvl>
+    <w:lvl w:ilvl="4" w:tplc="04160003" w:tentative="1">
+      <w:start w:val="1"/>
+      <w:numFmt w:val="bullet"/>
+      <w:lvlText w:val="o"/>
+      <w:lvlJc w:val="left"/>
+      <w:pPr>
+        <w:ind w:left="4680" w:hanging="360"/>
+      </w:pPr>
+      <w:rPr>
+        <w:rFonts w:ascii="Courier New" w:hAnsi="Courier New" w:cs="Courier New" w:hint="default"/>
+      </w:rPr>
+    </w:lvl>
+    <w:lvl w:ilvl="5" w:tplc="04160005" w:tentative="1">
+      <w:start w:val="1"/>
+      <w:numFmt w:val="bullet"/>
+      <w:lvlText w:val=""/>
+      <w:lvlJc w:val="left"/>
+      <w:pPr>
+        <w:ind w:left="5400" w:hanging="360"/>
+      </w:pPr>
+      <w:rPr>
+        <w:rFonts w:ascii="Wingdings" w:hAnsi="Wingdings" w:hint="default"/>
+      </w:rPr>
+    </w:lvl>
+    <w:lvl w:ilvl="6" w:tplc="04160001" w:tentative="1">
+      <w:start w:val="1"/>
+      <w:numFmt w:val="bullet"/>
+      <w:lvlText w:val=""/>
+      <w:lvlJc w:val="left"/>
+      <w:pPr>
+        <w:ind w:left="6120" w:hanging="360"/>
+      </w:pPr>
+      <w:rPr>
+        <w:rFonts w:ascii="Symbol" w:hAnsi="Symbol" w:hint="default"/>
+      </w:rPr>
+    </w:lvl>
+    <w:lvl w:ilvl="7" w:tplc="04160003" w:tentative="1">
+      <w:start w:val="1"/>
+      <w:numFmt w:val="bullet"/>
+      <w:lvlText w:val="o"/>
+      <w:lvlJc w:val="left"/>
+      <w:pPr>
+        <w:ind w:left="6840" w:hanging="360"/>
+      </w:pPr>
+      <w:rPr>
+        <w:rFonts w:ascii="Courier New" w:hAnsi="Courier New" w:cs="Courier New" w:hint="default"/>
+      </w:rPr>
+    </w:lvl>
+    <w:lvl w:ilvl="8" w:tplc="04160005" w:tentative="1">
+      <w:start w:val="1"/>
+      <w:numFmt w:val="bullet"/>
+      <w:lvlText w:val=""/>
+      <w:lvlJc w:val="left"/>
+      <w:pPr>
+        <w:ind w:left="7560" w:hanging="360"/>
+      </w:pPr>
+      <w:rPr>
+        <w:rFonts w:ascii="Wingdings" w:hAnsi="Wingdings" w:hint="default"/>
+      </w:rPr>
+    </w:lvl>
+  </w:abstractNum>
+  <w:abstractNum w:abstractNumId="42" w15:restartNumberingAfterBreak="0">
     <w:nsid w:val="59D46C9D"/>
     <w:multiLevelType w:val="hybridMultilevel"/>
     <w:tmpl w:val="07FA55B6"/>
@@ -22014,7 +24302,7 @@
       </w:pPr>
     </w:lvl>
   </w:abstractNum>
-  <w:abstractNum w:abstractNumId="37" w15:restartNumberingAfterBreak="0">
+  <w:abstractNum w:abstractNumId="43" w15:restartNumberingAfterBreak="0">
     <w:nsid w:val="5F6A1EA8"/>
     <w:multiLevelType w:val="multilevel"/>
     <w:tmpl w:val="7C623276"/>
@@ -22163,7 +24451,7 @@
       </w:rPr>
     </w:lvl>
   </w:abstractNum>
-  <w:abstractNum w:abstractNumId="38" w15:restartNumberingAfterBreak="0">
+  <w:abstractNum w:abstractNumId="44" w15:restartNumberingAfterBreak="0">
     <w:nsid w:val="6315B04D"/>
     <w:multiLevelType w:val="hybridMultilevel"/>
     <w:tmpl w:val="754A1794"/>
@@ -22276,7 +24564,7 @@
       </w:rPr>
     </w:lvl>
   </w:abstractNum>
-  <w:abstractNum w:abstractNumId="39" w15:restartNumberingAfterBreak="0">
+  <w:abstractNum w:abstractNumId="45" w15:restartNumberingAfterBreak="0">
     <w:nsid w:val="66F3F9ED"/>
     <w:multiLevelType w:val="hybridMultilevel"/>
     <w:tmpl w:val="38429AA4"/>
@@ -22362,7 +24650,137 @@
       </w:pPr>
     </w:lvl>
   </w:abstractNum>
-  <w:abstractNum w:abstractNumId="40" w15:restartNumberingAfterBreak="0">
+  <w:abstractNum w:abstractNumId="46" w15:restartNumberingAfterBreak="0">
+    <w:nsid w:val="6A1B6B18"/>
+    <w:multiLevelType w:val="multilevel"/>
+    <w:tmpl w:val="75E8E148"/>
+    <w:lvl w:ilvl="0">
+      <w:start w:val="1"/>
+      <w:numFmt w:val="decimal"/>
+      <w:lvlText w:val="%1."/>
+      <w:lvlJc w:val="left"/>
+      <w:pPr>
+        <w:ind w:left="720" w:hanging="360"/>
+      </w:pPr>
+      <w:rPr>
+        <w:rFonts w:hint="default"/>
+        <w:b/>
+      </w:rPr>
+    </w:lvl>
+    <w:lvl w:ilvl="1">
+      <w:start w:val="1"/>
+      <w:numFmt w:val="decimal"/>
+      <w:isLgl/>
+      <w:lvlText w:val="%1.%2"/>
+      <w:lvlJc w:val="left"/>
+      <w:pPr>
+        <w:ind w:left="1125" w:hanging="405"/>
+      </w:pPr>
+      <w:rPr>
+        <w:rFonts w:hint="default"/>
+        <w:b/>
+      </w:rPr>
+    </w:lvl>
+    <w:lvl w:ilvl="2">
+      <w:start w:val="1"/>
+      <w:numFmt w:val="decimal"/>
+      <w:isLgl/>
+      <w:lvlText w:val="%1.%2.%3"/>
+      <w:lvlJc w:val="left"/>
+      <w:pPr>
+        <w:ind w:left="1800" w:hanging="720"/>
+      </w:pPr>
+      <w:rPr>
+        <w:rFonts w:hint="default"/>
+        <w:b/>
+      </w:rPr>
+    </w:lvl>
+    <w:lvl w:ilvl="3">
+      <w:start w:val="1"/>
+      <w:numFmt w:val="decimal"/>
+      <w:isLgl/>
+      <w:lvlText w:val="%1.%2.%3.%4"/>
+      <w:lvlJc w:val="left"/>
+      <w:pPr>
+        <w:ind w:left="2520" w:hanging="1080"/>
+      </w:pPr>
+      <w:rPr>
+        <w:rFonts w:hint="default"/>
+        <w:b/>
+      </w:rPr>
+    </w:lvl>
+    <w:lvl w:ilvl="4">
+      <w:start w:val="1"/>
+      <w:numFmt w:val="decimal"/>
+      <w:isLgl/>
+      <w:lvlText w:val="%1.%2.%3.%4.%5"/>
+      <w:lvlJc w:val="left"/>
+      <w:pPr>
+        <w:ind w:left="2880" w:hanging="1080"/>
+      </w:pPr>
+      <w:rPr>
+        <w:rFonts w:hint="default"/>
+        <w:b/>
+      </w:rPr>
+    </w:lvl>
+    <w:lvl w:ilvl="5">
+      <w:start w:val="1"/>
+      <w:numFmt w:val="decimal"/>
+      <w:isLgl/>
+      <w:lvlText w:val="%1.%2.%3.%4.%5.%6"/>
+      <w:lvlJc w:val="left"/>
+      <w:pPr>
+        <w:ind w:left="3600" w:hanging="1440"/>
+      </w:pPr>
+      <w:rPr>
+        <w:rFonts w:hint="default"/>
+        <w:b/>
+      </w:rPr>
+    </w:lvl>
+    <w:lvl w:ilvl="6">
+      <w:start w:val="1"/>
+      <w:numFmt w:val="decimal"/>
+      <w:isLgl/>
+      <w:lvlText w:val="%1.%2.%3.%4.%5.%6.%7"/>
+      <w:lvlJc w:val="left"/>
+      <w:pPr>
+        <w:ind w:left="3960" w:hanging="1440"/>
+      </w:pPr>
+      <w:rPr>
+        <w:rFonts w:hint="default"/>
+        <w:b/>
+      </w:rPr>
+    </w:lvl>
+    <w:lvl w:ilvl="7">
+      <w:start w:val="1"/>
+      <w:numFmt w:val="decimal"/>
+      <w:isLgl/>
+      <w:lvlText w:val="%1.%2.%3.%4.%5.%6.%7.%8"/>
+      <w:lvlJc w:val="left"/>
+      <w:pPr>
+        <w:ind w:left="4680" w:hanging="1800"/>
+      </w:pPr>
+      <w:rPr>
+        <w:rFonts w:hint="default"/>
+        <w:b/>
+      </w:rPr>
+    </w:lvl>
+    <w:lvl w:ilvl="8">
+      <w:start w:val="1"/>
+      <w:numFmt w:val="decimal"/>
+      <w:isLgl/>
+      <w:lvlText w:val="%1.%2.%3.%4.%5.%6.%7.%8.%9"/>
+      <w:lvlJc w:val="left"/>
+      <w:pPr>
+        <w:ind w:left="5040" w:hanging="1800"/>
+      </w:pPr>
+      <w:rPr>
+        <w:rFonts w:hint="default"/>
+        <w:b/>
+      </w:rPr>
+    </w:lvl>
+  </w:abstractNum>
+  <w:abstractNum w:abstractNumId="47" w15:restartNumberingAfterBreak="0">
     <w:nsid w:val="71A46CBF"/>
     <w:multiLevelType w:val="hybridMultilevel"/>
     <w:tmpl w:val="768A276C"/>
@@ -22455,7 +24873,7 @@
       </w:pPr>
     </w:lvl>
   </w:abstractNum>
-  <w:abstractNum w:abstractNumId="41" w15:restartNumberingAfterBreak="0">
+  <w:abstractNum w:abstractNumId="48" w15:restartNumberingAfterBreak="0">
     <w:nsid w:val="72625E55"/>
     <w:multiLevelType w:val="multilevel"/>
     <w:tmpl w:val="6F42B1E6"/>
@@ -22572,7 +24990,7 @@
       </w:pPr>
     </w:lvl>
   </w:abstractNum>
-  <w:abstractNum w:abstractNumId="42" w15:restartNumberingAfterBreak="0">
+  <w:abstractNum w:abstractNumId="49" w15:restartNumberingAfterBreak="0">
     <w:nsid w:val="76321FE6"/>
     <w:multiLevelType w:val="multilevel"/>
     <w:tmpl w:val="0A56E050"/>
@@ -22689,7 +25107,7 @@
       </w:pPr>
     </w:lvl>
   </w:abstractNum>
-  <w:abstractNum w:abstractNumId="43" w15:restartNumberingAfterBreak="0">
+  <w:abstractNum w:abstractNumId="50" w15:restartNumberingAfterBreak="0">
     <w:nsid w:val="7F55DF4B"/>
     <w:multiLevelType w:val="hybridMultilevel"/>
     <w:tmpl w:val="2410CCCC"/>
@@ -22802,44 +25220,44 @@
       </w:rPr>
     </w:lvl>
   </w:abstractNum>
-  <w:num w:numId="1" w16cid:durableId="96799763">
+  <w:num w:numId="1">
     <w:abstractNumId w:val="2"/>
   </w:num>
-  <w:num w:numId="2" w16cid:durableId="1073507984">
-    <w:abstractNumId w:val="43"/>
+  <w:num w:numId="2">
+    <w:abstractNumId w:val="50"/>
   </w:num>
-  <w:num w:numId="3" w16cid:durableId="645745314">
+  <w:num w:numId="3">
     <w:abstractNumId w:val="0"/>
   </w:num>
-  <w:num w:numId="4" w16cid:durableId="1176574705">
-    <w:abstractNumId w:val="16"/>
+  <w:num w:numId="4">
+    <w:abstractNumId w:val="19"/>
   </w:num>
-  <w:num w:numId="5" w16cid:durableId="2140567245">
+  <w:num w:numId="5">
+    <w:abstractNumId w:val="29"/>
+  </w:num>
+  <w:num w:numId="6">
     <w:abstractNumId w:val="24"/>
   </w:num>
-  <w:num w:numId="6" w16cid:durableId="2096971530">
-    <w:abstractNumId w:val="21"/>
+  <w:num w:numId="7">
+    <w:abstractNumId w:val="39"/>
   </w:num>
-  <w:num w:numId="7" w16cid:durableId="656807787">
-    <w:abstractNumId w:val="34"/>
+  <w:num w:numId="8">
+    <w:abstractNumId w:val="13"/>
   </w:num>
-  <w:num w:numId="8" w16cid:durableId="483737461">
+  <w:num w:numId="9">
+    <w:abstractNumId w:val="44"/>
+  </w:num>
+  <w:num w:numId="10">
+    <w:abstractNumId w:val="9"/>
+  </w:num>
+  <w:num w:numId="11">
+    <w:abstractNumId w:val="27"/>
+  </w:num>
+  <w:num w:numId="12">
+    <w:abstractNumId w:val="20"/>
+  </w:num>
+  <w:num w:numId="13">
     <w:abstractNumId w:val="11"/>
-  </w:num>
-  <w:num w:numId="9" w16cid:durableId="270208530">
-    <w:abstractNumId w:val="38"/>
-  </w:num>
-  <w:num w:numId="10" w16cid:durableId="1808544895">
-    <w:abstractNumId w:val="8"/>
-  </w:num>
-  <w:num w:numId="11" w16cid:durableId="801195381">
-    <w:abstractNumId w:val="23"/>
-  </w:num>
-  <w:num w:numId="12" w16cid:durableId="1574505251">
-    <w:abstractNumId w:val="17"/>
-  </w:num>
-  <w:num w:numId="13" w16cid:durableId="228537019">
-    <w:abstractNumId w:val="9"/>
     <w:lvlOverride w:ilvl="0">
       <w:startOverride w:val="1"/>
     </w:lvlOverride>
@@ -22868,8 +25286,8 @@
       <w:startOverride w:val="1"/>
     </w:lvlOverride>
   </w:num>
-  <w:num w:numId="14" w16cid:durableId="1172795321">
-    <w:abstractNumId w:val="39"/>
+  <w:num w:numId="14">
+    <w:abstractNumId w:val="45"/>
     <w:lvlOverride w:ilvl="0">
       <w:startOverride w:val="1"/>
     </w:lvlOverride>
@@ -22898,8 +25316,8 @@
       <w:startOverride w:val="1"/>
     </w:lvlOverride>
   </w:num>
-  <w:num w:numId="15" w16cid:durableId="246040703">
-    <w:abstractNumId w:val="19"/>
+  <w:num w:numId="15">
+    <w:abstractNumId w:val="22"/>
     <w:lvlOverride w:ilvl="0">
       <w:startOverride w:val="1"/>
     </w:lvlOverride>
@@ -22928,99 +25346,129 @@
       <w:startOverride w:val="1"/>
     </w:lvlOverride>
   </w:num>
-  <w:num w:numId="16" w16cid:durableId="1638949512">
+  <w:num w:numId="16">
+    <w:abstractNumId w:val="38"/>
+  </w:num>
+  <w:num w:numId="17">
+    <w:abstractNumId w:val="32"/>
+  </w:num>
+  <w:num w:numId="18">
+    <w:abstractNumId w:val="21"/>
+  </w:num>
+  <w:num w:numId="19">
+    <w:abstractNumId w:val="43"/>
+  </w:num>
+  <w:num w:numId="20">
+    <w:abstractNumId w:val="8"/>
+  </w:num>
+  <w:num w:numId="21">
+    <w:abstractNumId w:val="31"/>
+  </w:num>
+  <w:num w:numId="22">
+    <w:abstractNumId w:val="35"/>
+  </w:num>
+  <w:num w:numId="23">
+    <w:abstractNumId w:val="15"/>
+  </w:num>
+  <w:num w:numId="24">
+    <w:abstractNumId w:val="5"/>
+  </w:num>
+  <w:num w:numId="25">
+    <w:abstractNumId w:val="26"/>
+  </w:num>
+  <w:num w:numId="26">
+    <w:abstractNumId w:val="42"/>
+  </w:num>
+  <w:num w:numId="27">
+    <w:abstractNumId w:val="6"/>
+  </w:num>
+  <w:num w:numId="28">
+    <w:abstractNumId w:val="30"/>
+  </w:num>
+  <w:num w:numId="29">
+    <w:abstractNumId w:val="14"/>
+  </w:num>
+  <w:num w:numId="30">
     <w:abstractNumId w:val="33"/>
   </w:num>
-  <w:num w:numId="17" w16cid:durableId="1243028506">
-    <w:abstractNumId w:val="27"/>
+  <w:num w:numId="31">
+    <w:abstractNumId w:val="16"/>
   </w:num>
-  <w:num w:numId="18" w16cid:durableId="1752072110">
+  <w:num w:numId="32">
+    <w:abstractNumId w:val="49"/>
+  </w:num>
+  <w:num w:numId="33">
+    <w:abstractNumId w:val="48"/>
+  </w:num>
+  <w:num w:numId="34">
+    <w:abstractNumId w:val="37"/>
+  </w:num>
+  <w:num w:numId="35">
+    <w:abstractNumId w:val="4"/>
+  </w:num>
+  <w:num w:numId="36">
+    <w:abstractNumId w:val="1"/>
+  </w:num>
+  <w:num w:numId="37">
+    <w:abstractNumId w:val="23"/>
+  </w:num>
+  <w:num w:numId="38">
+    <w:abstractNumId w:val="34"/>
+  </w:num>
+  <w:num w:numId="39">
+    <w:abstractNumId w:val="40"/>
+  </w:num>
+  <w:num w:numId="40">
+    <w:abstractNumId w:val="12"/>
+  </w:num>
+  <w:num w:numId="41">
+    <w:abstractNumId w:val="36"/>
+  </w:num>
+  <w:num w:numId="42">
+    <w:abstractNumId w:val="47"/>
+  </w:num>
+  <w:num w:numId="43">
+    <w:abstractNumId w:val="17"/>
+  </w:num>
+  <w:num w:numId="44">
+    <w:abstractNumId w:val="3"/>
+  </w:num>
+  <w:num w:numId="45">
+    <w:abstractNumId w:val="46"/>
+  </w:num>
+  <w:num w:numId="46">
+    <w:abstractNumId w:val="28"/>
+  </w:num>
+  <w:num w:numId="47">
+    <w:abstractNumId w:val="7"/>
+  </w:num>
+  <w:num w:numId="48">
     <w:abstractNumId w:val="18"/>
   </w:num>
-  <w:num w:numId="19" w16cid:durableId="514851630">
-    <w:abstractNumId w:val="37"/>
+  <w:num w:numId="49">
+    <w:abstractNumId w:val="25"/>
   </w:num>
-  <w:num w:numId="20" w16cid:durableId="1895659207">
-    <w:abstractNumId w:val="7"/>
+  <w:num w:numId="50">
+    <w:abstractNumId w:val="41"/>
   </w:num>
-  <w:num w:numId="21" w16cid:durableId="1127818443">
-    <w:abstractNumId w:val="26"/>
+  <w:num w:numId="51">
+    <w:abstractNumId w:val="10"/>
   </w:num>
-  <w:num w:numId="22" w16cid:durableId="657156422">
-    <w:abstractNumId w:val="30"/>
-  </w:num>
-  <w:num w:numId="23" w16cid:durableId="860166150">
-    <w:abstractNumId w:val="13"/>
-  </w:num>
-  <w:num w:numId="24" w16cid:durableId="825172439">
-    <w:abstractNumId w:val="5"/>
-  </w:num>
-  <w:num w:numId="25" w16cid:durableId="812142943">
+  <w:num w:numId="52">
     <w:abstractNumId w:val="22"/>
   </w:num>
-  <w:num w:numId="26" w16cid:durableId="1659766332">
-    <w:abstractNumId w:val="36"/>
+  <w:num w:numId="53">
+    <w:abstractNumId w:val="45"/>
   </w:num>
-  <w:num w:numId="27" w16cid:durableId="961114300">
-    <w:abstractNumId w:val="6"/>
+  <w:num w:numId="54">
+    <w:abstractNumId w:val="11"/>
   </w:num>
-  <w:num w:numId="28" w16cid:durableId="671566387">
-    <w:abstractNumId w:val="25"/>
-  </w:num>
-  <w:num w:numId="29" w16cid:durableId="1050225511">
-    <w:abstractNumId w:val="12"/>
-  </w:num>
-  <w:num w:numId="30" w16cid:durableId="1327976115">
-    <w:abstractNumId w:val="28"/>
-  </w:num>
-  <w:num w:numId="31" w16cid:durableId="235744707">
-    <w:abstractNumId w:val="14"/>
-  </w:num>
-  <w:num w:numId="32" w16cid:durableId="70280303">
-    <w:abstractNumId w:val="42"/>
-  </w:num>
-  <w:num w:numId="33" w16cid:durableId="912013402">
-    <w:abstractNumId w:val="41"/>
-  </w:num>
-  <w:num w:numId="34" w16cid:durableId="1312638312">
-    <w:abstractNumId w:val="32"/>
-  </w:num>
-  <w:num w:numId="35" w16cid:durableId="1251700637">
-    <w:abstractNumId w:val="4"/>
-  </w:num>
-  <w:num w:numId="36" w16cid:durableId="95560633">
-    <w:abstractNumId w:val="3"/>
-  </w:num>
-  <w:num w:numId="37" w16cid:durableId="1295023737">
-    <w:abstractNumId w:val="1"/>
-  </w:num>
-  <w:num w:numId="38" w16cid:durableId="378211358">
-    <w:abstractNumId w:val="20"/>
-  </w:num>
-  <w:num w:numId="39" w16cid:durableId="1267469879">
-    <w:abstractNumId w:val="29"/>
-  </w:num>
-  <w:num w:numId="40" w16cid:durableId="1162618361">
-    <w:abstractNumId w:val="35"/>
-  </w:num>
-  <w:num w:numId="41" w16cid:durableId="758059201">
-    <w:abstractNumId w:val="10"/>
-  </w:num>
-  <w:num w:numId="42" w16cid:durableId="2081364778">
-    <w:abstractNumId w:val="31"/>
-  </w:num>
-  <w:num w:numId="43" w16cid:durableId="1287542593">
-    <w:abstractNumId w:val="40"/>
-  </w:num>
-  <w:num w:numId="44" w16cid:durableId="803691933">
-    <w:abstractNumId w:val="15"/>
-  </w:num>
-  <w:numIdMacAtCleanup w:val="44"/>
+  <w:numIdMacAtCleanup w:val="54"/>
 </w:numbering>
 </file>
 
 <file path=word/styles.xml><?xml version="1.0" encoding="utf-8"?>
-<w:styles xmlns:mc="http://schemas.openxmlformats.org/markup-compatibility/2006" xmlns:r="http://schemas.openxmlformats.org/officeDocument/2006/relationships" xmlns:w="http://schemas.openxmlformats.org/wordprocessingml/2006/main" xmlns:w14="http://schemas.microsoft.com/office/word/2010/wordml" xmlns:w15="http://schemas.microsoft.com/office/word/2012/wordml" xmlns:w16cex="http://schemas.microsoft.com/office/word/2018/wordml/cex" xmlns:w16cid="http://schemas.microsoft.com/office/word/2016/wordml/cid" xmlns:w16="http://schemas.microsoft.com/office/word/2018/wordml" xmlns:w16du="http://schemas.microsoft.com/office/word/2023/wordml/word16du" xmlns:w16sdtdh="http://schemas.microsoft.com/office/word/2020/wordml/sdtdatahash" xmlns:w16se="http://schemas.microsoft.com/office/word/2015/wordml/symex" mc:Ignorable="w14 w15 w16se w16cid w16 w16cex w16sdtdh w16du">
+<w:styles xmlns:mc="http://schemas.openxmlformats.org/markup-compatibility/2006" xmlns:r="http://schemas.openxmlformats.org/officeDocument/2006/relationships" xmlns:w="http://schemas.openxmlformats.org/wordprocessingml/2006/main" xmlns:w14="http://schemas.microsoft.com/office/word/2010/wordml" xmlns:w15="http://schemas.microsoft.com/office/word/2012/wordml" xmlns:w16cid="http://schemas.microsoft.com/office/word/2016/wordml/cid" xmlns:w16se="http://schemas.microsoft.com/office/word/2015/wordml/symex" mc:Ignorable="w14 w15 w16se w16cid">
   <w:docDefaults>
     <w:rPrDefault>
       <w:rPr>
@@ -23036,7 +25484,7 @@
       </w:pPr>
     </w:pPrDefault>
   </w:docDefaults>
-  <w:latentStyles w:defLockedState="0" w:defUIPriority="99" w:defSemiHidden="0" w:defUnhideWhenUsed="0" w:defQFormat="0" w:count="376">
+  <w:latentStyles w:defLockedState="0" w:defUIPriority="99" w:defSemiHidden="0" w:defUnhideWhenUsed="0" w:defQFormat="0" w:count="375">
     <w:lsdException w:name="Normal" w:uiPriority="0" w:qFormat="1"/>
     <w:lsdException w:name="heading 1" w:uiPriority="9" w:qFormat="1"/>
     <w:lsdException w:name="heading 2" w:semiHidden="1" w:uiPriority="9" w:unhideWhenUsed="1" w:qFormat="1"/>
@@ -23412,7 +25860,6 @@
     <w:lsdException w:name="Smart Hyperlink" w:semiHidden="1" w:unhideWhenUsed="1"/>
     <w:lsdException w:name="Hashtag" w:semiHidden="1" w:unhideWhenUsed="1"/>
     <w:lsdException w:name="Unresolved Mention" w:semiHidden="1" w:unhideWhenUsed="1"/>
-    <w:lsdException w:name="Smart Link" w:semiHidden="1" w:unhideWhenUsed="1"/>
   </w:latentStyles>
   <w:style w:type="paragraph" w:default="1" w:styleId="Normal">
     <w:name w:val="Normal"/>
@@ -26665,7 +29112,7 @@
 </file>
 
 <file path=customXml/itemProps3.xml><?xml version="1.0" encoding="utf-8"?>
-<ds:datastoreItem xmlns:ds="http://schemas.openxmlformats.org/officeDocument/2006/customXml" ds:itemID="{F79FDD8C-2F36-4140-8422-F6209AD28F02}">
+<ds:datastoreItem xmlns:ds="http://schemas.openxmlformats.org/officeDocument/2006/customXml" ds:itemID="{89B79DFA-0C90-44F7-A8C5-F1BAB4568B37}">
   <ds:schemaRefs>
     <ds:schemaRef ds:uri="http://schemas.openxmlformats.org/officeDocument/2006/bibliography"/>
   </ds:schemaRefs>

</xml_diff>

<commit_message>
adicionado plano de testes login e cadastro
</commit_message>
<xml_diff>
--- a/relatório-yourself.docx
+++ b/relatório-yourself.docx
@@ -4,8 +4,6 @@
   <w:body>
     <w:p>
       <w:pPr>
-        <w:spacing w:before="120" w:after="120" w:line="360" w:lineRule="auto"/>
-        <w:jc w:val="center"/>
         <w:rPr>
           <w:rFonts w:ascii="Arial" w:hAnsi="Arial" w:cs="Arial"/>
           <w:sz w:val="28"/>
@@ -2886,7 +2884,23 @@
                 <w:rFonts w:ascii="Arial" w:hAnsi="Arial" w:cs="Arial"/>
                 <w:noProof/>
               </w:rPr>
-              <w:t>8.2.</w:t>
+              <w:t>8</w:t>
+            </w:r>
+            <w:r>
+              <w:rPr>
+                <w:rStyle w:val="Hyperlink"/>
+                <w:rFonts w:ascii="Arial" w:hAnsi="Arial" w:cs="Arial"/>
+                <w:noProof/>
+              </w:rPr>
+              <w:t>.</w:t>
+            </w:r>
+            <w:r>
+              <w:rPr>
+                <w:rStyle w:val="Hyperlink"/>
+                <w:rFonts w:ascii="Arial" w:hAnsi="Arial" w:cs="Arial"/>
+                <w:noProof/>
+              </w:rPr>
+              <w:t>2.</w:t>
             </w:r>
             <w:r>
               <w:rPr>
@@ -15618,8 +15632,6 @@
               </w:rPr>
               <w:t>.</w:t>
             </w:r>
-            <w:bookmarkStart w:id="19" w:name="_GoBack"/>
-            <w:bookmarkEnd w:id="19"/>
           </w:p>
           <w:p>
             <w:pPr>
@@ -16964,7 +16976,7 @@
           <w:szCs w:val="24"/>
         </w:rPr>
       </w:pPr>
-      <w:bookmarkStart w:id="20" w:name="_Toc14160058"/>
+      <w:bookmarkStart w:id="19" w:name="_Toc14160058"/>
       <w:r>
         <w:rPr>
           <w:rFonts w:ascii="Arial" w:hAnsi="Arial" w:cs="Arial"/>
@@ -16974,7 +16986,7 @@
         </w:rPr>
         <w:t>Plano de testes</w:t>
       </w:r>
-      <w:bookmarkEnd w:id="20"/>
+      <w:bookmarkEnd w:id="19"/>
     </w:p>
     <w:p>
       <w:pPr>
@@ -16994,6 +17006,2343 @@
         </w:rPr>
         <w:t>O plano de teste é uma maneira de encontrar defeitos e bugs no sistema para serem futuramente corrigidos. Mesmo que durante a programação sempre foram realizados alguns, ainda sim no plano são realizados testes finais passo a passo.</w:t>
       </w:r>
+    </w:p>
+    <w:p>
+      <w:pPr>
+        <w:spacing w:after="0" w:line="240" w:lineRule="auto"/>
+        <w:textAlignment w:val="baseline"/>
+        <w:rPr>
+          <w:rFonts w:ascii="Segoe UI" w:eastAsia="Times New Roman" w:hAnsi="Segoe UI" w:cs="Segoe UI"/>
+          <w:sz w:val="18"/>
+          <w:szCs w:val="18"/>
+          <w:lang w:eastAsia="pt-BR"/>
+        </w:rPr>
+      </w:pPr>
+      <w:r>
+        <w:rPr>
+          <w:rFonts w:ascii="Arial" w:eastAsia="Times New Roman" w:hAnsi="Arial" w:cs="Arial"/>
+          <w:sz w:val="24"/>
+          <w:szCs w:val="24"/>
+          <w:lang w:eastAsia="pt-BR"/>
+        </w:rPr>
+        <w:t> </w:t>
+      </w:r>
+    </w:p>
+    <w:tbl>
+      <w:tblPr>
+        <w:tblW w:w="0" w:type="dxa"/>
+        <w:tblBorders>
+          <w:top w:val="outset" w:sz="6" w:space="0" w:color="auto"/>
+          <w:left w:val="outset" w:sz="6" w:space="0" w:color="auto"/>
+          <w:bottom w:val="outset" w:sz="6" w:space="0" w:color="auto"/>
+          <w:right w:val="outset" w:sz="6" w:space="0" w:color="auto"/>
+        </w:tblBorders>
+        <w:tblCellMar>
+          <w:left w:w="0" w:type="dxa"/>
+          <w:right w:w="0" w:type="dxa"/>
+        </w:tblCellMar>
+        <w:tblLook w:val="04A0" w:firstRow="1" w:lastRow="0" w:firstColumn="1" w:lastColumn="0" w:noHBand="0" w:noVBand="1"/>
+      </w:tblPr>
+      <w:tblGrid>
+        <w:gridCol w:w="2919"/>
+        <w:gridCol w:w="2918"/>
+        <w:gridCol w:w="2934"/>
+      </w:tblGrid>
+      <w:tr>
+        <w:trPr>
+          <w:trHeight w:val="300"/>
+        </w:trPr>
+        <w:tc>
+          <w:tcPr>
+            <w:tcW w:w="9015" w:type="dxa"/>
+            <w:gridSpan w:val="3"/>
+            <w:tcBorders>
+              <w:top w:val="single" w:sz="6" w:space="0" w:color="000000"/>
+              <w:left w:val="single" w:sz="6" w:space="0" w:color="000000"/>
+              <w:bottom w:val="single" w:sz="6" w:space="0" w:color="000000"/>
+              <w:right w:val="single" w:sz="6" w:space="0" w:color="000000"/>
+            </w:tcBorders>
+            <w:shd w:val="clear" w:color="auto" w:fill="F6C5AC"/>
+            <w:vAlign w:val="center"/>
+            <w:hideMark/>
+          </w:tcPr>
+          <w:p>
+            <w:pPr>
+              <w:spacing w:after="0" w:line="240" w:lineRule="auto"/>
+              <w:jc w:val="center"/>
+              <w:textAlignment w:val="baseline"/>
+              <w:rPr>
+                <w:rFonts w:ascii="Times New Roman" w:eastAsia="Times New Roman" w:hAnsi="Times New Roman" w:cs="Times New Roman"/>
+                <w:sz w:val="24"/>
+                <w:szCs w:val="24"/>
+                <w:lang w:eastAsia="pt-BR"/>
+              </w:rPr>
+            </w:pPr>
+            <w:r>
+              <w:rPr>
+                <w:rFonts w:ascii="Arial" w:eastAsia="Times New Roman" w:hAnsi="Arial" w:cs="Arial"/>
+                <w:sz w:val="28"/>
+                <w:szCs w:val="28"/>
+                <w:lang w:eastAsia="pt-BR"/>
+              </w:rPr>
+              <w:t xml:space="preserve">Plano de Testes de </w:t>
+            </w:r>
+            <w:r>
+              <w:rPr>
+                <w:rFonts w:ascii="Arial" w:eastAsia="Times New Roman" w:hAnsi="Arial" w:cs="Arial"/>
+                <w:sz w:val="28"/>
+                <w:szCs w:val="28"/>
+                <w:lang w:eastAsia="pt-BR"/>
+              </w:rPr>
+              <w:t>Cadastro</w:t>
+            </w:r>
+          </w:p>
+        </w:tc>
+      </w:tr>
+      <w:tr>
+        <w:trPr>
+          <w:trHeight w:val="300"/>
+        </w:trPr>
+        <w:tc>
+          <w:tcPr>
+            <w:tcW w:w="3000" w:type="dxa"/>
+            <w:tcBorders>
+              <w:top w:val="single" w:sz="6" w:space="0" w:color="000000"/>
+              <w:left w:val="single" w:sz="6" w:space="0" w:color="000000"/>
+              <w:bottom w:val="single" w:sz="6" w:space="0" w:color="000000"/>
+              <w:right w:val="single" w:sz="6" w:space="0" w:color="000000"/>
+            </w:tcBorders>
+            <w:shd w:val="clear" w:color="auto" w:fill="auto"/>
+            <w:vAlign w:val="center"/>
+            <w:hideMark/>
+          </w:tcPr>
+          <w:p>
+            <w:pPr>
+              <w:spacing w:after="0" w:line="240" w:lineRule="auto"/>
+              <w:jc w:val="center"/>
+              <w:textAlignment w:val="baseline"/>
+              <w:rPr>
+                <w:rFonts w:ascii="Times New Roman" w:eastAsia="Times New Roman" w:hAnsi="Times New Roman" w:cs="Times New Roman"/>
+                <w:sz w:val="24"/>
+                <w:szCs w:val="24"/>
+                <w:lang w:eastAsia="pt-BR"/>
+              </w:rPr>
+            </w:pPr>
+            <w:r>
+              <w:rPr>
+                <w:rFonts w:ascii="Arial" w:eastAsia="Times New Roman" w:hAnsi="Arial" w:cs="Arial"/>
+                <w:sz w:val="24"/>
+                <w:szCs w:val="24"/>
+                <w:lang w:eastAsia="pt-BR"/>
+              </w:rPr>
+              <w:t>PASSOS </w:t>
+            </w:r>
+          </w:p>
+        </w:tc>
+        <w:tc>
+          <w:tcPr>
+            <w:tcW w:w="3000" w:type="dxa"/>
+            <w:tcBorders>
+              <w:top w:val="single" w:sz="6" w:space="0" w:color="000000"/>
+              <w:left w:val="single" w:sz="6" w:space="0" w:color="000000"/>
+              <w:bottom w:val="single" w:sz="6" w:space="0" w:color="000000"/>
+              <w:right w:val="single" w:sz="6" w:space="0" w:color="000000"/>
+            </w:tcBorders>
+            <w:shd w:val="clear" w:color="auto" w:fill="auto"/>
+            <w:vAlign w:val="center"/>
+            <w:hideMark/>
+          </w:tcPr>
+          <w:p>
+            <w:pPr>
+              <w:spacing w:after="0" w:line="240" w:lineRule="auto"/>
+              <w:jc w:val="center"/>
+              <w:textAlignment w:val="baseline"/>
+              <w:rPr>
+                <w:rFonts w:ascii="Times New Roman" w:eastAsia="Times New Roman" w:hAnsi="Times New Roman" w:cs="Times New Roman"/>
+                <w:sz w:val="24"/>
+                <w:szCs w:val="24"/>
+                <w:lang w:eastAsia="pt-BR"/>
+              </w:rPr>
+            </w:pPr>
+            <w:r>
+              <w:rPr>
+                <w:rFonts w:ascii="Arial" w:eastAsia="Times New Roman" w:hAnsi="Arial" w:cs="Arial"/>
+                <w:sz w:val="24"/>
+                <w:szCs w:val="24"/>
+                <w:lang w:eastAsia="pt-BR"/>
+              </w:rPr>
+              <w:t>RESULTADO ESPERADO </w:t>
+            </w:r>
+          </w:p>
+        </w:tc>
+        <w:tc>
+          <w:tcPr>
+            <w:tcW w:w="3000" w:type="dxa"/>
+            <w:tcBorders>
+              <w:top w:val="single" w:sz="6" w:space="0" w:color="000000"/>
+              <w:left w:val="single" w:sz="6" w:space="0" w:color="000000"/>
+              <w:bottom w:val="single" w:sz="6" w:space="0" w:color="000000"/>
+              <w:right w:val="single" w:sz="6" w:space="0" w:color="000000"/>
+            </w:tcBorders>
+            <w:shd w:val="clear" w:color="auto" w:fill="auto"/>
+            <w:vAlign w:val="center"/>
+            <w:hideMark/>
+          </w:tcPr>
+          <w:p>
+            <w:pPr>
+              <w:spacing w:after="0" w:line="240" w:lineRule="auto"/>
+              <w:jc w:val="center"/>
+              <w:textAlignment w:val="baseline"/>
+              <w:rPr>
+                <w:rFonts w:ascii="Times New Roman" w:eastAsia="Times New Roman" w:hAnsi="Times New Roman" w:cs="Times New Roman"/>
+                <w:sz w:val="24"/>
+                <w:szCs w:val="24"/>
+                <w:lang w:eastAsia="pt-BR"/>
+              </w:rPr>
+            </w:pPr>
+            <w:r>
+              <w:rPr>
+                <w:rFonts w:ascii="Arial" w:eastAsia="Times New Roman" w:hAnsi="Arial" w:cs="Arial"/>
+                <w:sz w:val="24"/>
+                <w:szCs w:val="24"/>
+                <w:lang w:eastAsia="pt-BR"/>
+              </w:rPr>
+              <w:t>RESULTADO OBTIDO </w:t>
+            </w:r>
+          </w:p>
+        </w:tc>
+      </w:tr>
+      <w:tr>
+        <w:trPr>
+          <w:trHeight w:val="300"/>
+        </w:trPr>
+        <w:tc>
+          <w:tcPr>
+            <w:tcW w:w="3000" w:type="dxa"/>
+            <w:tcBorders>
+              <w:top w:val="single" w:sz="6" w:space="0" w:color="000000"/>
+              <w:left w:val="single" w:sz="6" w:space="0" w:color="000000"/>
+              <w:bottom w:val="single" w:sz="6" w:space="0" w:color="000000"/>
+              <w:right w:val="single" w:sz="6" w:space="0" w:color="000000"/>
+            </w:tcBorders>
+            <w:shd w:val="clear" w:color="auto" w:fill="auto"/>
+            <w:vAlign w:val="center"/>
+            <w:hideMark/>
+          </w:tcPr>
+          <w:p>
+            <w:pPr>
+              <w:spacing w:after="0" w:line="240" w:lineRule="auto"/>
+              <w:jc w:val="center"/>
+              <w:textAlignment w:val="baseline"/>
+              <w:rPr>
+                <w:rFonts w:ascii="Times New Roman" w:eastAsia="Times New Roman" w:hAnsi="Times New Roman" w:cs="Times New Roman"/>
+                <w:sz w:val="24"/>
+                <w:szCs w:val="24"/>
+                <w:lang w:eastAsia="pt-BR"/>
+              </w:rPr>
+            </w:pPr>
+            <w:r>
+              <w:rPr>
+                <w:rFonts w:ascii="Arial" w:eastAsia="Times New Roman" w:hAnsi="Arial" w:cs="Arial"/>
+                <w:sz w:val="24"/>
+                <w:szCs w:val="24"/>
+                <w:lang w:eastAsia="pt-BR"/>
+              </w:rPr>
+              <w:lastRenderedPageBreak/>
+              <w:t xml:space="preserve">Deixar os campos </w:t>
+            </w:r>
+            <w:proofErr w:type="spellStart"/>
+            <w:r>
+              <w:rPr>
+                <w:rFonts w:ascii="Arial" w:eastAsia="Times New Roman" w:hAnsi="Arial" w:cs="Arial"/>
+                <w:sz w:val="24"/>
+                <w:szCs w:val="24"/>
+                <w:lang w:eastAsia="pt-BR"/>
+              </w:rPr>
+              <w:t>email</w:t>
+            </w:r>
+            <w:proofErr w:type="spellEnd"/>
+            <w:r>
+              <w:rPr>
+                <w:rFonts w:ascii="Arial" w:eastAsia="Times New Roman" w:hAnsi="Arial" w:cs="Arial"/>
+                <w:sz w:val="24"/>
+                <w:szCs w:val="24"/>
+                <w:lang w:eastAsia="pt-BR"/>
+              </w:rPr>
+              <w:t>, nome, apelido e senha vazios.</w:t>
+            </w:r>
+          </w:p>
+        </w:tc>
+        <w:tc>
+          <w:tcPr>
+            <w:tcW w:w="3000" w:type="dxa"/>
+            <w:tcBorders>
+              <w:top w:val="single" w:sz="6" w:space="0" w:color="000000"/>
+              <w:left w:val="single" w:sz="6" w:space="0" w:color="000000"/>
+              <w:bottom w:val="single" w:sz="6" w:space="0" w:color="000000"/>
+              <w:right w:val="single" w:sz="6" w:space="0" w:color="000000"/>
+            </w:tcBorders>
+            <w:shd w:val="clear" w:color="auto" w:fill="auto"/>
+            <w:vAlign w:val="center"/>
+            <w:hideMark/>
+          </w:tcPr>
+          <w:p>
+            <w:pPr>
+              <w:spacing w:after="0" w:line="240" w:lineRule="auto"/>
+              <w:jc w:val="center"/>
+              <w:textAlignment w:val="baseline"/>
+              <w:rPr>
+                <w:rFonts w:ascii="Times New Roman" w:eastAsia="Times New Roman" w:hAnsi="Times New Roman" w:cs="Times New Roman"/>
+                <w:sz w:val="24"/>
+                <w:szCs w:val="24"/>
+                <w:lang w:eastAsia="pt-BR"/>
+              </w:rPr>
+            </w:pPr>
+            <w:r>
+              <w:rPr>
+                <w:rFonts w:ascii="Arial" w:eastAsia="Times New Roman" w:hAnsi="Arial" w:cs="Arial"/>
+                <w:sz w:val="24"/>
+                <w:szCs w:val="24"/>
+                <w:lang w:eastAsia="pt-BR"/>
+              </w:rPr>
+              <w:t>O sistema deve retornar status 400 e mensagem de erro: "Todos os campos são obrigatórios".</w:t>
+            </w:r>
+          </w:p>
+        </w:tc>
+        <w:tc>
+          <w:tcPr>
+            <w:tcW w:w="3000" w:type="dxa"/>
+            <w:tcBorders>
+              <w:top w:val="single" w:sz="6" w:space="0" w:color="000000"/>
+              <w:left w:val="single" w:sz="6" w:space="0" w:color="000000"/>
+              <w:bottom w:val="single" w:sz="6" w:space="0" w:color="000000"/>
+              <w:right w:val="single" w:sz="6" w:space="0" w:color="000000"/>
+            </w:tcBorders>
+            <w:shd w:val="clear" w:color="auto" w:fill="auto"/>
+            <w:vAlign w:val="center"/>
+            <w:hideMark/>
+          </w:tcPr>
+          <w:p>
+            <w:pPr>
+              <w:spacing w:after="0" w:line="240" w:lineRule="auto"/>
+              <w:jc w:val="center"/>
+              <w:textAlignment w:val="baseline"/>
+              <w:rPr>
+                <w:rFonts w:ascii="Times New Roman" w:eastAsia="Times New Roman" w:hAnsi="Times New Roman" w:cs="Times New Roman"/>
+                <w:sz w:val="24"/>
+                <w:szCs w:val="24"/>
+                <w:lang w:eastAsia="pt-BR"/>
+              </w:rPr>
+            </w:pPr>
+            <w:r>
+              <w:rPr>
+                <w:rFonts w:ascii="Arial" w:eastAsia="Times New Roman" w:hAnsi="Arial" w:cs="Arial"/>
+                <w:sz w:val="24"/>
+                <w:szCs w:val="24"/>
+                <w:lang w:eastAsia="pt-BR"/>
+              </w:rPr>
+              <w:t>O sistema retorna status 400 e mensagem de erro</w:t>
+            </w:r>
+            <w:r>
+              <w:rPr>
+                <w:rFonts w:ascii="Arial" w:eastAsia="Times New Roman" w:hAnsi="Arial" w:cs="Arial"/>
+                <w:sz w:val="24"/>
+                <w:szCs w:val="24"/>
+                <w:lang w:eastAsia="pt-BR"/>
+              </w:rPr>
+              <w:t xml:space="preserve"> (</w:t>
+            </w:r>
+            <w:r>
+              <w:rPr>
+                <w:rFonts w:ascii="Arial" w:eastAsia="Times New Roman" w:hAnsi="Arial" w:cs="Arial"/>
+                <w:sz w:val="24"/>
+                <w:szCs w:val="24"/>
+                <w:lang w:eastAsia="pt-BR"/>
+              </w:rPr>
+              <w:t>"Todos os campos são obrigatórios"</w:t>
+            </w:r>
+            <w:r>
+              <w:rPr>
+                <w:rFonts w:ascii="Arial" w:eastAsia="Times New Roman" w:hAnsi="Arial" w:cs="Arial"/>
+                <w:sz w:val="24"/>
+                <w:szCs w:val="24"/>
+                <w:lang w:eastAsia="pt-BR"/>
+              </w:rPr>
+              <w:t>)</w:t>
+            </w:r>
+            <w:r>
+              <w:rPr>
+                <w:rFonts w:ascii="Arial" w:eastAsia="Times New Roman" w:hAnsi="Arial" w:cs="Arial"/>
+                <w:sz w:val="24"/>
+                <w:szCs w:val="24"/>
+                <w:lang w:eastAsia="pt-BR"/>
+              </w:rPr>
+              <w:t>.</w:t>
+            </w:r>
+          </w:p>
+        </w:tc>
+      </w:tr>
+      <w:tr>
+        <w:trPr>
+          <w:trHeight w:val="300"/>
+        </w:trPr>
+        <w:tc>
+          <w:tcPr>
+            <w:tcW w:w="3000" w:type="dxa"/>
+            <w:tcBorders>
+              <w:top w:val="single" w:sz="6" w:space="0" w:color="000000"/>
+              <w:left w:val="single" w:sz="6" w:space="0" w:color="000000"/>
+              <w:bottom w:val="single" w:sz="6" w:space="0" w:color="000000"/>
+              <w:right w:val="single" w:sz="6" w:space="0" w:color="000000"/>
+            </w:tcBorders>
+            <w:shd w:val="clear" w:color="auto" w:fill="auto"/>
+            <w:vAlign w:val="center"/>
+            <w:hideMark/>
+          </w:tcPr>
+          <w:p>
+            <w:pPr>
+              <w:spacing w:after="0" w:line="240" w:lineRule="auto"/>
+              <w:jc w:val="center"/>
+              <w:textAlignment w:val="baseline"/>
+              <w:rPr>
+                <w:rFonts w:ascii="Times New Roman" w:eastAsia="Times New Roman" w:hAnsi="Times New Roman" w:cs="Times New Roman"/>
+                <w:sz w:val="24"/>
+                <w:szCs w:val="24"/>
+                <w:lang w:eastAsia="pt-BR"/>
+              </w:rPr>
+            </w:pPr>
+            <w:r>
+              <w:rPr>
+                <w:rFonts w:ascii="Arial" w:eastAsia="Times New Roman" w:hAnsi="Arial" w:cs="Arial"/>
+                <w:sz w:val="24"/>
+                <w:szCs w:val="24"/>
+                <w:lang w:eastAsia="pt-BR"/>
+              </w:rPr>
+              <w:t>Digitar uma senha com menos de 6 caracteres.</w:t>
+            </w:r>
+          </w:p>
+        </w:tc>
+        <w:tc>
+          <w:tcPr>
+            <w:tcW w:w="3000" w:type="dxa"/>
+            <w:tcBorders>
+              <w:top w:val="single" w:sz="6" w:space="0" w:color="000000"/>
+              <w:left w:val="single" w:sz="6" w:space="0" w:color="000000"/>
+              <w:bottom w:val="single" w:sz="6" w:space="0" w:color="000000"/>
+              <w:right w:val="single" w:sz="6" w:space="0" w:color="000000"/>
+            </w:tcBorders>
+            <w:shd w:val="clear" w:color="auto" w:fill="auto"/>
+            <w:vAlign w:val="center"/>
+            <w:hideMark/>
+          </w:tcPr>
+          <w:p>
+            <w:pPr>
+              <w:spacing w:after="0" w:line="240" w:lineRule="auto"/>
+              <w:jc w:val="center"/>
+              <w:textAlignment w:val="baseline"/>
+              <w:rPr>
+                <w:rFonts w:ascii="Times New Roman" w:eastAsia="Times New Roman" w:hAnsi="Times New Roman" w:cs="Times New Roman"/>
+                <w:sz w:val="24"/>
+                <w:szCs w:val="24"/>
+                <w:lang w:eastAsia="pt-BR"/>
+              </w:rPr>
+            </w:pPr>
+            <w:r>
+              <w:rPr>
+                <w:rFonts w:ascii="Arial" w:eastAsia="Times New Roman" w:hAnsi="Arial" w:cs="Arial"/>
+                <w:sz w:val="24"/>
+                <w:szCs w:val="24"/>
+                <w:lang w:eastAsia="pt-BR"/>
+              </w:rPr>
+              <w:t>O sistema deve retornar status 400 e mensagem de erro: "A senha deve ter pelo menos 6 caracteres".</w:t>
+            </w:r>
+          </w:p>
+        </w:tc>
+        <w:tc>
+          <w:tcPr>
+            <w:tcW w:w="3000" w:type="dxa"/>
+            <w:tcBorders>
+              <w:top w:val="single" w:sz="6" w:space="0" w:color="000000"/>
+              <w:left w:val="single" w:sz="6" w:space="0" w:color="000000"/>
+              <w:bottom w:val="single" w:sz="6" w:space="0" w:color="000000"/>
+              <w:right w:val="single" w:sz="6" w:space="0" w:color="000000"/>
+            </w:tcBorders>
+            <w:shd w:val="clear" w:color="auto" w:fill="auto"/>
+            <w:vAlign w:val="center"/>
+            <w:hideMark/>
+          </w:tcPr>
+          <w:p>
+            <w:pPr>
+              <w:spacing w:after="0" w:line="240" w:lineRule="auto"/>
+              <w:jc w:val="center"/>
+              <w:textAlignment w:val="baseline"/>
+              <w:rPr>
+                <w:rFonts w:ascii="Times New Roman" w:eastAsia="Times New Roman" w:hAnsi="Times New Roman" w:cs="Times New Roman"/>
+                <w:sz w:val="24"/>
+                <w:szCs w:val="24"/>
+                <w:lang w:eastAsia="pt-BR"/>
+              </w:rPr>
+            </w:pPr>
+            <w:r>
+              <w:rPr>
+                <w:rFonts w:ascii="Arial" w:eastAsia="Times New Roman" w:hAnsi="Arial" w:cs="Arial"/>
+                <w:sz w:val="24"/>
+                <w:szCs w:val="24"/>
+                <w:lang w:eastAsia="pt-BR"/>
+              </w:rPr>
+              <w:t>O sistema retorna status 400 e mensagem de erro</w:t>
+            </w:r>
+            <w:r>
+              <w:rPr>
+                <w:rFonts w:ascii="Arial" w:eastAsia="Times New Roman" w:hAnsi="Arial" w:cs="Arial"/>
+                <w:sz w:val="24"/>
+                <w:szCs w:val="24"/>
+                <w:lang w:eastAsia="pt-BR"/>
+              </w:rPr>
+              <w:t xml:space="preserve"> (</w:t>
+            </w:r>
+            <w:r>
+              <w:rPr>
+                <w:rFonts w:ascii="Arial" w:eastAsia="Times New Roman" w:hAnsi="Arial" w:cs="Arial"/>
+                <w:sz w:val="24"/>
+                <w:szCs w:val="24"/>
+                <w:lang w:eastAsia="pt-BR"/>
+              </w:rPr>
+              <w:t>A senha deve ter pelo menos 6 caracteres</w:t>
+            </w:r>
+            <w:r>
+              <w:rPr>
+                <w:rFonts w:ascii="Arial" w:eastAsia="Times New Roman" w:hAnsi="Arial" w:cs="Arial"/>
+                <w:sz w:val="24"/>
+                <w:szCs w:val="24"/>
+                <w:lang w:eastAsia="pt-BR"/>
+              </w:rPr>
+              <w:t>)</w:t>
+            </w:r>
+            <w:r>
+              <w:rPr>
+                <w:rFonts w:ascii="Arial" w:eastAsia="Times New Roman" w:hAnsi="Arial" w:cs="Arial"/>
+                <w:sz w:val="24"/>
+                <w:szCs w:val="24"/>
+                <w:lang w:eastAsia="pt-BR"/>
+              </w:rPr>
+              <w:t>.</w:t>
+            </w:r>
+          </w:p>
+        </w:tc>
+      </w:tr>
+      <w:tr>
+        <w:trPr>
+          <w:trHeight w:val="300"/>
+        </w:trPr>
+        <w:tc>
+          <w:tcPr>
+            <w:tcW w:w="3000" w:type="dxa"/>
+            <w:tcBorders>
+              <w:top w:val="single" w:sz="6" w:space="0" w:color="000000"/>
+              <w:left w:val="single" w:sz="6" w:space="0" w:color="000000"/>
+              <w:bottom w:val="single" w:sz="6" w:space="0" w:color="000000"/>
+              <w:right w:val="single" w:sz="6" w:space="0" w:color="000000"/>
+            </w:tcBorders>
+            <w:shd w:val="clear" w:color="auto" w:fill="auto"/>
+            <w:vAlign w:val="center"/>
+            <w:hideMark/>
+          </w:tcPr>
+          <w:p>
+            <w:pPr>
+              <w:spacing w:after="0" w:line="240" w:lineRule="auto"/>
+              <w:jc w:val="center"/>
+              <w:textAlignment w:val="baseline"/>
+              <w:rPr>
+                <w:rFonts w:ascii="Times New Roman" w:eastAsia="Times New Roman" w:hAnsi="Times New Roman" w:cs="Times New Roman"/>
+                <w:sz w:val="24"/>
+                <w:szCs w:val="24"/>
+                <w:lang w:eastAsia="pt-BR"/>
+              </w:rPr>
+            </w:pPr>
+            <w:r>
+              <w:rPr>
+                <w:rFonts w:ascii="Arial" w:eastAsia="Times New Roman" w:hAnsi="Arial" w:cs="Arial"/>
+                <w:sz w:val="24"/>
+                <w:szCs w:val="24"/>
+                <w:lang w:eastAsia="pt-BR"/>
+              </w:rPr>
+              <w:t>Usar um apelido já existente.</w:t>
+            </w:r>
+          </w:p>
+        </w:tc>
+        <w:tc>
+          <w:tcPr>
+            <w:tcW w:w="3000" w:type="dxa"/>
+            <w:tcBorders>
+              <w:top w:val="single" w:sz="6" w:space="0" w:color="000000"/>
+              <w:left w:val="single" w:sz="6" w:space="0" w:color="000000"/>
+              <w:bottom w:val="single" w:sz="6" w:space="0" w:color="000000"/>
+              <w:right w:val="single" w:sz="6" w:space="0" w:color="000000"/>
+            </w:tcBorders>
+            <w:shd w:val="clear" w:color="auto" w:fill="auto"/>
+            <w:vAlign w:val="center"/>
+            <w:hideMark/>
+          </w:tcPr>
+          <w:p>
+            <w:pPr>
+              <w:spacing w:after="0" w:line="240" w:lineRule="auto"/>
+              <w:jc w:val="center"/>
+              <w:textAlignment w:val="baseline"/>
+              <w:rPr>
+                <w:rFonts w:ascii="Times New Roman" w:eastAsia="Times New Roman" w:hAnsi="Times New Roman" w:cs="Times New Roman"/>
+                <w:sz w:val="24"/>
+                <w:szCs w:val="24"/>
+                <w:lang w:eastAsia="pt-BR"/>
+              </w:rPr>
+            </w:pPr>
+            <w:r>
+              <w:rPr>
+                <w:rFonts w:ascii="Arial" w:eastAsia="Times New Roman" w:hAnsi="Arial" w:cs="Arial"/>
+                <w:sz w:val="24"/>
+                <w:szCs w:val="24"/>
+                <w:lang w:eastAsia="pt-BR"/>
+              </w:rPr>
+              <w:t>O sistema deve retornar status 400 e mensagem de erro: "Apelido já existe".</w:t>
+            </w:r>
+          </w:p>
+        </w:tc>
+        <w:tc>
+          <w:tcPr>
+            <w:tcW w:w="3000" w:type="dxa"/>
+            <w:tcBorders>
+              <w:top w:val="single" w:sz="6" w:space="0" w:color="000000"/>
+              <w:left w:val="single" w:sz="6" w:space="0" w:color="000000"/>
+              <w:bottom w:val="single" w:sz="6" w:space="0" w:color="000000"/>
+              <w:right w:val="single" w:sz="6" w:space="0" w:color="000000"/>
+            </w:tcBorders>
+            <w:shd w:val="clear" w:color="auto" w:fill="auto"/>
+            <w:vAlign w:val="center"/>
+            <w:hideMark/>
+          </w:tcPr>
+          <w:p>
+            <w:pPr>
+              <w:spacing w:after="0" w:line="240" w:lineRule="auto"/>
+              <w:jc w:val="center"/>
+              <w:textAlignment w:val="baseline"/>
+              <w:rPr>
+                <w:rFonts w:ascii="Times New Roman" w:eastAsia="Times New Roman" w:hAnsi="Times New Roman" w:cs="Times New Roman"/>
+                <w:sz w:val="24"/>
+                <w:szCs w:val="24"/>
+                <w:lang w:eastAsia="pt-BR"/>
+              </w:rPr>
+            </w:pPr>
+            <w:r>
+              <w:rPr>
+                <w:rFonts w:ascii="Arial" w:eastAsia="Times New Roman" w:hAnsi="Arial" w:cs="Arial"/>
+                <w:sz w:val="24"/>
+                <w:szCs w:val="24"/>
+                <w:lang w:eastAsia="pt-BR"/>
+              </w:rPr>
+              <w:t>O sistema retorna status 400 e mensagem de erro</w:t>
+            </w:r>
+            <w:r>
+              <w:rPr>
+                <w:rFonts w:ascii="Arial" w:eastAsia="Times New Roman" w:hAnsi="Arial" w:cs="Arial"/>
+                <w:sz w:val="24"/>
+                <w:szCs w:val="24"/>
+                <w:lang w:eastAsia="pt-BR"/>
+              </w:rPr>
+              <w:t xml:space="preserve"> (</w:t>
+            </w:r>
+            <w:r>
+              <w:rPr>
+                <w:rFonts w:ascii="Arial" w:eastAsia="Times New Roman" w:hAnsi="Arial" w:cs="Arial"/>
+                <w:sz w:val="24"/>
+                <w:szCs w:val="24"/>
+                <w:lang w:eastAsia="pt-BR"/>
+              </w:rPr>
+              <w:t>Apelido já existe</w:t>
+            </w:r>
+            <w:r>
+              <w:rPr>
+                <w:rFonts w:ascii="Arial" w:eastAsia="Times New Roman" w:hAnsi="Arial" w:cs="Arial"/>
+                <w:sz w:val="24"/>
+                <w:szCs w:val="24"/>
+                <w:lang w:eastAsia="pt-BR"/>
+              </w:rPr>
+              <w:t>)</w:t>
+            </w:r>
+            <w:r>
+              <w:rPr>
+                <w:rFonts w:ascii="Arial" w:eastAsia="Times New Roman" w:hAnsi="Arial" w:cs="Arial"/>
+                <w:sz w:val="24"/>
+                <w:szCs w:val="24"/>
+                <w:lang w:eastAsia="pt-BR"/>
+              </w:rPr>
+              <w:t>.</w:t>
+            </w:r>
+          </w:p>
+        </w:tc>
+      </w:tr>
+      <w:tr>
+        <w:trPr>
+          <w:trHeight w:val="300"/>
+        </w:trPr>
+        <w:tc>
+          <w:tcPr>
+            <w:tcW w:w="3000" w:type="dxa"/>
+            <w:tcBorders>
+              <w:top w:val="single" w:sz="6" w:space="0" w:color="000000"/>
+              <w:left w:val="single" w:sz="6" w:space="0" w:color="000000"/>
+              <w:bottom w:val="single" w:sz="6" w:space="0" w:color="000000"/>
+              <w:right w:val="single" w:sz="6" w:space="0" w:color="000000"/>
+            </w:tcBorders>
+            <w:shd w:val="clear" w:color="auto" w:fill="auto"/>
+            <w:vAlign w:val="center"/>
+            <w:hideMark/>
+          </w:tcPr>
+          <w:p>
+            <w:pPr>
+              <w:spacing w:after="0" w:line="240" w:lineRule="auto"/>
+              <w:jc w:val="center"/>
+              <w:textAlignment w:val="baseline"/>
+              <w:rPr>
+                <w:rFonts w:ascii="Times New Roman" w:eastAsia="Times New Roman" w:hAnsi="Times New Roman" w:cs="Times New Roman"/>
+                <w:sz w:val="24"/>
+                <w:szCs w:val="24"/>
+                <w:lang w:eastAsia="pt-BR"/>
+              </w:rPr>
+            </w:pPr>
+            <w:r>
+              <w:rPr>
+                <w:rFonts w:ascii="Arial" w:eastAsia="Times New Roman" w:hAnsi="Arial" w:cs="Arial"/>
+                <w:sz w:val="24"/>
+                <w:szCs w:val="24"/>
+                <w:lang w:eastAsia="pt-BR"/>
+              </w:rPr>
+              <w:t xml:space="preserve">Usar um </w:t>
+            </w:r>
+            <w:proofErr w:type="spellStart"/>
+            <w:r>
+              <w:rPr>
+                <w:rFonts w:ascii="Arial" w:eastAsia="Times New Roman" w:hAnsi="Arial" w:cs="Arial"/>
+                <w:sz w:val="24"/>
+                <w:szCs w:val="24"/>
+                <w:lang w:eastAsia="pt-BR"/>
+              </w:rPr>
+              <w:t>email</w:t>
+            </w:r>
+            <w:proofErr w:type="spellEnd"/>
+            <w:r>
+              <w:rPr>
+                <w:rFonts w:ascii="Arial" w:eastAsia="Times New Roman" w:hAnsi="Arial" w:cs="Arial"/>
+                <w:sz w:val="24"/>
+                <w:szCs w:val="24"/>
+                <w:lang w:eastAsia="pt-BR"/>
+              </w:rPr>
+              <w:t xml:space="preserve"> já cadastrado.</w:t>
+            </w:r>
+          </w:p>
+        </w:tc>
+        <w:tc>
+          <w:tcPr>
+            <w:tcW w:w="3000" w:type="dxa"/>
+            <w:tcBorders>
+              <w:top w:val="single" w:sz="6" w:space="0" w:color="000000"/>
+              <w:left w:val="single" w:sz="6" w:space="0" w:color="000000"/>
+              <w:bottom w:val="single" w:sz="6" w:space="0" w:color="000000"/>
+              <w:right w:val="single" w:sz="6" w:space="0" w:color="000000"/>
+            </w:tcBorders>
+            <w:shd w:val="clear" w:color="auto" w:fill="auto"/>
+            <w:vAlign w:val="center"/>
+            <w:hideMark/>
+          </w:tcPr>
+          <w:p>
+            <w:pPr>
+              <w:spacing w:after="0" w:line="240" w:lineRule="auto"/>
+              <w:jc w:val="center"/>
+              <w:textAlignment w:val="baseline"/>
+              <w:rPr>
+                <w:rFonts w:ascii="Times New Roman" w:eastAsia="Times New Roman" w:hAnsi="Times New Roman" w:cs="Times New Roman"/>
+                <w:sz w:val="24"/>
+                <w:szCs w:val="24"/>
+                <w:lang w:eastAsia="pt-BR"/>
+              </w:rPr>
+            </w:pPr>
+            <w:r>
+              <w:rPr>
+                <w:rFonts w:ascii="Arial" w:eastAsia="Times New Roman" w:hAnsi="Arial" w:cs="Arial"/>
+                <w:sz w:val="24"/>
+                <w:szCs w:val="24"/>
+                <w:lang w:eastAsia="pt-BR"/>
+              </w:rPr>
+              <w:t>O sistema deve retornar status 400 e mensagem de erro: "Usuário já cadastrado".</w:t>
+            </w:r>
+          </w:p>
+        </w:tc>
+        <w:tc>
+          <w:tcPr>
+            <w:tcW w:w="3000" w:type="dxa"/>
+            <w:tcBorders>
+              <w:top w:val="single" w:sz="6" w:space="0" w:color="000000"/>
+              <w:left w:val="single" w:sz="6" w:space="0" w:color="000000"/>
+              <w:bottom w:val="single" w:sz="6" w:space="0" w:color="000000"/>
+              <w:right w:val="single" w:sz="6" w:space="0" w:color="000000"/>
+            </w:tcBorders>
+            <w:shd w:val="clear" w:color="auto" w:fill="auto"/>
+            <w:vAlign w:val="center"/>
+            <w:hideMark/>
+          </w:tcPr>
+          <w:p>
+            <w:pPr>
+              <w:spacing w:after="0" w:line="240" w:lineRule="auto"/>
+              <w:jc w:val="center"/>
+              <w:textAlignment w:val="baseline"/>
+              <w:rPr>
+                <w:rFonts w:ascii="Times New Roman" w:eastAsia="Times New Roman" w:hAnsi="Times New Roman" w:cs="Times New Roman"/>
+                <w:sz w:val="24"/>
+                <w:szCs w:val="24"/>
+                <w:lang w:eastAsia="pt-BR"/>
+              </w:rPr>
+            </w:pPr>
+            <w:r>
+              <w:rPr>
+                <w:rFonts w:ascii="Arial" w:eastAsia="Times New Roman" w:hAnsi="Arial" w:cs="Arial"/>
+                <w:sz w:val="24"/>
+                <w:szCs w:val="24"/>
+                <w:lang w:eastAsia="pt-BR"/>
+              </w:rPr>
+              <w:t>O sistema retorna status 400 e mensagem de erro</w:t>
+            </w:r>
+            <w:r>
+              <w:rPr>
+                <w:rFonts w:ascii="Arial" w:eastAsia="Times New Roman" w:hAnsi="Arial" w:cs="Arial"/>
+                <w:sz w:val="24"/>
+                <w:szCs w:val="24"/>
+                <w:lang w:eastAsia="pt-BR"/>
+              </w:rPr>
+              <w:t xml:space="preserve"> (</w:t>
+            </w:r>
+            <w:r>
+              <w:rPr>
+                <w:rFonts w:ascii="Arial" w:eastAsia="Times New Roman" w:hAnsi="Arial" w:cs="Arial"/>
+                <w:sz w:val="24"/>
+                <w:szCs w:val="24"/>
+                <w:lang w:eastAsia="pt-BR"/>
+              </w:rPr>
+              <w:t>Usuário já cadastrado</w:t>
+            </w:r>
+            <w:r>
+              <w:rPr>
+                <w:rFonts w:ascii="Arial" w:eastAsia="Times New Roman" w:hAnsi="Arial" w:cs="Arial"/>
+                <w:sz w:val="24"/>
+                <w:szCs w:val="24"/>
+                <w:lang w:eastAsia="pt-BR"/>
+              </w:rPr>
+              <w:t>)</w:t>
+            </w:r>
+            <w:r>
+              <w:rPr>
+                <w:rFonts w:ascii="Arial" w:eastAsia="Times New Roman" w:hAnsi="Arial" w:cs="Arial"/>
+                <w:sz w:val="24"/>
+                <w:szCs w:val="24"/>
+                <w:lang w:eastAsia="pt-BR"/>
+              </w:rPr>
+              <w:t>.</w:t>
+            </w:r>
+          </w:p>
+        </w:tc>
+      </w:tr>
+      <w:tr>
+        <w:trPr>
+          <w:trHeight w:val="300"/>
+        </w:trPr>
+        <w:tc>
+          <w:tcPr>
+            <w:tcW w:w="3000" w:type="dxa"/>
+            <w:tcBorders>
+              <w:top w:val="single" w:sz="6" w:space="0" w:color="000000"/>
+              <w:left w:val="single" w:sz="6" w:space="0" w:color="000000"/>
+              <w:bottom w:val="single" w:sz="6" w:space="0" w:color="000000"/>
+              <w:right w:val="single" w:sz="6" w:space="0" w:color="000000"/>
+            </w:tcBorders>
+            <w:shd w:val="clear" w:color="auto" w:fill="auto"/>
+            <w:vAlign w:val="center"/>
+            <w:hideMark/>
+          </w:tcPr>
+          <w:p>
+            <w:pPr>
+              <w:spacing w:after="0" w:line="240" w:lineRule="auto"/>
+              <w:jc w:val="center"/>
+              <w:textAlignment w:val="baseline"/>
+              <w:rPr>
+                <w:rFonts w:ascii="Times New Roman" w:eastAsia="Times New Roman" w:hAnsi="Times New Roman" w:cs="Times New Roman"/>
+                <w:sz w:val="24"/>
+                <w:szCs w:val="24"/>
+                <w:lang w:eastAsia="pt-BR"/>
+              </w:rPr>
+            </w:pPr>
+            <w:r>
+              <w:rPr>
+                <w:rFonts w:ascii="Arial" w:eastAsia="Times New Roman" w:hAnsi="Arial" w:cs="Arial"/>
+                <w:sz w:val="24"/>
+                <w:szCs w:val="24"/>
+                <w:lang w:eastAsia="pt-BR"/>
+              </w:rPr>
+              <w:t>Preencher todos os campos corretamente.</w:t>
+            </w:r>
+          </w:p>
+        </w:tc>
+        <w:tc>
+          <w:tcPr>
+            <w:tcW w:w="3000" w:type="dxa"/>
+            <w:tcBorders>
+              <w:top w:val="single" w:sz="6" w:space="0" w:color="000000"/>
+              <w:left w:val="single" w:sz="6" w:space="0" w:color="000000"/>
+              <w:bottom w:val="single" w:sz="6" w:space="0" w:color="000000"/>
+              <w:right w:val="single" w:sz="6" w:space="0" w:color="000000"/>
+            </w:tcBorders>
+            <w:shd w:val="clear" w:color="auto" w:fill="auto"/>
+            <w:vAlign w:val="center"/>
+            <w:hideMark/>
+          </w:tcPr>
+          <w:p>
+            <w:pPr>
+              <w:spacing w:after="0" w:line="240" w:lineRule="auto"/>
+              <w:jc w:val="center"/>
+              <w:textAlignment w:val="baseline"/>
+              <w:rPr>
+                <w:rFonts w:ascii="Times New Roman" w:eastAsia="Times New Roman" w:hAnsi="Times New Roman" w:cs="Times New Roman"/>
+                <w:sz w:val="24"/>
+                <w:szCs w:val="24"/>
+                <w:lang w:eastAsia="pt-BR"/>
+              </w:rPr>
+            </w:pPr>
+            <w:r>
+              <w:rPr>
+                <w:rFonts w:ascii="Arial" w:eastAsia="Times New Roman" w:hAnsi="Arial" w:cs="Arial"/>
+                <w:sz w:val="24"/>
+                <w:szCs w:val="24"/>
+                <w:lang w:eastAsia="pt-BR"/>
+              </w:rPr>
+              <w:t>O sistema deve chamar o próximo middleware, permitindo o cadastro do usuário.</w:t>
+            </w:r>
+          </w:p>
+        </w:tc>
+        <w:tc>
+          <w:tcPr>
+            <w:tcW w:w="3000" w:type="dxa"/>
+            <w:tcBorders>
+              <w:top w:val="single" w:sz="6" w:space="0" w:color="000000"/>
+              <w:left w:val="single" w:sz="6" w:space="0" w:color="000000"/>
+              <w:bottom w:val="single" w:sz="6" w:space="0" w:color="000000"/>
+              <w:right w:val="single" w:sz="6" w:space="0" w:color="000000"/>
+            </w:tcBorders>
+            <w:shd w:val="clear" w:color="auto" w:fill="auto"/>
+            <w:vAlign w:val="center"/>
+            <w:hideMark/>
+          </w:tcPr>
+          <w:p>
+            <w:pPr>
+              <w:spacing w:after="0" w:line="240" w:lineRule="auto"/>
+              <w:jc w:val="center"/>
+              <w:textAlignment w:val="baseline"/>
+              <w:rPr>
+                <w:rFonts w:ascii="Times New Roman" w:eastAsia="Times New Roman" w:hAnsi="Times New Roman" w:cs="Times New Roman"/>
+                <w:sz w:val="24"/>
+                <w:szCs w:val="24"/>
+                <w:lang w:eastAsia="pt-BR"/>
+              </w:rPr>
+            </w:pPr>
+            <w:r>
+              <w:rPr>
+                <w:rFonts w:ascii="Arial" w:eastAsia="Times New Roman" w:hAnsi="Arial" w:cs="Arial"/>
+                <w:sz w:val="24"/>
+                <w:szCs w:val="24"/>
+                <w:lang w:eastAsia="pt-BR"/>
+              </w:rPr>
+              <w:t>O sistema chama o próximo middleware.</w:t>
+            </w:r>
+          </w:p>
+        </w:tc>
+      </w:tr>
+      <w:tr>
+        <w:trPr>
+          <w:trHeight w:val="300"/>
+        </w:trPr>
+        <w:tc>
+          <w:tcPr>
+            <w:tcW w:w="3000" w:type="dxa"/>
+            <w:tcBorders>
+              <w:top w:val="single" w:sz="6" w:space="0" w:color="000000"/>
+              <w:left w:val="single" w:sz="6" w:space="0" w:color="000000"/>
+              <w:bottom w:val="single" w:sz="6" w:space="0" w:color="000000"/>
+              <w:right w:val="single" w:sz="6" w:space="0" w:color="000000"/>
+            </w:tcBorders>
+            <w:shd w:val="clear" w:color="auto" w:fill="auto"/>
+            <w:vAlign w:val="center"/>
+            <w:hideMark/>
+          </w:tcPr>
+          <w:p>
+            <w:pPr>
+              <w:spacing w:after="0" w:line="240" w:lineRule="auto"/>
+              <w:jc w:val="center"/>
+              <w:textAlignment w:val="baseline"/>
+              <w:rPr>
+                <w:rFonts w:ascii="Times New Roman" w:eastAsia="Times New Roman" w:hAnsi="Times New Roman" w:cs="Times New Roman"/>
+                <w:sz w:val="24"/>
+                <w:szCs w:val="24"/>
+                <w:lang w:eastAsia="pt-BR"/>
+              </w:rPr>
+            </w:pPr>
+            <w:r>
+              <w:rPr>
+                <w:rFonts w:ascii="Arial" w:eastAsia="Times New Roman" w:hAnsi="Arial" w:cs="Arial"/>
+                <w:sz w:val="24"/>
+                <w:szCs w:val="24"/>
+                <w:lang w:eastAsia="pt-BR"/>
+              </w:rPr>
+              <w:t>Deixar o campo apelido vazio, mas preencher os outros campos.</w:t>
+            </w:r>
+          </w:p>
+        </w:tc>
+        <w:tc>
+          <w:tcPr>
+            <w:tcW w:w="3000" w:type="dxa"/>
+            <w:tcBorders>
+              <w:top w:val="single" w:sz="6" w:space="0" w:color="000000"/>
+              <w:left w:val="single" w:sz="6" w:space="0" w:color="000000"/>
+              <w:bottom w:val="single" w:sz="6" w:space="0" w:color="000000"/>
+              <w:right w:val="single" w:sz="6" w:space="0" w:color="000000"/>
+            </w:tcBorders>
+            <w:shd w:val="clear" w:color="auto" w:fill="auto"/>
+            <w:vAlign w:val="center"/>
+            <w:hideMark/>
+          </w:tcPr>
+          <w:p>
+            <w:pPr>
+              <w:spacing w:after="0" w:line="240" w:lineRule="auto"/>
+              <w:jc w:val="center"/>
+              <w:textAlignment w:val="baseline"/>
+              <w:rPr>
+                <w:rFonts w:ascii="Times New Roman" w:eastAsia="Times New Roman" w:hAnsi="Times New Roman" w:cs="Times New Roman"/>
+                <w:sz w:val="24"/>
+                <w:szCs w:val="24"/>
+                <w:lang w:eastAsia="pt-BR"/>
+              </w:rPr>
+            </w:pPr>
+            <w:r>
+              <w:rPr>
+                <w:rFonts w:ascii="Arial" w:eastAsia="Times New Roman" w:hAnsi="Arial" w:cs="Arial"/>
+                <w:sz w:val="24"/>
+                <w:szCs w:val="24"/>
+                <w:lang w:eastAsia="pt-BR"/>
+              </w:rPr>
+              <w:t>O sistema deve retornar status 400 e mensagem de erro: "Todos os campos são obrigatórios".</w:t>
+            </w:r>
+          </w:p>
+        </w:tc>
+        <w:tc>
+          <w:tcPr>
+            <w:tcW w:w="3000" w:type="dxa"/>
+            <w:tcBorders>
+              <w:top w:val="single" w:sz="6" w:space="0" w:color="000000"/>
+              <w:left w:val="single" w:sz="6" w:space="0" w:color="000000"/>
+              <w:bottom w:val="single" w:sz="6" w:space="0" w:color="000000"/>
+              <w:right w:val="single" w:sz="6" w:space="0" w:color="000000"/>
+            </w:tcBorders>
+            <w:shd w:val="clear" w:color="auto" w:fill="auto"/>
+            <w:vAlign w:val="center"/>
+            <w:hideMark/>
+          </w:tcPr>
+          <w:p>
+            <w:pPr>
+              <w:spacing w:after="0" w:line="240" w:lineRule="auto"/>
+              <w:jc w:val="center"/>
+              <w:textAlignment w:val="baseline"/>
+              <w:rPr>
+                <w:rFonts w:ascii="Times New Roman" w:eastAsia="Times New Roman" w:hAnsi="Times New Roman" w:cs="Times New Roman"/>
+                <w:sz w:val="24"/>
+                <w:szCs w:val="24"/>
+                <w:lang w:eastAsia="pt-BR"/>
+              </w:rPr>
+            </w:pPr>
+            <w:r>
+              <w:rPr>
+                <w:rFonts w:ascii="Arial" w:eastAsia="Times New Roman" w:hAnsi="Arial" w:cs="Arial"/>
+                <w:sz w:val="24"/>
+                <w:szCs w:val="24"/>
+                <w:lang w:eastAsia="pt-BR"/>
+              </w:rPr>
+              <w:t>O sistema retorna status 400 e mensagem de erro</w:t>
+            </w:r>
+            <w:r>
+              <w:rPr>
+                <w:rFonts w:ascii="Arial" w:eastAsia="Times New Roman" w:hAnsi="Arial" w:cs="Arial"/>
+                <w:sz w:val="24"/>
+                <w:szCs w:val="24"/>
+                <w:lang w:eastAsia="pt-BR"/>
+              </w:rPr>
+              <w:t xml:space="preserve"> (</w:t>
+            </w:r>
+            <w:r>
+              <w:rPr>
+                <w:rFonts w:ascii="Arial" w:eastAsia="Times New Roman" w:hAnsi="Arial" w:cs="Arial"/>
+                <w:sz w:val="24"/>
+                <w:szCs w:val="24"/>
+                <w:lang w:eastAsia="pt-BR"/>
+              </w:rPr>
+              <w:t>Todos os campos são obrigatórios</w:t>
+            </w:r>
+            <w:r>
+              <w:rPr>
+                <w:rFonts w:ascii="Arial" w:eastAsia="Times New Roman" w:hAnsi="Arial" w:cs="Arial"/>
+                <w:sz w:val="24"/>
+                <w:szCs w:val="24"/>
+                <w:lang w:eastAsia="pt-BR"/>
+              </w:rPr>
+              <w:t>)</w:t>
+            </w:r>
+            <w:r>
+              <w:rPr>
+                <w:rFonts w:ascii="Arial" w:eastAsia="Times New Roman" w:hAnsi="Arial" w:cs="Arial"/>
+                <w:sz w:val="24"/>
+                <w:szCs w:val="24"/>
+                <w:lang w:eastAsia="pt-BR"/>
+              </w:rPr>
+              <w:t>.</w:t>
+            </w:r>
+          </w:p>
+        </w:tc>
+      </w:tr>
+      <w:tr>
+        <w:trPr>
+          <w:trHeight w:val="300"/>
+        </w:trPr>
+        <w:tc>
+          <w:tcPr>
+            <w:tcW w:w="3000" w:type="dxa"/>
+            <w:tcBorders>
+              <w:top w:val="single" w:sz="6" w:space="0" w:color="000000"/>
+              <w:left w:val="single" w:sz="6" w:space="0" w:color="000000"/>
+              <w:bottom w:val="single" w:sz="6" w:space="0" w:color="000000"/>
+              <w:right w:val="single" w:sz="6" w:space="0" w:color="000000"/>
+            </w:tcBorders>
+            <w:shd w:val="clear" w:color="auto" w:fill="auto"/>
+            <w:vAlign w:val="center"/>
+          </w:tcPr>
+          <w:p>
+            <w:pPr>
+              <w:spacing w:after="0" w:line="240" w:lineRule="auto"/>
+              <w:jc w:val="center"/>
+              <w:textAlignment w:val="baseline"/>
+              <w:rPr>
+                <w:rFonts w:ascii="Arial" w:eastAsia="Times New Roman" w:hAnsi="Arial" w:cs="Arial"/>
+                <w:sz w:val="24"/>
+                <w:szCs w:val="24"/>
+                <w:lang w:eastAsia="pt-BR"/>
+              </w:rPr>
+            </w:pPr>
+            <w:r>
+              <w:rPr>
+                <w:rFonts w:ascii="Arial" w:eastAsia="Times New Roman" w:hAnsi="Arial" w:cs="Arial"/>
+                <w:sz w:val="24"/>
+                <w:szCs w:val="24"/>
+                <w:lang w:eastAsia="pt-BR"/>
+              </w:rPr>
+              <w:t>Deixar o campo senha vazio, mas preencher os outros campos.</w:t>
+            </w:r>
+          </w:p>
+        </w:tc>
+        <w:tc>
+          <w:tcPr>
+            <w:tcW w:w="3000" w:type="dxa"/>
+            <w:tcBorders>
+              <w:top w:val="single" w:sz="6" w:space="0" w:color="000000"/>
+              <w:left w:val="single" w:sz="6" w:space="0" w:color="000000"/>
+              <w:bottom w:val="single" w:sz="6" w:space="0" w:color="000000"/>
+              <w:right w:val="single" w:sz="6" w:space="0" w:color="000000"/>
+            </w:tcBorders>
+            <w:shd w:val="clear" w:color="auto" w:fill="auto"/>
+            <w:vAlign w:val="center"/>
+          </w:tcPr>
+          <w:p>
+            <w:pPr>
+              <w:spacing w:after="0" w:line="240" w:lineRule="auto"/>
+              <w:jc w:val="center"/>
+              <w:textAlignment w:val="baseline"/>
+              <w:rPr>
+                <w:rFonts w:ascii="Arial" w:eastAsia="Times New Roman" w:hAnsi="Arial" w:cs="Arial"/>
+                <w:sz w:val="24"/>
+                <w:szCs w:val="24"/>
+                <w:lang w:eastAsia="pt-BR"/>
+              </w:rPr>
+            </w:pPr>
+            <w:r>
+              <w:rPr>
+                <w:rFonts w:ascii="Arial" w:eastAsia="Times New Roman" w:hAnsi="Arial" w:cs="Arial"/>
+                <w:sz w:val="24"/>
+                <w:szCs w:val="24"/>
+                <w:lang w:eastAsia="pt-BR"/>
+              </w:rPr>
+              <w:t>O sistema deve retornar status 400 e mensagem de erro: "Todos os campos são obrigatórios".</w:t>
+            </w:r>
+          </w:p>
+        </w:tc>
+        <w:tc>
+          <w:tcPr>
+            <w:tcW w:w="3000" w:type="dxa"/>
+            <w:tcBorders>
+              <w:top w:val="single" w:sz="6" w:space="0" w:color="000000"/>
+              <w:left w:val="single" w:sz="6" w:space="0" w:color="000000"/>
+              <w:bottom w:val="single" w:sz="6" w:space="0" w:color="000000"/>
+              <w:right w:val="single" w:sz="6" w:space="0" w:color="000000"/>
+            </w:tcBorders>
+            <w:shd w:val="clear" w:color="auto" w:fill="auto"/>
+            <w:vAlign w:val="center"/>
+          </w:tcPr>
+          <w:p>
+            <w:pPr>
+              <w:spacing w:after="0" w:line="240" w:lineRule="auto"/>
+              <w:jc w:val="center"/>
+              <w:textAlignment w:val="baseline"/>
+              <w:rPr>
+                <w:rFonts w:ascii="Arial" w:eastAsia="Times New Roman" w:hAnsi="Arial" w:cs="Arial"/>
+                <w:sz w:val="24"/>
+                <w:szCs w:val="24"/>
+                <w:lang w:eastAsia="pt-BR"/>
+              </w:rPr>
+            </w:pPr>
+            <w:r>
+              <w:rPr>
+                <w:rFonts w:ascii="Arial" w:eastAsia="Times New Roman" w:hAnsi="Arial" w:cs="Arial"/>
+                <w:sz w:val="24"/>
+                <w:szCs w:val="24"/>
+                <w:lang w:eastAsia="pt-BR"/>
+              </w:rPr>
+              <w:t>O sistema retorna status 400 e mensagem de erro</w:t>
+            </w:r>
+            <w:r>
+              <w:rPr>
+                <w:rFonts w:ascii="Arial" w:eastAsia="Times New Roman" w:hAnsi="Arial" w:cs="Arial"/>
+                <w:sz w:val="24"/>
+                <w:szCs w:val="24"/>
+                <w:lang w:eastAsia="pt-BR"/>
+              </w:rPr>
+              <w:t xml:space="preserve"> (</w:t>
+            </w:r>
+            <w:r>
+              <w:rPr>
+                <w:rFonts w:ascii="Arial" w:eastAsia="Times New Roman" w:hAnsi="Arial" w:cs="Arial"/>
+                <w:sz w:val="24"/>
+                <w:szCs w:val="24"/>
+                <w:lang w:eastAsia="pt-BR"/>
+              </w:rPr>
+              <w:t>Todos os campos são obrigatórios.</w:t>
+            </w:r>
+            <w:r>
+              <w:rPr>
+                <w:rFonts w:ascii="Arial" w:eastAsia="Times New Roman" w:hAnsi="Arial" w:cs="Arial"/>
+                <w:sz w:val="24"/>
+                <w:szCs w:val="24"/>
+                <w:lang w:eastAsia="pt-BR"/>
+              </w:rPr>
+              <w:t>)</w:t>
+            </w:r>
+            <w:r>
+              <w:rPr>
+                <w:rFonts w:ascii="Arial" w:eastAsia="Times New Roman" w:hAnsi="Arial" w:cs="Arial"/>
+                <w:sz w:val="24"/>
+                <w:szCs w:val="24"/>
+                <w:lang w:eastAsia="pt-BR"/>
+              </w:rPr>
+              <w:t>.</w:t>
+            </w:r>
+          </w:p>
+        </w:tc>
+      </w:tr>
+    </w:tbl>
+    <w:p>
+      <w:pPr>
+        <w:spacing w:after="0" w:line="240" w:lineRule="auto"/>
+        <w:textAlignment w:val="baseline"/>
+        <w:rPr>
+          <w:rFonts w:ascii="Segoe UI" w:eastAsia="Times New Roman" w:hAnsi="Segoe UI" w:cs="Segoe UI"/>
+          <w:sz w:val="18"/>
+          <w:szCs w:val="18"/>
+          <w:lang w:eastAsia="pt-BR"/>
+        </w:rPr>
+      </w:pPr>
+      <w:r>
+        <w:rPr>
+          <w:rFonts w:ascii="Arial" w:eastAsia="Times New Roman" w:hAnsi="Arial" w:cs="Arial"/>
+          <w:sz w:val="24"/>
+          <w:szCs w:val="24"/>
+          <w:lang w:eastAsia="pt-BR"/>
+        </w:rPr>
+        <w:t> </w:t>
+      </w:r>
+    </w:p>
+    <w:tbl>
+      <w:tblPr>
+        <w:tblW w:w="0" w:type="dxa"/>
+        <w:tblBorders>
+          <w:top w:val="outset" w:sz="6" w:space="0" w:color="auto"/>
+          <w:left w:val="outset" w:sz="6" w:space="0" w:color="auto"/>
+          <w:bottom w:val="outset" w:sz="6" w:space="0" w:color="auto"/>
+          <w:right w:val="outset" w:sz="6" w:space="0" w:color="auto"/>
+        </w:tblBorders>
+        <w:tblCellMar>
+          <w:left w:w="0" w:type="dxa"/>
+          <w:right w:w="0" w:type="dxa"/>
+        </w:tblCellMar>
+        <w:tblLook w:val="04A0" w:firstRow="1" w:lastRow="0" w:firstColumn="1" w:lastColumn="0" w:noHBand="0" w:noVBand="1"/>
+      </w:tblPr>
+      <w:tblGrid>
+        <w:gridCol w:w="2931"/>
+        <w:gridCol w:w="2913"/>
+        <w:gridCol w:w="2927"/>
+      </w:tblGrid>
+      <w:tr>
+        <w:trPr>
+          <w:trHeight w:val="300"/>
+        </w:trPr>
+        <w:tc>
+          <w:tcPr>
+            <w:tcW w:w="9015" w:type="dxa"/>
+            <w:gridSpan w:val="3"/>
+            <w:tcBorders>
+              <w:top w:val="single" w:sz="6" w:space="0" w:color="000000"/>
+              <w:left w:val="single" w:sz="6" w:space="0" w:color="000000"/>
+              <w:bottom w:val="single" w:sz="6" w:space="0" w:color="000000"/>
+              <w:right w:val="single" w:sz="6" w:space="0" w:color="000000"/>
+            </w:tcBorders>
+            <w:shd w:val="clear" w:color="auto" w:fill="F6C5AC"/>
+            <w:vAlign w:val="center"/>
+            <w:hideMark/>
+          </w:tcPr>
+          <w:p>
+            <w:pPr>
+              <w:spacing w:after="0" w:line="240" w:lineRule="auto"/>
+              <w:jc w:val="center"/>
+              <w:textAlignment w:val="baseline"/>
+              <w:rPr>
+                <w:rFonts w:ascii="Times New Roman" w:eastAsia="Times New Roman" w:hAnsi="Times New Roman" w:cs="Times New Roman"/>
+                <w:sz w:val="24"/>
+                <w:szCs w:val="24"/>
+                <w:lang w:eastAsia="pt-BR"/>
+              </w:rPr>
+            </w:pPr>
+            <w:r>
+              <w:rPr>
+                <w:rFonts w:ascii="Arial" w:eastAsia="Times New Roman" w:hAnsi="Arial" w:cs="Arial"/>
+                <w:sz w:val="28"/>
+                <w:szCs w:val="28"/>
+                <w:lang w:eastAsia="pt-BR"/>
+              </w:rPr>
+              <w:t>Plano de Testes de Login </w:t>
+            </w:r>
+          </w:p>
+        </w:tc>
+      </w:tr>
+      <w:tr>
+        <w:trPr>
+          <w:trHeight w:val="300"/>
+        </w:trPr>
+        <w:tc>
+          <w:tcPr>
+            <w:tcW w:w="3000" w:type="dxa"/>
+            <w:tcBorders>
+              <w:top w:val="single" w:sz="6" w:space="0" w:color="000000"/>
+              <w:left w:val="single" w:sz="6" w:space="0" w:color="000000"/>
+              <w:bottom w:val="single" w:sz="6" w:space="0" w:color="000000"/>
+              <w:right w:val="single" w:sz="6" w:space="0" w:color="000000"/>
+            </w:tcBorders>
+            <w:shd w:val="clear" w:color="auto" w:fill="auto"/>
+            <w:vAlign w:val="center"/>
+            <w:hideMark/>
+          </w:tcPr>
+          <w:p>
+            <w:pPr>
+              <w:spacing w:after="0" w:line="240" w:lineRule="auto"/>
+              <w:jc w:val="center"/>
+              <w:textAlignment w:val="baseline"/>
+              <w:rPr>
+                <w:rFonts w:ascii="Times New Roman" w:eastAsia="Times New Roman" w:hAnsi="Times New Roman" w:cs="Times New Roman"/>
+                <w:sz w:val="24"/>
+                <w:szCs w:val="24"/>
+                <w:lang w:eastAsia="pt-BR"/>
+              </w:rPr>
+            </w:pPr>
+            <w:r>
+              <w:rPr>
+                <w:rFonts w:ascii="Arial" w:eastAsia="Times New Roman" w:hAnsi="Arial" w:cs="Arial"/>
+                <w:sz w:val="24"/>
+                <w:szCs w:val="24"/>
+                <w:lang w:eastAsia="pt-BR"/>
+              </w:rPr>
+              <w:t>PASSOS </w:t>
+            </w:r>
+          </w:p>
+        </w:tc>
+        <w:tc>
+          <w:tcPr>
+            <w:tcW w:w="3000" w:type="dxa"/>
+            <w:tcBorders>
+              <w:top w:val="single" w:sz="6" w:space="0" w:color="000000"/>
+              <w:left w:val="single" w:sz="6" w:space="0" w:color="000000"/>
+              <w:bottom w:val="single" w:sz="6" w:space="0" w:color="000000"/>
+              <w:right w:val="single" w:sz="6" w:space="0" w:color="000000"/>
+            </w:tcBorders>
+            <w:shd w:val="clear" w:color="auto" w:fill="auto"/>
+            <w:vAlign w:val="center"/>
+            <w:hideMark/>
+          </w:tcPr>
+          <w:p>
+            <w:pPr>
+              <w:spacing w:after="0" w:line="240" w:lineRule="auto"/>
+              <w:jc w:val="center"/>
+              <w:textAlignment w:val="baseline"/>
+              <w:rPr>
+                <w:rFonts w:ascii="Times New Roman" w:eastAsia="Times New Roman" w:hAnsi="Times New Roman" w:cs="Times New Roman"/>
+                <w:sz w:val="24"/>
+                <w:szCs w:val="24"/>
+                <w:lang w:eastAsia="pt-BR"/>
+              </w:rPr>
+            </w:pPr>
+            <w:r>
+              <w:rPr>
+                <w:rFonts w:ascii="Arial" w:eastAsia="Times New Roman" w:hAnsi="Arial" w:cs="Arial"/>
+                <w:sz w:val="24"/>
+                <w:szCs w:val="24"/>
+                <w:lang w:eastAsia="pt-BR"/>
+              </w:rPr>
+              <w:t>RESULTADO ESPERADO </w:t>
+            </w:r>
+          </w:p>
+        </w:tc>
+        <w:tc>
+          <w:tcPr>
+            <w:tcW w:w="3000" w:type="dxa"/>
+            <w:tcBorders>
+              <w:top w:val="single" w:sz="6" w:space="0" w:color="000000"/>
+              <w:left w:val="single" w:sz="6" w:space="0" w:color="000000"/>
+              <w:bottom w:val="single" w:sz="6" w:space="0" w:color="000000"/>
+              <w:right w:val="single" w:sz="6" w:space="0" w:color="000000"/>
+            </w:tcBorders>
+            <w:shd w:val="clear" w:color="auto" w:fill="auto"/>
+            <w:vAlign w:val="center"/>
+            <w:hideMark/>
+          </w:tcPr>
+          <w:p>
+            <w:pPr>
+              <w:spacing w:after="0" w:line="240" w:lineRule="auto"/>
+              <w:jc w:val="center"/>
+              <w:textAlignment w:val="baseline"/>
+              <w:rPr>
+                <w:rFonts w:ascii="Times New Roman" w:eastAsia="Times New Roman" w:hAnsi="Times New Roman" w:cs="Times New Roman"/>
+                <w:sz w:val="24"/>
+                <w:szCs w:val="24"/>
+                <w:lang w:eastAsia="pt-BR"/>
+              </w:rPr>
+            </w:pPr>
+            <w:r>
+              <w:rPr>
+                <w:rFonts w:ascii="Arial" w:eastAsia="Times New Roman" w:hAnsi="Arial" w:cs="Arial"/>
+                <w:sz w:val="24"/>
+                <w:szCs w:val="24"/>
+                <w:lang w:eastAsia="pt-BR"/>
+              </w:rPr>
+              <w:t>RESULTADO OBTIDO </w:t>
+            </w:r>
+          </w:p>
+        </w:tc>
+      </w:tr>
+      <w:tr>
+        <w:trPr>
+          <w:trHeight w:val="300"/>
+        </w:trPr>
+        <w:tc>
+          <w:tcPr>
+            <w:tcW w:w="3000" w:type="dxa"/>
+            <w:tcBorders>
+              <w:top w:val="single" w:sz="6" w:space="0" w:color="000000"/>
+              <w:left w:val="single" w:sz="6" w:space="0" w:color="000000"/>
+              <w:bottom w:val="single" w:sz="6" w:space="0" w:color="000000"/>
+              <w:right w:val="single" w:sz="6" w:space="0" w:color="000000"/>
+            </w:tcBorders>
+            <w:shd w:val="clear" w:color="auto" w:fill="auto"/>
+            <w:vAlign w:val="center"/>
+            <w:hideMark/>
+          </w:tcPr>
+          <w:p>
+            <w:pPr>
+              <w:spacing w:after="0" w:line="240" w:lineRule="auto"/>
+              <w:jc w:val="center"/>
+              <w:textAlignment w:val="baseline"/>
+              <w:rPr>
+                <w:rFonts w:ascii="Times New Roman" w:eastAsia="Times New Roman" w:hAnsi="Times New Roman" w:cs="Times New Roman"/>
+                <w:sz w:val="24"/>
+                <w:szCs w:val="24"/>
+                <w:lang w:eastAsia="pt-BR"/>
+              </w:rPr>
+            </w:pPr>
+            <w:r>
+              <w:rPr>
+                <w:rFonts w:ascii="Arial" w:eastAsia="Times New Roman" w:hAnsi="Arial" w:cs="Arial"/>
+                <w:sz w:val="24"/>
+                <w:szCs w:val="24"/>
+                <w:lang w:eastAsia="pt-BR"/>
+              </w:rPr>
+              <w:t>digitar um login cadastrado no banco, mas com a senha errada. </w:t>
+            </w:r>
+          </w:p>
+        </w:tc>
+        <w:tc>
+          <w:tcPr>
+            <w:tcW w:w="3000" w:type="dxa"/>
+            <w:tcBorders>
+              <w:top w:val="single" w:sz="6" w:space="0" w:color="000000"/>
+              <w:left w:val="single" w:sz="6" w:space="0" w:color="000000"/>
+              <w:bottom w:val="single" w:sz="6" w:space="0" w:color="000000"/>
+              <w:right w:val="single" w:sz="6" w:space="0" w:color="000000"/>
+            </w:tcBorders>
+            <w:shd w:val="clear" w:color="auto" w:fill="auto"/>
+            <w:vAlign w:val="center"/>
+            <w:hideMark/>
+          </w:tcPr>
+          <w:p>
+            <w:pPr>
+              <w:spacing w:after="0" w:line="240" w:lineRule="auto"/>
+              <w:jc w:val="center"/>
+              <w:textAlignment w:val="baseline"/>
+              <w:rPr>
+                <w:rFonts w:ascii="Times New Roman" w:eastAsia="Times New Roman" w:hAnsi="Times New Roman" w:cs="Times New Roman"/>
+                <w:sz w:val="24"/>
+                <w:szCs w:val="24"/>
+                <w:lang w:eastAsia="pt-BR"/>
+              </w:rPr>
+            </w:pPr>
+            <w:r>
+              <w:rPr>
+                <w:rFonts w:ascii="Arial" w:eastAsia="Times New Roman" w:hAnsi="Arial" w:cs="Arial"/>
+                <w:sz w:val="24"/>
+                <w:szCs w:val="24"/>
+                <w:lang w:eastAsia="pt-BR"/>
+              </w:rPr>
+              <w:t xml:space="preserve">o sistema deverá mostrar a mensagem de erro ao </w:t>
+            </w:r>
+            <w:proofErr w:type="spellStart"/>
+            <w:r>
+              <w:rPr>
+                <w:rFonts w:ascii="Arial" w:eastAsia="Times New Roman" w:hAnsi="Arial" w:cs="Arial"/>
+                <w:sz w:val="24"/>
+                <w:szCs w:val="24"/>
+                <w:lang w:eastAsia="pt-BR"/>
+              </w:rPr>
+              <w:t>logar</w:t>
+            </w:r>
+            <w:proofErr w:type="spellEnd"/>
+            <w:r>
+              <w:rPr>
+                <w:rFonts w:ascii="Arial" w:eastAsia="Times New Roman" w:hAnsi="Arial" w:cs="Arial"/>
+                <w:sz w:val="24"/>
+                <w:szCs w:val="24"/>
+                <w:lang w:eastAsia="pt-BR"/>
+              </w:rPr>
+              <w:t>, pois o nome e a senha devem estar iguais ao efetuar o cadastro. </w:t>
+            </w:r>
+          </w:p>
+        </w:tc>
+        <w:tc>
+          <w:tcPr>
+            <w:tcW w:w="3000" w:type="dxa"/>
+            <w:tcBorders>
+              <w:top w:val="single" w:sz="6" w:space="0" w:color="000000"/>
+              <w:left w:val="single" w:sz="6" w:space="0" w:color="000000"/>
+              <w:bottom w:val="single" w:sz="6" w:space="0" w:color="000000"/>
+              <w:right w:val="single" w:sz="6" w:space="0" w:color="000000"/>
+            </w:tcBorders>
+            <w:shd w:val="clear" w:color="auto" w:fill="auto"/>
+            <w:vAlign w:val="center"/>
+            <w:hideMark/>
+          </w:tcPr>
+          <w:p>
+            <w:pPr>
+              <w:spacing w:after="0" w:line="240" w:lineRule="auto"/>
+              <w:jc w:val="center"/>
+              <w:textAlignment w:val="baseline"/>
+              <w:rPr>
+                <w:rFonts w:ascii="Times New Roman" w:eastAsia="Times New Roman" w:hAnsi="Times New Roman" w:cs="Times New Roman"/>
+                <w:sz w:val="24"/>
+                <w:szCs w:val="24"/>
+                <w:lang w:eastAsia="pt-BR"/>
+              </w:rPr>
+            </w:pPr>
+            <w:r>
+              <w:rPr>
+                <w:rFonts w:ascii="Arial" w:eastAsia="Times New Roman" w:hAnsi="Arial" w:cs="Arial"/>
+                <w:sz w:val="24"/>
+                <w:szCs w:val="24"/>
+                <w:lang w:eastAsia="pt-BR"/>
+              </w:rPr>
+              <w:t>O sistema mostra a mensagem de erro “senha incorreta”. </w:t>
+            </w:r>
+          </w:p>
+        </w:tc>
+      </w:tr>
+      <w:tr>
+        <w:trPr>
+          <w:trHeight w:val="300"/>
+        </w:trPr>
+        <w:tc>
+          <w:tcPr>
+            <w:tcW w:w="3000" w:type="dxa"/>
+            <w:tcBorders>
+              <w:top w:val="single" w:sz="6" w:space="0" w:color="000000"/>
+              <w:left w:val="single" w:sz="6" w:space="0" w:color="000000"/>
+              <w:bottom w:val="single" w:sz="6" w:space="0" w:color="000000"/>
+              <w:right w:val="single" w:sz="6" w:space="0" w:color="000000"/>
+            </w:tcBorders>
+            <w:shd w:val="clear" w:color="auto" w:fill="auto"/>
+            <w:vAlign w:val="center"/>
+            <w:hideMark/>
+          </w:tcPr>
+          <w:p>
+            <w:pPr>
+              <w:spacing w:after="0" w:line="240" w:lineRule="auto"/>
+              <w:jc w:val="center"/>
+              <w:textAlignment w:val="baseline"/>
+              <w:rPr>
+                <w:rFonts w:ascii="Times New Roman" w:eastAsia="Times New Roman" w:hAnsi="Times New Roman" w:cs="Times New Roman"/>
+                <w:sz w:val="24"/>
+                <w:szCs w:val="24"/>
+                <w:lang w:eastAsia="pt-BR"/>
+              </w:rPr>
+            </w:pPr>
+            <w:r>
+              <w:rPr>
+                <w:rFonts w:ascii="Arial" w:eastAsia="Times New Roman" w:hAnsi="Arial" w:cs="Arial"/>
+                <w:sz w:val="24"/>
+                <w:szCs w:val="24"/>
+                <w:lang w:eastAsia="pt-BR"/>
+              </w:rPr>
+              <w:t>Digitar login e senha que não foram cadastrados no banco. </w:t>
+            </w:r>
+          </w:p>
+        </w:tc>
+        <w:tc>
+          <w:tcPr>
+            <w:tcW w:w="3000" w:type="dxa"/>
+            <w:tcBorders>
+              <w:top w:val="single" w:sz="6" w:space="0" w:color="000000"/>
+              <w:left w:val="single" w:sz="6" w:space="0" w:color="000000"/>
+              <w:bottom w:val="single" w:sz="6" w:space="0" w:color="000000"/>
+              <w:right w:val="single" w:sz="6" w:space="0" w:color="000000"/>
+            </w:tcBorders>
+            <w:shd w:val="clear" w:color="auto" w:fill="auto"/>
+            <w:vAlign w:val="center"/>
+            <w:hideMark/>
+          </w:tcPr>
+          <w:p>
+            <w:pPr>
+              <w:spacing w:after="0" w:line="240" w:lineRule="auto"/>
+              <w:jc w:val="center"/>
+              <w:textAlignment w:val="baseline"/>
+              <w:rPr>
+                <w:rFonts w:ascii="Times New Roman" w:eastAsia="Times New Roman" w:hAnsi="Times New Roman" w:cs="Times New Roman"/>
+                <w:sz w:val="24"/>
+                <w:szCs w:val="24"/>
+                <w:lang w:eastAsia="pt-BR"/>
+              </w:rPr>
+            </w:pPr>
+            <w:r>
+              <w:rPr>
+                <w:rFonts w:ascii="Arial" w:eastAsia="Times New Roman" w:hAnsi="Arial" w:cs="Arial"/>
+                <w:sz w:val="24"/>
+                <w:szCs w:val="24"/>
+                <w:lang w:eastAsia="pt-BR"/>
+              </w:rPr>
+              <w:t xml:space="preserve">o sistema deverá mostrar a mensagem de erro ao </w:t>
+            </w:r>
+            <w:proofErr w:type="spellStart"/>
+            <w:r>
+              <w:rPr>
+                <w:rFonts w:ascii="Arial" w:eastAsia="Times New Roman" w:hAnsi="Arial" w:cs="Arial"/>
+                <w:sz w:val="24"/>
+                <w:szCs w:val="24"/>
+                <w:lang w:eastAsia="pt-BR"/>
+              </w:rPr>
+              <w:t>logar</w:t>
+            </w:r>
+            <w:proofErr w:type="spellEnd"/>
+            <w:r>
+              <w:rPr>
+                <w:rFonts w:ascii="Arial" w:eastAsia="Times New Roman" w:hAnsi="Arial" w:cs="Arial"/>
+                <w:sz w:val="24"/>
+                <w:szCs w:val="24"/>
+                <w:lang w:eastAsia="pt-BR"/>
+              </w:rPr>
+              <w:t>, pois o nome e a senha devem estar iguais ao efetuar o cadastro. </w:t>
+            </w:r>
+          </w:p>
+        </w:tc>
+        <w:tc>
+          <w:tcPr>
+            <w:tcW w:w="3000" w:type="dxa"/>
+            <w:tcBorders>
+              <w:top w:val="single" w:sz="6" w:space="0" w:color="000000"/>
+              <w:left w:val="single" w:sz="6" w:space="0" w:color="000000"/>
+              <w:bottom w:val="single" w:sz="6" w:space="0" w:color="000000"/>
+              <w:right w:val="single" w:sz="6" w:space="0" w:color="000000"/>
+            </w:tcBorders>
+            <w:shd w:val="clear" w:color="auto" w:fill="auto"/>
+            <w:vAlign w:val="center"/>
+            <w:hideMark/>
+          </w:tcPr>
+          <w:p>
+            <w:pPr>
+              <w:spacing w:after="0" w:line="240" w:lineRule="auto"/>
+              <w:jc w:val="center"/>
+              <w:textAlignment w:val="baseline"/>
+              <w:rPr>
+                <w:rFonts w:ascii="Times New Roman" w:eastAsia="Times New Roman" w:hAnsi="Times New Roman" w:cs="Times New Roman"/>
+                <w:sz w:val="24"/>
+                <w:szCs w:val="24"/>
+                <w:lang w:eastAsia="pt-BR"/>
+              </w:rPr>
+            </w:pPr>
+            <w:r>
+              <w:rPr>
+                <w:rFonts w:ascii="Arial" w:eastAsia="Times New Roman" w:hAnsi="Arial" w:cs="Arial"/>
+                <w:sz w:val="24"/>
+                <w:szCs w:val="24"/>
+                <w:lang w:eastAsia="pt-BR"/>
+              </w:rPr>
+              <w:t>O sistema mostra a mensagem de erro “usuário não cadastrado”. </w:t>
+            </w:r>
+          </w:p>
+        </w:tc>
+      </w:tr>
+      <w:tr>
+        <w:trPr>
+          <w:trHeight w:val="300"/>
+        </w:trPr>
+        <w:tc>
+          <w:tcPr>
+            <w:tcW w:w="3000" w:type="dxa"/>
+            <w:tcBorders>
+              <w:top w:val="single" w:sz="6" w:space="0" w:color="000000"/>
+              <w:left w:val="single" w:sz="6" w:space="0" w:color="000000"/>
+              <w:bottom w:val="single" w:sz="6" w:space="0" w:color="000000"/>
+              <w:right w:val="single" w:sz="6" w:space="0" w:color="000000"/>
+            </w:tcBorders>
+            <w:shd w:val="clear" w:color="auto" w:fill="auto"/>
+            <w:vAlign w:val="center"/>
+            <w:hideMark/>
+          </w:tcPr>
+          <w:p>
+            <w:pPr>
+              <w:spacing w:after="0" w:line="240" w:lineRule="auto"/>
+              <w:jc w:val="center"/>
+              <w:textAlignment w:val="baseline"/>
+              <w:rPr>
+                <w:rFonts w:ascii="Times New Roman" w:eastAsia="Times New Roman" w:hAnsi="Times New Roman" w:cs="Times New Roman"/>
+                <w:sz w:val="24"/>
+                <w:szCs w:val="24"/>
+                <w:lang w:eastAsia="pt-BR"/>
+              </w:rPr>
+            </w:pPr>
+            <w:r>
+              <w:rPr>
+                <w:rFonts w:ascii="Arial" w:eastAsia="Times New Roman" w:hAnsi="Arial" w:cs="Arial"/>
+                <w:sz w:val="24"/>
+                <w:szCs w:val="24"/>
+                <w:lang w:eastAsia="pt-BR"/>
+              </w:rPr>
+              <w:t>Deixar o campo de senha vazio. </w:t>
+            </w:r>
+          </w:p>
+        </w:tc>
+        <w:tc>
+          <w:tcPr>
+            <w:tcW w:w="3000" w:type="dxa"/>
+            <w:tcBorders>
+              <w:top w:val="single" w:sz="6" w:space="0" w:color="000000"/>
+              <w:left w:val="single" w:sz="6" w:space="0" w:color="000000"/>
+              <w:bottom w:val="single" w:sz="6" w:space="0" w:color="000000"/>
+              <w:right w:val="single" w:sz="6" w:space="0" w:color="000000"/>
+            </w:tcBorders>
+            <w:shd w:val="clear" w:color="auto" w:fill="auto"/>
+            <w:vAlign w:val="center"/>
+            <w:hideMark/>
+          </w:tcPr>
+          <w:p>
+            <w:pPr>
+              <w:spacing w:after="0" w:line="240" w:lineRule="auto"/>
+              <w:jc w:val="center"/>
+              <w:textAlignment w:val="baseline"/>
+              <w:rPr>
+                <w:rFonts w:ascii="Times New Roman" w:eastAsia="Times New Roman" w:hAnsi="Times New Roman" w:cs="Times New Roman"/>
+                <w:sz w:val="24"/>
+                <w:szCs w:val="24"/>
+                <w:lang w:eastAsia="pt-BR"/>
+              </w:rPr>
+            </w:pPr>
+            <w:r>
+              <w:rPr>
+                <w:rFonts w:ascii="Arial" w:eastAsia="Times New Roman" w:hAnsi="Arial" w:cs="Arial"/>
+                <w:sz w:val="24"/>
+                <w:szCs w:val="24"/>
+                <w:lang w:eastAsia="pt-BR"/>
+              </w:rPr>
+              <w:t xml:space="preserve">o sistema deverá mostrar a mensagem de erro ao </w:t>
+            </w:r>
+            <w:proofErr w:type="spellStart"/>
+            <w:r>
+              <w:rPr>
+                <w:rFonts w:ascii="Arial" w:eastAsia="Times New Roman" w:hAnsi="Arial" w:cs="Arial"/>
+                <w:sz w:val="24"/>
+                <w:szCs w:val="24"/>
+                <w:lang w:eastAsia="pt-BR"/>
+              </w:rPr>
+              <w:t>logar</w:t>
+            </w:r>
+            <w:proofErr w:type="spellEnd"/>
+            <w:r>
+              <w:rPr>
+                <w:rFonts w:ascii="Arial" w:eastAsia="Times New Roman" w:hAnsi="Arial" w:cs="Arial"/>
+                <w:sz w:val="24"/>
+                <w:szCs w:val="24"/>
+                <w:lang w:eastAsia="pt-BR"/>
+              </w:rPr>
+              <w:t>, pois o nome e a senha devem estar preenchidos. </w:t>
+            </w:r>
+          </w:p>
+        </w:tc>
+        <w:tc>
+          <w:tcPr>
+            <w:tcW w:w="3000" w:type="dxa"/>
+            <w:tcBorders>
+              <w:top w:val="single" w:sz="6" w:space="0" w:color="000000"/>
+              <w:left w:val="single" w:sz="6" w:space="0" w:color="000000"/>
+              <w:bottom w:val="single" w:sz="6" w:space="0" w:color="000000"/>
+              <w:right w:val="single" w:sz="6" w:space="0" w:color="000000"/>
+            </w:tcBorders>
+            <w:shd w:val="clear" w:color="auto" w:fill="auto"/>
+            <w:vAlign w:val="center"/>
+            <w:hideMark/>
+          </w:tcPr>
+          <w:p>
+            <w:pPr>
+              <w:spacing w:after="0" w:line="240" w:lineRule="auto"/>
+              <w:jc w:val="center"/>
+              <w:textAlignment w:val="baseline"/>
+              <w:rPr>
+                <w:rFonts w:ascii="Times New Roman" w:eastAsia="Times New Roman" w:hAnsi="Times New Roman" w:cs="Times New Roman"/>
+                <w:sz w:val="24"/>
+                <w:szCs w:val="24"/>
+                <w:lang w:eastAsia="pt-BR"/>
+              </w:rPr>
+            </w:pPr>
+            <w:r>
+              <w:rPr>
+                <w:rFonts w:ascii="Arial" w:eastAsia="Times New Roman" w:hAnsi="Arial" w:cs="Arial"/>
+                <w:sz w:val="24"/>
+                <w:szCs w:val="24"/>
+                <w:lang w:eastAsia="pt-BR"/>
+              </w:rPr>
+              <w:t>O sistema mostra que é necessário preencher o campo de senha. </w:t>
+            </w:r>
+          </w:p>
+        </w:tc>
+      </w:tr>
+      <w:tr>
+        <w:trPr>
+          <w:trHeight w:val="300"/>
+        </w:trPr>
+        <w:tc>
+          <w:tcPr>
+            <w:tcW w:w="3000" w:type="dxa"/>
+            <w:tcBorders>
+              <w:top w:val="single" w:sz="6" w:space="0" w:color="000000"/>
+              <w:left w:val="single" w:sz="6" w:space="0" w:color="000000"/>
+              <w:bottom w:val="single" w:sz="6" w:space="0" w:color="000000"/>
+              <w:right w:val="single" w:sz="6" w:space="0" w:color="000000"/>
+            </w:tcBorders>
+            <w:shd w:val="clear" w:color="auto" w:fill="auto"/>
+            <w:vAlign w:val="center"/>
+            <w:hideMark/>
+          </w:tcPr>
+          <w:p>
+            <w:pPr>
+              <w:spacing w:after="0" w:line="240" w:lineRule="auto"/>
+              <w:jc w:val="center"/>
+              <w:textAlignment w:val="baseline"/>
+              <w:rPr>
+                <w:rFonts w:ascii="Times New Roman" w:eastAsia="Times New Roman" w:hAnsi="Times New Roman" w:cs="Times New Roman"/>
+                <w:sz w:val="24"/>
+                <w:szCs w:val="24"/>
+                <w:lang w:eastAsia="pt-BR"/>
+              </w:rPr>
+            </w:pPr>
+            <w:r>
+              <w:rPr>
+                <w:rFonts w:ascii="Arial" w:eastAsia="Times New Roman" w:hAnsi="Arial" w:cs="Arial"/>
+                <w:sz w:val="24"/>
+                <w:szCs w:val="24"/>
+                <w:lang w:eastAsia="pt-BR"/>
+              </w:rPr>
+              <w:t>Deixar o campo de login vazio. </w:t>
+            </w:r>
+          </w:p>
+        </w:tc>
+        <w:tc>
+          <w:tcPr>
+            <w:tcW w:w="3000" w:type="dxa"/>
+            <w:tcBorders>
+              <w:top w:val="single" w:sz="6" w:space="0" w:color="000000"/>
+              <w:left w:val="single" w:sz="6" w:space="0" w:color="000000"/>
+              <w:bottom w:val="single" w:sz="6" w:space="0" w:color="000000"/>
+              <w:right w:val="single" w:sz="6" w:space="0" w:color="000000"/>
+            </w:tcBorders>
+            <w:shd w:val="clear" w:color="auto" w:fill="auto"/>
+            <w:vAlign w:val="center"/>
+            <w:hideMark/>
+          </w:tcPr>
+          <w:p>
+            <w:pPr>
+              <w:spacing w:after="0" w:line="240" w:lineRule="auto"/>
+              <w:jc w:val="center"/>
+              <w:textAlignment w:val="baseline"/>
+              <w:rPr>
+                <w:rFonts w:ascii="Times New Roman" w:eastAsia="Times New Roman" w:hAnsi="Times New Roman" w:cs="Times New Roman"/>
+                <w:sz w:val="24"/>
+                <w:szCs w:val="24"/>
+                <w:lang w:eastAsia="pt-BR"/>
+              </w:rPr>
+            </w:pPr>
+            <w:r>
+              <w:rPr>
+                <w:rFonts w:ascii="Arial" w:eastAsia="Times New Roman" w:hAnsi="Arial" w:cs="Arial"/>
+                <w:sz w:val="24"/>
+                <w:szCs w:val="24"/>
+                <w:lang w:eastAsia="pt-BR"/>
+              </w:rPr>
+              <w:t xml:space="preserve">o sistema deverá mostrar a mensagem de erro ao </w:t>
+            </w:r>
+            <w:proofErr w:type="spellStart"/>
+            <w:r>
+              <w:rPr>
+                <w:rFonts w:ascii="Arial" w:eastAsia="Times New Roman" w:hAnsi="Arial" w:cs="Arial"/>
+                <w:sz w:val="24"/>
+                <w:szCs w:val="24"/>
+                <w:lang w:eastAsia="pt-BR"/>
+              </w:rPr>
+              <w:t>logar</w:t>
+            </w:r>
+            <w:proofErr w:type="spellEnd"/>
+            <w:r>
+              <w:rPr>
+                <w:rFonts w:ascii="Arial" w:eastAsia="Times New Roman" w:hAnsi="Arial" w:cs="Arial"/>
+                <w:sz w:val="24"/>
+                <w:szCs w:val="24"/>
+                <w:lang w:eastAsia="pt-BR"/>
+              </w:rPr>
+              <w:t xml:space="preserve">, pois o nome e a </w:t>
+            </w:r>
+            <w:r>
+              <w:rPr>
+                <w:rFonts w:ascii="Arial" w:eastAsia="Times New Roman" w:hAnsi="Arial" w:cs="Arial"/>
+                <w:sz w:val="24"/>
+                <w:szCs w:val="24"/>
+                <w:lang w:eastAsia="pt-BR"/>
+              </w:rPr>
+              <w:lastRenderedPageBreak/>
+              <w:t>senha devem estar preenchidos. </w:t>
+            </w:r>
+          </w:p>
+        </w:tc>
+        <w:tc>
+          <w:tcPr>
+            <w:tcW w:w="3000" w:type="dxa"/>
+            <w:tcBorders>
+              <w:top w:val="single" w:sz="6" w:space="0" w:color="000000"/>
+              <w:left w:val="single" w:sz="6" w:space="0" w:color="000000"/>
+              <w:bottom w:val="single" w:sz="6" w:space="0" w:color="000000"/>
+              <w:right w:val="single" w:sz="6" w:space="0" w:color="000000"/>
+            </w:tcBorders>
+            <w:shd w:val="clear" w:color="auto" w:fill="auto"/>
+            <w:vAlign w:val="center"/>
+            <w:hideMark/>
+          </w:tcPr>
+          <w:p>
+            <w:pPr>
+              <w:spacing w:after="0" w:line="240" w:lineRule="auto"/>
+              <w:jc w:val="center"/>
+              <w:textAlignment w:val="baseline"/>
+              <w:rPr>
+                <w:rFonts w:ascii="Times New Roman" w:eastAsia="Times New Roman" w:hAnsi="Times New Roman" w:cs="Times New Roman"/>
+                <w:sz w:val="24"/>
+                <w:szCs w:val="24"/>
+                <w:lang w:eastAsia="pt-BR"/>
+              </w:rPr>
+            </w:pPr>
+            <w:r>
+              <w:rPr>
+                <w:rFonts w:ascii="Arial" w:eastAsia="Times New Roman" w:hAnsi="Arial" w:cs="Arial"/>
+                <w:sz w:val="24"/>
+                <w:szCs w:val="24"/>
+                <w:lang w:eastAsia="pt-BR"/>
+              </w:rPr>
+              <w:lastRenderedPageBreak/>
+              <w:t>O sistema mostra que é necessário preencher o campo de login. </w:t>
+            </w:r>
+          </w:p>
+        </w:tc>
+      </w:tr>
+      <w:tr>
+        <w:trPr>
+          <w:trHeight w:val="300"/>
+        </w:trPr>
+        <w:tc>
+          <w:tcPr>
+            <w:tcW w:w="3000" w:type="dxa"/>
+            <w:tcBorders>
+              <w:top w:val="single" w:sz="6" w:space="0" w:color="000000"/>
+              <w:left w:val="single" w:sz="6" w:space="0" w:color="000000"/>
+              <w:bottom w:val="single" w:sz="6" w:space="0" w:color="000000"/>
+              <w:right w:val="single" w:sz="6" w:space="0" w:color="000000"/>
+            </w:tcBorders>
+            <w:shd w:val="clear" w:color="auto" w:fill="auto"/>
+            <w:vAlign w:val="center"/>
+            <w:hideMark/>
+          </w:tcPr>
+          <w:p>
+            <w:pPr>
+              <w:spacing w:after="0" w:line="240" w:lineRule="auto"/>
+              <w:jc w:val="center"/>
+              <w:textAlignment w:val="baseline"/>
+              <w:rPr>
+                <w:rFonts w:ascii="Times New Roman" w:eastAsia="Times New Roman" w:hAnsi="Times New Roman" w:cs="Times New Roman"/>
+                <w:sz w:val="24"/>
+                <w:szCs w:val="24"/>
+                <w:lang w:eastAsia="pt-BR"/>
+              </w:rPr>
+            </w:pPr>
+            <w:r>
+              <w:rPr>
+                <w:rFonts w:ascii="Arial" w:eastAsia="Times New Roman" w:hAnsi="Arial" w:cs="Arial"/>
+                <w:sz w:val="24"/>
+                <w:szCs w:val="24"/>
+                <w:lang w:eastAsia="pt-BR"/>
+              </w:rPr>
+              <w:t>digitar uma senha cadastrada no banco, mas com o login errado. </w:t>
+            </w:r>
+          </w:p>
+          <w:p>
+            <w:pPr>
+              <w:spacing w:after="0" w:line="240" w:lineRule="auto"/>
+              <w:jc w:val="center"/>
+              <w:textAlignment w:val="baseline"/>
+              <w:rPr>
+                <w:rFonts w:ascii="Times New Roman" w:eastAsia="Times New Roman" w:hAnsi="Times New Roman" w:cs="Times New Roman"/>
+                <w:sz w:val="24"/>
+                <w:szCs w:val="24"/>
+                <w:lang w:eastAsia="pt-BR"/>
+              </w:rPr>
+            </w:pPr>
+            <w:r>
+              <w:rPr>
+                <w:rFonts w:ascii="Arial" w:eastAsia="Times New Roman" w:hAnsi="Arial" w:cs="Arial"/>
+                <w:sz w:val="24"/>
+                <w:szCs w:val="24"/>
+                <w:lang w:eastAsia="pt-BR"/>
+              </w:rPr>
+              <w:t> </w:t>
+            </w:r>
+          </w:p>
+        </w:tc>
+        <w:tc>
+          <w:tcPr>
+            <w:tcW w:w="3000" w:type="dxa"/>
+            <w:tcBorders>
+              <w:top w:val="single" w:sz="6" w:space="0" w:color="000000"/>
+              <w:left w:val="single" w:sz="6" w:space="0" w:color="000000"/>
+              <w:bottom w:val="single" w:sz="6" w:space="0" w:color="000000"/>
+              <w:right w:val="single" w:sz="6" w:space="0" w:color="000000"/>
+            </w:tcBorders>
+            <w:shd w:val="clear" w:color="auto" w:fill="auto"/>
+            <w:vAlign w:val="center"/>
+            <w:hideMark/>
+          </w:tcPr>
+          <w:p>
+            <w:pPr>
+              <w:spacing w:after="0" w:line="240" w:lineRule="auto"/>
+              <w:jc w:val="center"/>
+              <w:textAlignment w:val="baseline"/>
+              <w:rPr>
+                <w:rFonts w:ascii="Times New Roman" w:eastAsia="Times New Roman" w:hAnsi="Times New Roman" w:cs="Times New Roman"/>
+                <w:sz w:val="24"/>
+                <w:szCs w:val="24"/>
+                <w:lang w:eastAsia="pt-BR"/>
+              </w:rPr>
+            </w:pPr>
+            <w:r>
+              <w:rPr>
+                <w:rFonts w:ascii="Arial" w:eastAsia="Times New Roman" w:hAnsi="Arial" w:cs="Arial"/>
+                <w:sz w:val="24"/>
+                <w:szCs w:val="24"/>
+                <w:lang w:eastAsia="pt-BR"/>
+              </w:rPr>
+              <w:t xml:space="preserve">o sistema deverá mostrar a mensagem de erro ao </w:t>
+            </w:r>
+            <w:proofErr w:type="spellStart"/>
+            <w:r>
+              <w:rPr>
+                <w:rFonts w:ascii="Arial" w:eastAsia="Times New Roman" w:hAnsi="Arial" w:cs="Arial"/>
+                <w:sz w:val="24"/>
+                <w:szCs w:val="24"/>
+                <w:lang w:eastAsia="pt-BR"/>
+              </w:rPr>
+              <w:t>logar</w:t>
+            </w:r>
+            <w:proofErr w:type="spellEnd"/>
+            <w:r>
+              <w:rPr>
+                <w:rFonts w:ascii="Arial" w:eastAsia="Times New Roman" w:hAnsi="Arial" w:cs="Arial"/>
+                <w:sz w:val="24"/>
+                <w:szCs w:val="24"/>
+                <w:lang w:eastAsia="pt-BR"/>
+              </w:rPr>
+              <w:t>, pois o nome e a senha devem estar iguais ao efetuar o cadastro </w:t>
+            </w:r>
+          </w:p>
+          <w:p>
+            <w:pPr>
+              <w:spacing w:after="0" w:line="240" w:lineRule="auto"/>
+              <w:jc w:val="center"/>
+              <w:textAlignment w:val="baseline"/>
+              <w:rPr>
+                <w:rFonts w:ascii="Times New Roman" w:eastAsia="Times New Roman" w:hAnsi="Times New Roman" w:cs="Times New Roman"/>
+                <w:sz w:val="24"/>
+                <w:szCs w:val="24"/>
+                <w:lang w:eastAsia="pt-BR"/>
+              </w:rPr>
+            </w:pPr>
+            <w:r>
+              <w:rPr>
+                <w:rFonts w:ascii="Arial" w:eastAsia="Times New Roman" w:hAnsi="Arial" w:cs="Arial"/>
+                <w:sz w:val="24"/>
+                <w:szCs w:val="24"/>
+                <w:lang w:eastAsia="pt-BR"/>
+              </w:rPr>
+              <w:t> </w:t>
+            </w:r>
+          </w:p>
+        </w:tc>
+        <w:tc>
+          <w:tcPr>
+            <w:tcW w:w="3000" w:type="dxa"/>
+            <w:tcBorders>
+              <w:top w:val="single" w:sz="6" w:space="0" w:color="000000"/>
+              <w:left w:val="single" w:sz="6" w:space="0" w:color="000000"/>
+              <w:bottom w:val="single" w:sz="6" w:space="0" w:color="000000"/>
+              <w:right w:val="single" w:sz="6" w:space="0" w:color="000000"/>
+            </w:tcBorders>
+            <w:shd w:val="clear" w:color="auto" w:fill="auto"/>
+            <w:vAlign w:val="center"/>
+            <w:hideMark/>
+          </w:tcPr>
+          <w:p>
+            <w:pPr>
+              <w:spacing w:after="0" w:line="240" w:lineRule="auto"/>
+              <w:jc w:val="center"/>
+              <w:textAlignment w:val="baseline"/>
+              <w:rPr>
+                <w:rFonts w:ascii="Times New Roman" w:eastAsia="Times New Roman" w:hAnsi="Times New Roman" w:cs="Times New Roman"/>
+                <w:sz w:val="24"/>
+                <w:szCs w:val="24"/>
+                <w:lang w:eastAsia="pt-BR"/>
+              </w:rPr>
+            </w:pPr>
+            <w:r>
+              <w:rPr>
+                <w:rFonts w:ascii="Arial" w:eastAsia="Times New Roman" w:hAnsi="Arial" w:cs="Arial"/>
+                <w:sz w:val="24"/>
+                <w:szCs w:val="24"/>
+                <w:lang w:eastAsia="pt-BR"/>
+              </w:rPr>
+              <w:t>O sistema mostra a mensagem de erro “usuário não cadastrado”. </w:t>
+            </w:r>
+          </w:p>
+          <w:p>
+            <w:pPr>
+              <w:spacing w:after="0" w:line="240" w:lineRule="auto"/>
+              <w:jc w:val="center"/>
+              <w:textAlignment w:val="baseline"/>
+              <w:rPr>
+                <w:rFonts w:ascii="Times New Roman" w:eastAsia="Times New Roman" w:hAnsi="Times New Roman" w:cs="Times New Roman"/>
+                <w:sz w:val="24"/>
+                <w:szCs w:val="24"/>
+                <w:lang w:eastAsia="pt-BR"/>
+              </w:rPr>
+            </w:pPr>
+            <w:r>
+              <w:rPr>
+                <w:rFonts w:ascii="Arial" w:eastAsia="Times New Roman" w:hAnsi="Arial" w:cs="Arial"/>
+                <w:sz w:val="24"/>
+                <w:szCs w:val="24"/>
+                <w:lang w:eastAsia="pt-BR"/>
+              </w:rPr>
+              <w:t> </w:t>
+            </w:r>
+          </w:p>
+        </w:tc>
+      </w:tr>
+      <w:tr>
+        <w:trPr>
+          <w:trHeight w:val="300"/>
+        </w:trPr>
+        <w:tc>
+          <w:tcPr>
+            <w:tcW w:w="3000" w:type="dxa"/>
+            <w:tcBorders>
+              <w:top w:val="single" w:sz="6" w:space="0" w:color="000000"/>
+              <w:left w:val="single" w:sz="6" w:space="0" w:color="000000"/>
+              <w:bottom w:val="single" w:sz="6" w:space="0" w:color="000000"/>
+              <w:right w:val="single" w:sz="6" w:space="0" w:color="000000"/>
+            </w:tcBorders>
+            <w:shd w:val="clear" w:color="auto" w:fill="auto"/>
+            <w:vAlign w:val="center"/>
+            <w:hideMark/>
+          </w:tcPr>
+          <w:p>
+            <w:pPr>
+              <w:spacing w:after="0" w:line="240" w:lineRule="auto"/>
+              <w:jc w:val="center"/>
+              <w:textAlignment w:val="baseline"/>
+              <w:rPr>
+                <w:rFonts w:ascii="Times New Roman" w:eastAsia="Times New Roman" w:hAnsi="Times New Roman" w:cs="Times New Roman"/>
+                <w:sz w:val="24"/>
+                <w:szCs w:val="24"/>
+                <w:lang w:eastAsia="pt-BR"/>
+              </w:rPr>
+            </w:pPr>
+            <w:r>
+              <w:rPr>
+                <w:rFonts w:ascii="Arial" w:eastAsia="Times New Roman" w:hAnsi="Arial" w:cs="Arial"/>
+                <w:sz w:val="24"/>
+                <w:szCs w:val="24"/>
+                <w:lang w:eastAsia="pt-BR"/>
+              </w:rPr>
+              <w:t>digitar um login e senha correspondentes cadastrados no banco. </w:t>
+            </w:r>
+          </w:p>
+        </w:tc>
+        <w:tc>
+          <w:tcPr>
+            <w:tcW w:w="3000" w:type="dxa"/>
+            <w:tcBorders>
+              <w:top w:val="single" w:sz="6" w:space="0" w:color="000000"/>
+              <w:left w:val="single" w:sz="6" w:space="0" w:color="000000"/>
+              <w:bottom w:val="single" w:sz="6" w:space="0" w:color="000000"/>
+              <w:right w:val="single" w:sz="6" w:space="0" w:color="000000"/>
+            </w:tcBorders>
+            <w:shd w:val="clear" w:color="auto" w:fill="auto"/>
+            <w:vAlign w:val="center"/>
+            <w:hideMark/>
+          </w:tcPr>
+          <w:p>
+            <w:pPr>
+              <w:spacing w:after="0" w:line="240" w:lineRule="auto"/>
+              <w:jc w:val="center"/>
+              <w:textAlignment w:val="baseline"/>
+              <w:rPr>
+                <w:rFonts w:ascii="Times New Roman" w:eastAsia="Times New Roman" w:hAnsi="Times New Roman" w:cs="Times New Roman"/>
+                <w:sz w:val="24"/>
+                <w:szCs w:val="24"/>
+                <w:lang w:eastAsia="pt-BR"/>
+              </w:rPr>
+            </w:pPr>
+            <w:r>
+              <w:rPr>
+                <w:rFonts w:ascii="Arial" w:eastAsia="Times New Roman" w:hAnsi="Arial" w:cs="Arial"/>
+                <w:sz w:val="24"/>
+                <w:szCs w:val="24"/>
+                <w:lang w:eastAsia="pt-BR"/>
+              </w:rPr>
+              <w:t>o sistema deverá entrar na tela inicial do usuário. </w:t>
+            </w:r>
+          </w:p>
+        </w:tc>
+        <w:tc>
+          <w:tcPr>
+            <w:tcW w:w="3000" w:type="dxa"/>
+            <w:tcBorders>
+              <w:top w:val="single" w:sz="6" w:space="0" w:color="000000"/>
+              <w:left w:val="single" w:sz="6" w:space="0" w:color="000000"/>
+              <w:bottom w:val="single" w:sz="6" w:space="0" w:color="000000"/>
+              <w:right w:val="single" w:sz="6" w:space="0" w:color="000000"/>
+            </w:tcBorders>
+            <w:shd w:val="clear" w:color="auto" w:fill="auto"/>
+            <w:vAlign w:val="center"/>
+            <w:hideMark/>
+          </w:tcPr>
+          <w:p>
+            <w:pPr>
+              <w:spacing w:after="0" w:line="240" w:lineRule="auto"/>
+              <w:jc w:val="center"/>
+              <w:textAlignment w:val="baseline"/>
+              <w:rPr>
+                <w:rFonts w:ascii="Times New Roman" w:eastAsia="Times New Roman" w:hAnsi="Times New Roman" w:cs="Times New Roman"/>
+                <w:sz w:val="24"/>
+                <w:szCs w:val="24"/>
+                <w:lang w:eastAsia="pt-BR"/>
+              </w:rPr>
+            </w:pPr>
+            <w:r>
+              <w:rPr>
+                <w:rFonts w:ascii="Arial" w:eastAsia="Times New Roman" w:hAnsi="Arial" w:cs="Arial"/>
+                <w:sz w:val="24"/>
+                <w:szCs w:val="24"/>
+                <w:lang w:eastAsia="pt-BR"/>
+              </w:rPr>
+              <w:t>O sistema entra na página inicial do usuário. </w:t>
+            </w:r>
+          </w:p>
+        </w:tc>
+      </w:tr>
+    </w:tbl>
+    <w:p>
+      <w:pPr>
+        <w:spacing w:after="0" w:line="240" w:lineRule="auto"/>
+        <w:textAlignment w:val="baseline"/>
+        <w:rPr>
+          <w:rFonts w:ascii="Segoe UI" w:eastAsia="Times New Roman" w:hAnsi="Segoe UI" w:cs="Segoe UI"/>
+          <w:sz w:val="18"/>
+          <w:szCs w:val="18"/>
+          <w:lang w:eastAsia="pt-BR"/>
+        </w:rPr>
+      </w:pPr>
+      <w:r>
+        <w:rPr>
+          <w:rFonts w:ascii="Arial" w:eastAsia="Times New Roman" w:hAnsi="Arial" w:cs="Arial"/>
+          <w:sz w:val="24"/>
+          <w:szCs w:val="24"/>
+          <w:lang w:eastAsia="pt-BR"/>
+        </w:rPr>
+        <w:t> </w:t>
+      </w:r>
+    </w:p>
+    <w:p>
+      <w:pPr>
+        <w:spacing w:line="360" w:lineRule="auto"/>
+        <w:jc w:val="both"/>
+        <w:rPr>
+          <w:rFonts w:ascii="Arial" w:hAnsi="Arial" w:cs="Arial"/>
+          <w:sz w:val="24"/>
+          <w:szCs w:val="24"/>
+        </w:rPr>
+      </w:pPr>
+      <w:bookmarkStart w:id="20" w:name="_GoBack"/>
+      <w:bookmarkEnd w:id="20"/>
     </w:p>
     <w:p>
       <w:pPr>
@@ -17066,7 +19415,6 @@
           <w:sz w:val="24"/>
           <w:szCs w:val="24"/>
         </w:rPr>
-        <w:lastRenderedPageBreak/>
         <w:t xml:space="preserve">Kanban e </w:t>
       </w:r>
       <w:r>
@@ -17116,6 +19464,7 @@
           <w:rFonts w:ascii="Arial" w:hAnsi="Arial" w:cs="Arial"/>
           <w:noProof/>
         </w:rPr>
+        <w:lastRenderedPageBreak/>
         <w:drawing>
           <wp:inline distT="0" distB="0" distL="0" distR="0" wp14:anchorId="7AD73D89" wp14:editId="213B6E2B">
             <wp:extent cx="5438774" cy="5000625"/>
@@ -18935,7 +21284,7 @@
               </wp:inline>
             </w:drawing>
           </mc:Choice>
-          <mc:Fallback xmlns:oel="http://schemas.microsoft.com/office/2019/extlst" xmlns:w16cex="http://schemas.microsoft.com/office/word/2018/wordml/cex" xmlns:w16="http://schemas.microsoft.com/office/word/2018/wordml" xmlns:w16du="http://schemas.microsoft.com/office/word/2023/wordml/word16du" xmlns:w16sdtdh="http://schemas.microsoft.com/office/word/2020/wordml/sdtdatahash">
+          <mc:Fallback xmlns:w16sdtdh="http://schemas.microsoft.com/office/word/2020/wordml/sdtdatahash" xmlns:w16du="http://schemas.microsoft.com/office/word/2023/wordml/word16du" xmlns:w16="http://schemas.microsoft.com/office/word/2018/wordml" xmlns:w16cex="http://schemas.microsoft.com/office/word/2018/wordml/cex" xmlns:oel="http://schemas.microsoft.com/office/2019/extlst">
             <w:pict>
               <v:rect w14:anchorId="7827A6F0" id="Retângulo 10" o:spid="_x0000_s1026" alt="image.png" style="width:24.3pt;height:24.3pt;visibility:visible;mso-wrap-style:square;mso-left-percent:-10001;mso-top-percent:-10001;mso-position-horizontal:absolute;mso-position-horizontal-relative:char;mso-position-vertical:absolute;mso-position-vertical-relative:line;mso-left-percent:-10001;mso-top-percent:-10001;v-text-anchor:top" o:gfxdata="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" filled="f" stroked="f">
                 <o:lock v:ext="edit" aspectratio="t"/>
@@ -19542,7 +21891,7 @@
               </wp:inline>
             </w:drawing>
           </mc:Choice>
-          <mc:Fallback xmlns:oel="http://schemas.microsoft.com/office/2019/extlst" xmlns:w16cex="http://schemas.microsoft.com/office/word/2018/wordml/cex" xmlns:w16="http://schemas.microsoft.com/office/word/2018/wordml" xmlns:w16du="http://schemas.microsoft.com/office/word/2023/wordml/word16du" xmlns:w16sdtdh="http://schemas.microsoft.com/office/word/2020/wordml/sdtdatahash">
+          <mc:Fallback xmlns:w16sdtdh="http://schemas.microsoft.com/office/word/2020/wordml/sdtdatahash" xmlns:w16du="http://schemas.microsoft.com/office/word/2023/wordml/word16du" xmlns:w16="http://schemas.microsoft.com/office/word/2018/wordml" xmlns:w16cex="http://schemas.microsoft.com/office/word/2018/wordml/cex" xmlns:oel="http://schemas.microsoft.com/office/2019/extlst">
             <w:pict>
               <v:rect w14:anchorId="029F886D" id="Retângulo 14" o:spid="_x0000_s1026" alt="image.png" style="width:24.3pt;height:24.3pt;visibility:visible;mso-wrap-style:square;mso-left-percent:-10001;mso-top-percent:-10001;mso-position-horizontal:absolute;mso-position-horizontal-relative:char;mso-position-vertical:absolute;mso-position-vertical-relative:line;mso-left-percent:-10001;mso-top-percent:-10001;v-text-anchor:top" o:gfxdata="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" filled="f" stroked="f">
                 <o:lock v:ext="edit" aspectratio="t"/>
@@ -19763,7 +22112,7 @@
               </wp:inline>
             </w:drawing>
           </mc:Choice>
-          <mc:Fallback xmlns:oel="http://schemas.microsoft.com/office/2019/extlst" xmlns:w16cex="http://schemas.microsoft.com/office/word/2018/wordml/cex" xmlns:w16="http://schemas.microsoft.com/office/word/2018/wordml" xmlns:w16du="http://schemas.microsoft.com/office/word/2023/wordml/word16du" xmlns:w16sdtdh="http://schemas.microsoft.com/office/word/2020/wordml/sdtdatahash">
+          <mc:Fallback xmlns:w16sdtdh="http://schemas.microsoft.com/office/word/2020/wordml/sdtdatahash" xmlns:w16du="http://schemas.microsoft.com/office/word/2023/wordml/word16du" xmlns:w16="http://schemas.microsoft.com/office/word/2018/wordml" xmlns:w16cex="http://schemas.microsoft.com/office/word/2018/wordml/cex" xmlns:oel="http://schemas.microsoft.com/office/2019/extlst">
             <w:pict>
               <v:rect w14:anchorId="35F92097" id="Retângulo 16" o:spid="_x0000_s1026" alt="image.png" style="width:24.3pt;height:24.3pt;visibility:visible;mso-wrap-style:square;mso-left-percent:-10001;mso-top-percent:-10001;mso-position-horizontal:absolute;mso-position-horizontal-relative:char;mso-position-vertical:absolute;mso-position-vertical-relative:line;mso-left-percent:-10001;mso-top-percent:-10001;v-text-anchor:top" o:gfxdata="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" filled="f" stroked="f">
                 <o:lock v:ext="edit" aspectratio="t"/>
@@ -30801,6 +33150,30 @@
       <w:szCs w:val="24"/>
       <w:lang w:eastAsia="pt-BR"/>
     </w:rPr>
+  </w:style>
+  <w:style w:type="paragraph" w:customStyle="1" w:styleId="paragraph">
+    <w:name w:val="paragraph"/>
+    <w:basedOn w:val="Normal"/>
+    <w:rsid w:val="008B17B5"/>
+    <w:pPr>
+      <w:spacing w:before="100" w:beforeAutospacing="1" w:after="100" w:afterAutospacing="1" w:line="240" w:lineRule="auto"/>
+    </w:pPr>
+    <w:rPr>
+      <w:rFonts w:ascii="Times New Roman" w:eastAsia="Times New Roman" w:hAnsi="Times New Roman" w:cs="Times New Roman"/>
+      <w:sz w:val="24"/>
+      <w:szCs w:val="24"/>
+      <w:lang w:eastAsia="pt-BR"/>
+    </w:rPr>
+  </w:style>
+  <w:style w:type="character" w:customStyle="1" w:styleId="normaltextrun">
+    <w:name w:val="normaltextrun"/>
+    <w:basedOn w:val="Fontepargpadro"/>
+    <w:rsid w:val="008B17B5"/>
+  </w:style>
+  <w:style w:type="character" w:customStyle="1" w:styleId="eop">
+    <w:name w:val="eop"/>
+    <w:basedOn w:val="Fontepargpadro"/>
+    <w:rsid w:val="008B17B5"/>
   </w:style>
 </w:styles>
 </file>
@@ -33467,6 +35840,15 @@
 </file>
 
 <file path=customXml/item1.xml><?xml version="1.0" encoding="utf-8"?>
+<?mso-contentType ?>
+<FormTemplates xmlns="http://schemas.microsoft.com/sharepoint/v3/contenttype/forms">
+  <Display>DocumentLibraryForm</Display>
+  <Edit>DocumentLibraryForm</Edit>
+  <New>DocumentLibraryForm</New>
+</FormTemplates>
+</file>
+
+<file path=customXml/item2.xml><?xml version="1.0" encoding="utf-8"?>
 <ct:contentTypeSchema xmlns:ct="http://schemas.microsoft.com/office/2006/metadata/contentType" xmlns:ma="http://schemas.microsoft.com/office/2006/metadata/properties/metaAttributes" ct:_="" ma:_="" ma:contentTypeName="Documento" ma:contentTypeID="0x01010082F0508FC22E0443AF197709F097DFD8" ma:contentTypeVersion="12" ma:contentTypeDescription="Crie um novo documento." ma:contentTypeScope="" ma:versionID="cb36accf5e4aef349d47c458616a000c">
   <xsd:schema xmlns:xsd="http://www.w3.org/2001/XMLSchema" xmlns:xs="http://www.w3.org/2001/XMLSchema" xmlns:p="http://schemas.microsoft.com/office/2006/metadata/properties" xmlns:ns2="fcfc36f5-5a2f-4c50-8b8f-7d4447229359" xmlns:ns3="8e4b878d-87ff-4f9f-9750-9936cb4d760b" targetNamespace="http://schemas.microsoft.com/office/2006/metadata/properties" ma:root="true" ma:fieldsID="c0eedc83e72454359df4dc9502869bf3" ns2:_="" ns3:_="">
     <xsd:import namespace="fcfc36f5-5a2f-4c50-8b8f-7d4447229359"/>
@@ -33667,20 +36049,19 @@
 </ct:contentTypeSchema>
 </file>
 
-<file path=customXml/item2.xml><?xml version="1.0" encoding="utf-8"?>
-<?mso-contentType ?>
-<FormTemplates xmlns="http://schemas.microsoft.com/sharepoint/v3/contenttype/forms">
-  <Display>DocumentLibraryForm</Display>
-  <Edit>DocumentLibraryForm</Edit>
-  <New>DocumentLibraryForm</New>
-</FormTemplates>
-</file>
-
 <file path=customXml/item3.xml><?xml version="1.0" encoding="utf-8"?>
 <b:Sources xmlns:b="http://schemas.openxmlformats.org/officeDocument/2006/bibliography" xmlns="http://schemas.openxmlformats.org/officeDocument/2006/bibliography" SelectedStyle="\APA.XSL" StyleName="APA"/>
 </file>
 
 <file path=customXml/itemProps1.xml><?xml version="1.0" encoding="utf-8"?>
+<ds:datastoreItem xmlns:ds="http://schemas.openxmlformats.org/officeDocument/2006/customXml" ds:itemID="{C818D86C-7EF3-4737-8ADC-66A934A66FCB}">
+  <ds:schemaRefs>
+    <ds:schemaRef ds:uri="http://schemas.microsoft.com/sharepoint/v3/contenttype/forms"/>
+  </ds:schemaRefs>
+</ds:datastoreItem>
+</file>
+
+<file path=customXml/itemProps2.xml><?xml version="1.0" encoding="utf-8"?>
 <ds:datastoreItem xmlns:ds="http://schemas.openxmlformats.org/officeDocument/2006/customXml" ds:itemID="{F50E3291-1B58-4B06-AFA9-95022FC8FE02}">
   <ds:schemaRefs>
     <ds:schemaRef ds:uri="http://schemas.microsoft.com/office/2006/metadata/contentType"/>
@@ -33699,16 +36080,8 @@
 </ds:datastoreItem>
 </file>
 
-<file path=customXml/itemProps2.xml><?xml version="1.0" encoding="utf-8"?>
-<ds:datastoreItem xmlns:ds="http://schemas.openxmlformats.org/officeDocument/2006/customXml" ds:itemID="{C818D86C-7EF3-4737-8ADC-66A934A66FCB}">
-  <ds:schemaRefs>
-    <ds:schemaRef ds:uri="http://schemas.microsoft.com/sharepoint/v3/contenttype/forms"/>
-  </ds:schemaRefs>
-</ds:datastoreItem>
-</file>
-
 <file path=customXml/itemProps3.xml><?xml version="1.0" encoding="utf-8"?>
-<ds:datastoreItem xmlns:ds="http://schemas.openxmlformats.org/officeDocument/2006/customXml" ds:itemID="{6444BFA9-1272-4912-851B-98E4E07BA743}">
+<ds:datastoreItem xmlns:ds="http://schemas.openxmlformats.org/officeDocument/2006/customXml" ds:itemID="{E4C7E50C-34F3-4113-8490-745425D272E7}">
   <ds:schemaRefs>
     <ds:schemaRef ds:uri="http://schemas.openxmlformats.org/officeDocument/2006/bibliography"/>
   </ds:schemaRefs>

</xml_diff>